<commit_message>
docs: Cap nhat phao thi sieu day du - Bo sung quy tac dat ten, cac truong hop dac biet, tai san gop von, DNNN, HKD, tai co cau
</commit_message>
<xml_diff>
--- a/phao_thi_luat_kinh_te.docx
+++ b/phao_thi_luat_kinh_te.docx
@@ -13,7 +13,7 @@
           <w:color w:val="1E3A8A"/>
           <w:sz w:val="26"/>
         </w:rPr>
-        <w:t>PHAO THI SIÊU TỐC: CƠ SỞ LUẬT KINH TẾ (ÔN THI CUỐI KỲ)</w:t>
+        <w:t>CẨM NANG PHAO THI TOÀN DIỆN: CƠ SỞ LUẬT KINH TẾ (CUỐI KỲ)</w:t>
       </w:r>
     </w:p>
     <w:p>
@@ -25,22 +25,9 @@
         <w:rPr>
           <w:i/>
           <w:color w:val="64748B"/>
-          <w:sz w:val="17"/>
+          <w:sz w:val="16"/>
         </w:rPr>
-        <w:t>Tóm tắt 100 câu trắc nghiệm thực chiến · Đối chiếu 5 loại hình DN · Mốc thời gian vàng · Mẹo khoanh &amp; Tính toán chuẩn</w:t>
-      </w:r>
-    </w:p>
-    <w:p>
-      <w:pPr>
-        <w:spacing w:before="40" w:after="40"/>
-      </w:pPr>
-      <w:r>
-        <w:rPr>
-          <w:b/>
-          <w:color w:val="1D4ED8"/>
-          <w:sz w:val="19"/>
-        </w:rPr>
-        <w:t>1. BẢNG ĐỐI CHIẾU 5 LOẠI HÌNH DOANH NGHIỆP (LUẬT DOANH NGHIỆP 2020)</w:t>
+        <w:t>Tổng hợp đầy đủ nhất: 5 Loại hình DN &amp; HKD · Quy tắc đặt tên · Trường hợp đặc biệt &amp; Ngoại lệ · Mốc thời hạn · Tỷ lệ họp · Bẫy trắc nghiệm &amp; Công thức chuẩn</w:t>
       </w:r>
     </w:p>
     <w:tbl>
@@ -51,23 +38,62 @@
         <w:tblLook w:firstColumn="1" w:firstRow="1" w:lastColumn="0" w:lastRow="0" w:noHBand="0" w:noVBand="1" w:val="04A0"/>
       </w:tblPr>
       <w:tblGrid>
-        <w:gridCol w:w="1824"/>
-        <w:gridCol w:w="1824"/>
-        <w:gridCol w:w="1824"/>
-        <w:gridCol w:w="1824"/>
-        <w:gridCol w:w="1824"/>
-        <w:gridCol w:w="1824"/>
+        <w:gridCol w:w="11030"/>
       </w:tblGrid>
       <w:tr>
         <w:tc>
           <w:tcPr>
-            <w:tcW w:type="dxa" w:w="1728"/>
+            <w:tcW w:type="dxa" w:w="10944"/>
+            <w:shd w:fill="EFF6FF"/>
+            <w:tcMar>
+              <w:top w:w="40" w:type="dxa"/>
+              <w:bottom w:w="40" w:type="dxa"/>
+              <w:left w:w="60" w:type="dxa"/>
+              <w:right w:w="60" w:type="dxa"/>
+            </w:tcMar>
+          </w:tcPr>
+          <w:p>
+            <w:pPr>
+              <w:spacing w:after="0"/>
+            </w:pPr>
+            <w:r>
+              <w:rPr>
+                <w:b/>
+                <w:color w:val="1D4ED8"/>
+                <w:sz w:val="19"/>
+              </w:rPr>
+              <w:t>🏛️ CHUYÊN ĐỀ 1: BẢNG SO SÁNH ĐỐI CHIẾU 5 LOẠI HÌNH DOANH NGHIỆP &amp; HỘ KINH DOANH</w:t>
+            </w:r>
+          </w:p>
+        </w:tc>
+      </w:tr>
+    </w:tbl>
+    <w:tbl>
+      <w:tblPr>
+        <w:tblW w:type="auto" w:w="0"/>
+        <w:jc w:val="center"/>
+        <w:tblLayout w:type="fixed"/>
+        <w:tblLook w:firstColumn="1" w:firstRow="1" w:lastColumn="0" w:lastRow="0" w:noHBand="0" w:noVBand="1" w:val="04A0"/>
+      </w:tblPr>
+      <w:tblGrid>
+        <w:gridCol w:w="1576"/>
+        <w:gridCol w:w="1576"/>
+        <w:gridCol w:w="1576"/>
+        <w:gridCol w:w="1576"/>
+        <w:gridCol w:w="1576"/>
+        <w:gridCol w:w="1576"/>
+        <w:gridCol w:w="1576"/>
+      </w:tblGrid>
+      <w:tr>
+        <w:tc>
+          <w:tcPr>
+            <w:tcW w:type="dxa" w:w="1440"/>
             <w:shd w:fill="1E3A8A"/>
             <w:tcMar>
-              <w:top w:w="60" w:type="dxa"/>
-              <w:bottom w:w="60" w:type="dxa"/>
-              <w:left w:w="60" w:type="dxa"/>
-              <w:right w:w="60" w:type="dxa"/>
+              <w:top w:w="45" w:type="dxa"/>
+              <w:bottom w:w="45" w:type="dxa"/>
+              <w:left w:w="45" w:type="dxa"/>
+              <w:right w:w="45" w:type="dxa"/>
             </w:tcMar>
           </w:tcPr>
           <w:p>
@@ -79,7 +105,7 @@
               <w:rPr>
                 <w:b/>
                 <w:color w:val="FFFFFF"/>
-                <w:sz w:val="16"/>
+                <w:sz w:val="15"/>
               </w:rPr>
               <w:t>Tiêu chí</w:t>
             </w:r>
@@ -87,13 +113,13 @@
         </w:tc>
         <w:tc>
           <w:tcPr>
-            <w:tcW w:type="dxa" w:w="1800"/>
+            <w:tcW w:type="dxa" w:w="1512"/>
             <w:shd w:fill="1E3A8A"/>
             <w:tcMar>
-              <w:top w:w="60" w:type="dxa"/>
-              <w:bottom w:w="60" w:type="dxa"/>
-              <w:left w:w="60" w:type="dxa"/>
-              <w:right w:w="60" w:type="dxa"/>
+              <w:top w:w="45" w:type="dxa"/>
+              <w:bottom w:w="45" w:type="dxa"/>
+              <w:left w:w="45" w:type="dxa"/>
+              <w:right w:w="45" w:type="dxa"/>
             </w:tcMar>
           </w:tcPr>
           <w:p>
@@ -105,7 +131,7 @@
               <w:rPr>
                 <w:b/>
                 <w:color w:val="FFFFFF"/>
-                <w:sz w:val="16"/>
+                <w:sz w:val="15"/>
               </w:rPr>
               <w:t>Doanh nghiệp tư nhân</w:t>
             </w:r>
@@ -113,13 +139,13 @@
         </w:tc>
         <w:tc>
           <w:tcPr>
-            <w:tcW w:type="dxa" w:w="1872"/>
+            <w:tcW w:type="dxa" w:w="1656"/>
             <w:shd w:fill="1E3A8A"/>
             <w:tcMar>
-              <w:top w:w="60" w:type="dxa"/>
-              <w:bottom w:w="60" w:type="dxa"/>
-              <w:left w:w="60" w:type="dxa"/>
-              <w:right w:w="60" w:type="dxa"/>
+              <w:top w:w="45" w:type="dxa"/>
+              <w:bottom w:w="45" w:type="dxa"/>
+              <w:left w:w="45" w:type="dxa"/>
+              <w:right w:w="45" w:type="dxa"/>
             </w:tcMar>
           </w:tcPr>
           <w:p>
@@ -131,7 +157,7 @@
               <w:rPr>
                 <w:b/>
                 <w:color w:val="FFFFFF"/>
-                <w:sz w:val="16"/>
+                <w:sz w:val="15"/>
               </w:rPr>
               <w:t>Công ty Hợp danh</w:t>
             </w:r>
@@ -139,13 +165,13 @@
         </w:tc>
         <w:tc>
           <w:tcPr>
-            <w:tcW w:type="dxa" w:w="1728"/>
+            <w:tcW w:type="dxa" w:w="1512"/>
             <w:shd w:fill="1E3A8A"/>
             <w:tcMar>
-              <w:top w:w="60" w:type="dxa"/>
-              <w:bottom w:w="60" w:type="dxa"/>
-              <w:left w:w="60" w:type="dxa"/>
-              <w:right w:w="60" w:type="dxa"/>
+              <w:top w:w="45" w:type="dxa"/>
+              <w:bottom w:w="45" w:type="dxa"/>
+              <w:left w:w="45" w:type="dxa"/>
+              <w:right w:w="45" w:type="dxa"/>
             </w:tcMar>
           </w:tcPr>
           <w:p>
@@ -157,7 +183,7 @@
               <w:rPr>
                 <w:b/>
                 <w:color w:val="FFFFFF"/>
-                <w:sz w:val="16"/>
+                <w:sz w:val="15"/>
               </w:rPr>
               <w:t>TNHH 1 thành viên</w:t>
             </w:r>
@@ -165,13 +191,13 @@
         </w:tc>
         <w:tc>
           <w:tcPr>
-            <w:tcW w:type="dxa" w:w="1872"/>
+            <w:tcW w:type="dxa" w:w="1584"/>
             <w:shd w:fill="1E3A8A"/>
             <w:tcMar>
-              <w:top w:w="60" w:type="dxa"/>
-              <w:bottom w:w="60" w:type="dxa"/>
-              <w:left w:w="60" w:type="dxa"/>
-              <w:right w:w="60" w:type="dxa"/>
+              <w:top w:w="45" w:type="dxa"/>
+              <w:bottom w:w="45" w:type="dxa"/>
+              <w:left w:w="45" w:type="dxa"/>
+              <w:right w:w="45" w:type="dxa"/>
             </w:tcMar>
           </w:tcPr>
           <w:p>
@@ -183,7 +209,7 @@
               <w:rPr>
                 <w:b/>
                 <w:color w:val="FFFFFF"/>
-                <w:sz w:val="16"/>
+                <w:sz w:val="15"/>
               </w:rPr>
               <w:t>TNHH 2+ thành viên</w:t>
             </w:r>
@@ -191,13 +217,13 @@
         </w:tc>
         <w:tc>
           <w:tcPr>
-            <w:tcW w:type="dxa" w:w="1944"/>
+            <w:tcW w:type="dxa" w:w="1656"/>
             <w:shd w:fill="1E3A8A"/>
             <w:tcMar>
-              <w:top w:w="60" w:type="dxa"/>
-              <w:bottom w:w="60" w:type="dxa"/>
-              <w:left w:w="60" w:type="dxa"/>
-              <w:right w:w="60" w:type="dxa"/>
+              <w:top w:w="45" w:type="dxa"/>
+              <w:bottom w:w="45" w:type="dxa"/>
+              <w:left w:w="45" w:type="dxa"/>
+              <w:right w:w="45" w:type="dxa"/>
             </w:tcMar>
           </w:tcPr>
           <w:p>
@@ -209,1278 +235,21 @@
               <w:rPr>
                 <w:b/>
                 <w:color w:val="FFFFFF"/>
-                <w:sz w:val="16"/>
+                <w:sz w:val="15"/>
               </w:rPr>
               <w:t>Công ty Cổ phần</w:t>
             </w:r>
           </w:p>
         </w:tc>
-      </w:tr>
-      <w:tr>
         <w:tc>
           <w:tcPr>
-            <w:tcW w:type="dxa" w:w="1728"/>
-            <w:shd w:fill="F8FAFC"/>
+            <w:tcW w:type="dxa" w:w="1584"/>
+            <w:shd w:fill="1E3A8A"/>
             <w:tcMar>
               <w:top w:w="45" w:type="dxa"/>
               <w:bottom w:w="45" w:type="dxa"/>
-              <w:left w:w="60" w:type="dxa"/>
-              <w:right w:w="60" w:type="dxa"/>
-            </w:tcMar>
-          </w:tcPr>
-          <w:p>
-            <w:pPr>
-              <w:spacing w:after="0" w:line="252" w:lineRule="auto"/>
-            </w:pPr>
-            <w:r>
-              <w:rPr>
-                <w:b/>
-                <w:color w:val="1E293B"/>
-                <w:sz w:val="15"/>
-              </w:rPr>
-              <w:t>Tư cách pháp nhân</w:t>
-            </w:r>
-          </w:p>
-        </w:tc>
-        <w:tc>
-          <w:tcPr>
-            <w:tcW w:type="dxa" w:w="1800"/>
-            <w:shd w:fill="F8FAFC"/>
-            <w:tcMar>
-              <w:top w:w="45" w:type="dxa"/>
-              <w:bottom w:w="45" w:type="dxa"/>
-              <w:left w:w="60" w:type="dxa"/>
-              <w:right w:w="60" w:type="dxa"/>
-            </w:tcMar>
-          </w:tcPr>
-          <w:p>
-            <w:pPr>
-              <w:spacing w:after="0" w:line="252" w:lineRule="auto"/>
-            </w:pPr>
-            <w:r>
-              <w:rPr>
-                <w:sz w:val="15"/>
-              </w:rPr>
-              <w:t>KHÔNG (Duy nhất DNTN không có pháp nhân)</w:t>
-            </w:r>
-          </w:p>
-        </w:tc>
-        <w:tc>
-          <w:tcPr>
-            <w:tcW w:type="dxa" w:w="1872"/>
-            <w:shd w:fill="F8FAFC"/>
-            <w:tcMar>
-              <w:top w:w="45" w:type="dxa"/>
-              <w:bottom w:w="45" w:type="dxa"/>
-              <w:left w:w="60" w:type="dxa"/>
-              <w:right w:w="60" w:type="dxa"/>
-            </w:tcMar>
-          </w:tcPr>
-          <w:p>
-            <w:pPr>
-              <w:spacing w:after="0" w:line="252" w:lineRule="auto"/>
-            </w:pPr>
-            <w:r>
-              <w:rPr>
-                <w:sz w:val="15"/>
-              </w:rPr>
-              <w:t>CÓ tư cách pháp nhân (từ ngày cấp GCN ĐKDN)</w:t>
-            </w:r>
-          </w:p>
-        </w:tc>
-        <w:tc>
-          <w:tcPr>
-            <w:tcW w:type="dxa" w:w="1728"/>
-            <w:shd w:fill="F8FAFC"/>
-            <w:tcMar>
-              <w:top w:w="45" w:type="dxa"/>
-              <w:bottom w:w="45" w:type="dxa"/>
-              <w:left w:w="60" w:type="dxa"/>
-              <w:right w:w="60" w:type="dxa"/>
-            </w:tcMar>
-          </w:tcPr>
-          <w:p>
-            <w:pPr>
-              <w:spacing w:after="0" w:line="252" w:lineRule="auto"/>
-            </w:pPr>
-            <w:r>
-              <w:rPr>
-                <w:sz w:val="15"/>
-              </w:rPr>
-              <w:t>CÓ tư cách pháp nhân</w:t>
-            </w:r>
-          </w:p>
-        </w:tc>
-        <w:tc>
-          <w:tcPr>
-            <w:tcW w:type="dxa" w:w="1872"/>
-            <w:shd w:fill="F8FAFC"/>
-            <w:tcMar>
-              <w:top w:w="45" w:type="dxa"/>
-              <w:bottom w:w="45" w:type="dxa"/>
-              <w:left w:w="60" w:type="dxa"/>
-              <w:right w:w="60" w:type="dxa"/>
-            </w:tcMar>
-          </w:tcPr>
-          <w:p>
-            <w:pPr>
-              <w:spacing w:after="0" w:line="252" w:lineRule="auto"/>
-            </w:pPr>
-            <w:r>
-              <w:rPr>
-                <w:sz w:val="15"/>
-              </w:rPr>
-              <w:t>CÓ tư cách pháp nhân</w:t>
-            </w:r>
-          </w:p>
-        </w:tc>
-        <w:tc>
-          <w:tcPr>
-            <w:tcW w:type="dxa" w:w="1944"/>
-            <w:shd w:fill="F8FAFC"/>
-            <w:tcMar>
-              <w:top w:w="45" w:type="dxa"/>
-              <w:bottom w:w="45" w:type="dxa"/>
-              <w:left w:w="60" w:type="dxa"/>
-              <w:right w:w="60" w:type="dxa"/>
-            </w:tcMar>
-          </w:tcPr>
-          <w:p>
-            <w:pPr>
-              <w:spacing w:after="0" w:line="252" w:lineRule="auto"/>
-            </w:pPr>
-            <w:r>
-              <w:rPr>
-                <w:sz w:val="15"/>
-              </w:rPr>
-              <w:t>CÓ tư cách pháp nhân</w:t>
-            </w:r>
-          </w:p>
-        </w:tc>
-      </w:tr>
-      <w:tr>
-        <w:tc>
-          <w:tcPr>
-            <w:tcW w:type="dxa" w:w="1728"/>
-            <w:shd w:fill="FFFFFF"/>
-            <w:tcMar>
-              <w:top w:w="45" w:type="dxa"/>
-              <w:bottom w:w="45" w:type="dxa"/>
-              <w:left w:w="60" w:type="dxa"/>
-              <w:right w:w="60" w:type="dxa"/>
-            </w:tcMar>
-          </w:tcPr>
-          <w:p>
-            <w:pPr>
-              <w:spacing w:after="0" w:line="252" w:lineRule="auto"/>
-            </w:pPr>
-            <w:r>
-              <w:rPr>
-                <w:b/>
-                <w:color w:val="1E293B"/>
-                <w:sz w:val="15"/>
-              </w:rPr>
-              <w:t>Trách nhiệm tài sản</w:t>
-            </w:r>
-          </w:p>
-        </w:tc>
-        <w:tc>
-          <w:tcPr>
-            <w:tcW w:type="dxa" w:w="1800"/>
-            <w:shd w:fill="FFFFFF"/>
-            <w:tcMar>
-              <w:top w:w="45" w:type="dxa"/>
-              <w:bottom w:w="45" w:type="dxa"/>
-              <w:left w:w="60" w:type="dxa"/>
-              <w:right w:w="60" w:type="dxa"/>
-            </w:tcMar>
-          </w:tcPr>
-          <w:p>
-            <w:pPr>
-              <w:spacing w:after="0" w:line="252" w:lineRule="auto"/>
-            </w:pPr>
-            <w:r>
-              <w:rPr>
-                <w:sz w:val="15"/>
-              </w:rPr>
-              <w:t>VÔ HẠN (toàn bộ tài sản của chủ DNTN)</w:t>
-            </w:r>
-          </w:p>
-        </w:tc>
-        <w:tc>
-          <w:tcPr>
-            <w:tcW w:type="dxa" w:w="1872"/>
-            <w:shd w:fill="FFFFFF"/>
-            <w:tcMar>
-              <w:top w:w="45" w:type="dxa"/>
-              <w:bottom w:w="45" w:type="dxa"/>
-              <w:left w:w="60" w:type="dxa"/>
-              <w:right w:w="60" w:type="dxa"/>
-            </w:tcMar>
-          </w:tcPr>
-          <w:p>
-            <w:pPr>
-              <w:spacing w:after="0" w:line="252" w:lineRule="auto"/>
-            </w:pPr>
-            <w:r>
-              <w:rPr>
-                <w:sz w:val="15"/>
-              </w:rPr>
-              <w:t>TV Hợp danh: VÔ HẠN liên đới</w:t>
-              <w:br/>
-              <w:t>TV Góp vốn: HỮU HẠN</w:t>
-            </w:r>
-          </w:p>
-        </w:tc>
-        <w:tc>
-          <w:tcPr>
-            <w:tcW w:type="dxa" w:w="1728"/>
-            <w:shd w:fill="FFFFFF"/>
-            <w:tcMar>
-              <w:top w:w="45" w:type="dxa"/>
-              <w:bottom w:w="45" w:type="dxa"/>
-              <w:left w:w="60" w:type="dxa"/>
-              <w:right w:w="60" w:type="dxa"/>
-            </w:tcMar>
-          </w:tcPr>
-          <w:p>
-            <w:pPr>
-              <w:spacing w:after="0" w:line="252" w:lineRule="auto"/>
-            </w:pPr>
-            <w:r>
-              <w:rPr>
-                <w:sz w:val="15"/>
-              </w:rPr>
-              <w:t>HỮU HẠN (trong phạm vi vốn điều lệ cty)</w:t>
-            </w:r>
-          </w:p>
-        </w:tc>
-        <w:tc>
-          <w:tcPr>
-            <w:tcW w:type="dxa" w:w="1872"/>
-            <w:shd w:fill="FFFFFF"/>
-            <w:tcMar>
-              <w:top w:w="45" w:type="dxa"/>
-              <w:bottom w:w="45" w:type="dxa"/>
-              <w:left w:w="60" w:type="dxa"/>
-              <w:right w:w="60" w:type="dxa"/>
-            </w:tcMar>
-          </w:tcPr>
-          <w:p>
-            <w:pPr>
-              <w:spacing w:after="0" w:line="252" w:lineRule="auto"/>
-            </w:pPr>
-            <w:r>
-              <w:rPr>
-                <w:sz w:val="15"/>
-              </w:rPr>
-              <w:t>HỮU HẠN (trong phạm vi vốn đã cam kết góp)</w:t>
-            </w:r>
-          </w:p>
-        </w:tc>
-        <w:tc>
-          <w:tcPr>
-            <w:tcW w:type="dxa" w:w="1944"/>
-            <w:shd w:fill="FFFFFF"/>
-            <w:tcMar>
-              <w:top w:w="45" w:type="dxa"/>
-              <w:bottom w:w="45" w:type="dxa"/>
-              <w:left w:w="60" w:type="dxa"/>
-              <w:right w:w="60" w:type="dxa"/>
-            </w:tcMar>
-          </w:tcPr>
-          <w:p>
-            <w:pPr>
-              <w:spacing w:after="0" w:line="252" w:lineRule="auto"/>
-            </w:pPr>
-            <w:r>
-              <w:rPr>
-                <w:sz w:val="15"/>
-              </w:rPr>
-              <w:t>HỮU HẠN (trong mệnh giá cổ phần đã mua)</w:t>
-            </w:r>
-          </w:p>
-        </w:tc>
-      </w:tr>
-      <w:tr>
-        <w:tc>
-          <w:tcPr>
-            <w:tcW w:type="dxa" w:w="1728"/>
-            <w:shd w:fill="F8FAFC"/>
-            <w:tcMar>
-              <w:top w:w="45" w:type="dxa"/>
-              <w:bottom w:w="45" w:type="dxa"/>
-              <w:left w:w="60" w:type="dxa"/>
-              <w:right w:w="60" w:type="dxa"/>
-            </w:tcMar>
-          </w:tcPr>
-          <w:p>
-            <w:pPr>
-              <w:spacing w:after="0" w:line="252" w:lineRule="auto"/>
-            </w:pPr>
-            <w:r>
-              <w:rPr>
-                <w:b/>
-                <w:color w:val="1E293B"/>
-                <w:sz w:val="15"/>
-              </w:rPr>
-              <w:t>Số lượng thành viên</w:t>
-            </w:r>
-          </w:p>
-        </w:tc>
-        <w:tc>
-          <w:tcPr>
-            <w:tcW w:type="dxa" w:w="1800"/>
-            <w:shd w:fill="F8FAFC"/>
-            <w:tcMar>
-              <w:top w:w="45" w:type="dxa"/>
-              <w:bottom w:w="45" w:type="dxa"/>
-              <w:left w:w="60" w:type="dxa"/>
-              <w:right w:w="60" w:type="dxa"/>
-            </w:tcMar>
-          </w:tcPr>
-          <w:p>
-            <w:pPr>
-              <w:spacing w:after="0" w:line="252" w:lineRule="auto"/>
-            </w:pPr>
-            <w:r>
-              <w:rPr>
-                <w:sz w:val="15"/>
-              </w:rPr>
-              <w:t>Duy nhất 01 cá nhân làm chủ</w:t>
-            </w:r>
-          </w:p>
-        </w:tc>
-        <w:tc>
-          <w:tcPr>
-            <w:tcW w:type="dxa" w:w="1872"/>
-            <w:shd w:fill="F8FAFC"/>
-            <w:tcMar>
-              <w:top w:w="45" w:type="dxa"/>
-              <w:bottom w:w="45" w:type="dxa"/>
-              <w:left w:w="60" w:type="dxa"/>
-              <w:right w:w="60" w:type="dxa"/>
-            </w:tcMar>
-          </w:tcPr>
-          <w:p>
-            <w:pPr>
-              <w:spacing w:after="0" w:line="252" w:lineRule="auto"/>
-            </w:pPr>
-            <w:r>
-              <w:rPr>
-                <w:sz w:val="15"/>
-              </w:rPr>
-              <w:t>Ít nhất 02 TV hợp danh (cá nhân), ko giới hạn tối đa</w:t>
-            </w:r>
-          </w:p>
-        </w:tc>
-        <w:tc>
-          <w:tcPr>
-            <w:tcW w:type="dxa" w:w="1728"/>
-            <w:shd w:fill="F8FAFC"/>
-            <w:tcMar>
-              <w:top w:w="45" w:type="dxa"/>
-              <w:bottom w:w="45" w:type="dxa"/>
-              <w:left w:w="60" w:type="dxa"/>
-              <w:right w:w="60" w:type="dxa"/>
-            </w:tcMar>
-          </w:tcPr>
-          <w:p>
-            <w:pPr>
-              <w:spacing w:after="0" w:line="252" w:lineRule="auto"/>
-            </w:pPr>
-            <w:r>
-              <w:rPr>
-                <w:sz w:val="15"/>
-              </w:rPr>
-              <w:t>01 tổ chức hoặc 01 cá nhân làm chủ sở hữu</w:t>
-            </w:r>
-          </w:p>
-        </w:tc>
-        <w:tc>
-          <w:tcPr>
-            <w:tcW w:type="dxa" w:w="1872"/>
-            <w:shd w:fill="F8FAFC"/>
-            <w:tcMar>
-              <w:top w:w="45" w:type="dxa"/>
-              <w:bottom w:w="45" w:type="dxa"/>
-              <w:left w:w="60" w:type="dxa"/>
-              <w:right w:w="60" w:type="dxa"/>
-            </w:tcMar>
-          </w:tcPr>
-          <w:p>
-            <w:pPr>
-              <w:spacing w:after="0" w:line="252" w:lineRule="auto"/>
-            </w:pPr>
-            <w:r>
-              <w:rPr>
-                <w:sz w:val="15"/>
-              </w:rPr>
-              <w:t>Từ 02 đến 50 thành viên (cá nhân/tổ chức)</w:t>
-            </w:r>
-          </w:p>
-        </w:tc>
-        <w:tc>
-          <w:tcPr>
-            <w:tcW w:type="dxa" w:w="1944"/>
-            <w:shd w:fill="F8FAFC"/>
-            <w:tcMar>
-              <w:top w:w="45" w:type="dxa"/>
-              <w:bottom w:w="45" w:type="dxa"/>
-              <w:left w:w="60" w:type="dxa"/>
-              <w:right w:w="60" w:type="dxa"/>
-            </w:tcMar>
-          </w:tcPr>
-          <w:p>
-            <w:pPr>
-              <w:spacing w:after="0" w:line="252" w:lineRule="auto"/>
-            </w:pPr>
-            <w:r>
-              <w:rPr>
-                <w:sz w:val="15"/>
-              </w:rPr>
-              <w:t>Tối thiểu 03 cổ đông, KHÔNG GIỚI HẠN tối đa</w:t>
-            </w:r>
-          </w:p>
-        </w:tc>
-      </w:tr>
-      <w:tr>
-        <w:tc>
-          <w:tcPr>
-            <w:tcW w:type="dxa" w:w="1728"/>
-            <w:shd w:fill="FFFFFF"/>
-            <w:tcMar>
-              <w:top w:w="45" w:type="dxa"/>
-              <w:bottom w:w="45" w:type="dxa"/>
-              <w:left w:w="60" w:type="dxa"/>
-              <w:right w:w="60" w:type="dxa"/>
-            </w:tcMar>
-          </w:tcPr>
-          <w:p>
-            <w:pPr>
-              <w:spacing w:after="0" w:line="252" w:lineRule="auto"/>
-            </w:pPr>
-            <w:r>
-              <w:rPr>
-                <w:b/>
-                <w:color w:val="1E293B"/>
-                <w:sz w:val="15"/>
-              </w:rPr>
-              <w:t>Phát hành chứng khoán</w:t>
-            </w:r>
-          </w:p>
-        </w:tc>
-        <w:tc>
-          <w:tcPr>
-            <w:tcW w:type="dxa" w:w="1800"/>
-            <w:shd w:fill="FFFFFF"/>
-            <w:tcMar>
-              <w:top w:w="45" w:type="dxa"/>
-              <w:bottom w:w="45" w:type="dxa"/>
-              <w:left w:w="60" w:type="dxa"/>
-              <w:right w:w="60" w:type="dxa"/>
-            </w:tcMar>
-          </w:tcPr>
-          <w:p>
-            <w:pPr>
-              <w:spacing w:after="0" w:line="252" w:lineRule="auto"/>
-            </w:pPr>
-            <w:r>
-              <w:rPr>
-                <w:sz w:val="15"/>
-              </w:rPr>
-              <w:t>KHÔNG ĐƯỢC phát hành bất kỳ chứng khoán nào</w:t>
-            </w:r>
-          </w:p>
-        </w:tc>
-        <w:tc>
-          <w:tcPr>
-            <w:tcW w:type="dxa" w:w="1872"/>
-            <w:shd w:fill="FFFFFF"/>
-            <w:tcMar>
-              <w:top w:w="45" w:type="dxa"/>
-              <w:bottom w:w="45" w:type="dxa"/>
-              <w:left w:w="60" w:type="dxa"/>
-              <w:right w:w="60" w:type="dxa"/>
-            </w:tcMar>
-          </w:tcPr>
-          <w:p>
-            <w:pPr>
-              <w:spacing w:after="0" w:line="252" w:lineRule="auto"/>
-            </w:pPr>
-            <w:r>
-              <w:rPr>
-                <w:sz w:val="15"/>
-              </w:rPr>
-              <w:t>KHÔNG ĐƯỢC phát hành bất kỳ chứng khoán nào</w:t>
-            </w:r>
-          </w:p>
-        </w:tc>
-        <w:tc>
-          <w:tcPr>
-            <w:tcW w:type="dxa" w:w="1728"/>
-            <w:shd w:fill="FFFFFF"/>
-            <w:tcMar>
-              <w:top w:w="45" w:type="dxa"/>
-              <w:bottom w:w="45" w:type="dxa"/>
-              <w:left w:w="60" w:type="dxa"/>
-              <w:right w:w="60" w:type="dxa"/>
-            </w:tcMar>
-          </w:tcPr>
-          <w:p>
-            <w:pPr>
-              <w:spacing w:after="0" w:line="252" w:lineRule="auto"/>
-            </w:pPr>
-            <w:r>
-              <w:rPr>
-                <w:sz w:val="15"/>
-              </w:rPr>
-              <w:t>ĐƯỢC phát hành trái phiếu (không có cổ phiếu)</w:t>
-            </w:r>
-          </w:p>
-        </w:tc>
-        <w:tc>
-          <w:tcPr>
-            <w:tcW w:type="dxa" w:w="1872"/>
-            <w:shd w:fill="FFFFFF"/>
-            <w:tcMar>
-              <w:top w:w="45" w:type="dxa"/>
-              <w:bottom w:w="45" w:type="dxa"/>
-              <w:left w:w="60" w:type="dxa"/>
-              <w:right w:w="60" w:type="dxa"/>
-            </w:tcMar>
-          </w:tcPr>
-          <w:p>
-            <w:pPr>
-              <w:spacing w:after="0" w:line="252" w:lineRule="auto"/>
-            </w:pPr>
-            <w:r>
-              <w:rPr>
-                <w:sz w:val="15"/>
-              </w:rPr>
-              <w:t>ĐƯỢC phát hành trái phiếu (không có cổ phiếu)</w:t>
-            </w:r>
-          </w:p>
-        </w:tc>
-        <w:tc>
-          <w:tcPr>
-            <w:tcW w:type="dxa" w:w="1944"/>
-            <w:shd w:fill="FFFFFF"/>
-            <w:tcMar>
-              <w:top w:w="45" w:type="dxa"/>
-              <w:bottom w:w="45" w:type="dxa"/>
-              <w:left w:w="60" w:type="dxa"/>
-              <w:right w:w="60" w:type="dxa"/>
-            </w:tcMar>
-          </w:tcPr>
-          <w:p>
-            <w:pPr>
-              <w:spacing w:after="0" w:line="252" w:lineRule="auto"/>
-            </w:pPr>
-            <w:r>
-              <w:rPr>
-                <w:sz w:val="15"/>
-              </w:rPr>
-              <w:t>ĐƯỢC phát hành Cổ phiếu, Trái phiếu, mọi loại CK</w:t>
-            </w:r>
-          </w:p>
-        </w:tc>
-      </w:tr>
-      <w:tr>
-        <w:tc>
-          <w:tcPr>
-            <w:tcW w:type="dxa" w:w="1728"/>
-            <w:shd w:fill="F8FAFC"/>
-            <w:tcMar>
-              <w:top w:w="45" w:type="dxa"/>
-              <w:bottom w:w="45" w:type="dxa"/>
-              <w:left w:w="60" w:type="dxa"/>
-              <w:right w:w="60" w:type="dxa"/>
-            </w:tcMar>
-          </w:tcPr>
-          <w:p>
-            <w:pPr>
-              <w:spacing w:after="0" w:line="252" w:lineRule="auto"/>
-            </w:pPr>
-            <w:r>
-              <w:rPr>
-                <w:b/>
-                <w:color w:val="1E293B"/>
-                <w:sz w:val="15"/>
-              </w:rPr>
-              <w:t>Đại diện theo pháp luật</w:t>
-            </w:r>
-          </w:p>
-        </w:tc>
-        <w:tc>
-          <w:tcPr>
-            <w:tcW w:type="dxa" w:w="1800"/>
-            <w:shd w:fill="F8FAFC"/>
-            <w:tcMar>
-              <w:top w:w="45" w:type="dxa"/>
-              <w:bottom w:w="45" w:type="dxa"/>
-              <w:left w:w="60" w:type="dxa"/>
-              <w:right w:w="60" w:type="dxa"/>
-            </w:tcMar>
-          </w:tcPr>
-          <w:p>
-            <w:pPr>
-              <w:spacing w:after="0" w:line="252" w:lineRule="auto"/>
-            </w:pPr>
-            <w:r>
-              <w:rPr>
-                <w:sz w:val="15"/>
-              </w:rPr>
-              <w:t>Chủ doanh nghiệp tư nhân</w:t>
-            </w:r>
-          </w:p>
-        </w:tc>
-        <w:tc>
-          <w:tcPr>
-            <w:tcW w:type="dxa" w:w="1872"/>
-            <w:shd w:fill="F8FAFC"/>
-            <w:tcMar>
-              <w:top w:w="45" w:type="dxa"/>
-              <w:bottom w:w="45" w:type="dxa"/>
-              <w:left w:w="60" w:type="dxa"/>
-              <w:right w:w="60" w:type="dxa"/>
-            </w:tcMar>
-          </w:tcPr>
-          <w:p>
-            <w:pPr>
-              <w:spacing w:after="0" w:line="252" w:lineRule="auto"/>
-            </w:pPr>
-            <w:r>
-              <w:rPr>
-                <w:sz w:val="15"/>
-              </w:rPr>
-              <w:t>TẤT CẢ thành viên hợp danh đều là người ĐDTPL</w:t>
-            </w:r>
-          </w:p>
-        </w:tc>
-        <w:tc>
-          <w:tcPr>
-            <w:tcW w:type="dxa" w:w="1728"/>
-            <w:shd w:fill="F8FAFC"/>
-            <w:tcMar>
-              <w:top w:w="45" w:type="dxa"/>
-              <w:bottom w:w="45" w:type="dxa"/>
-              <w:left w:w="60" w:type="dxa"/>
-              <w:right w:w="60" w:type="dxa"/>
-            </w:tcMar>
-          </w:tcPr>
-          <w:p>
-            <w:pPr>
-              <w:spacing w:after="0" w:line="252" w:lineRule="auto"/>
-            </w:pPr>
-            <w:r>
-              <w:rPr>
-                <w:sz w:val="15"/>
-              </w:rPr>
-              <w:t>Chủ tịch cty/HĐTV hoặc GĐ/TGĐ theo Điều lệ</w:t>
-            </w:r>
-          </w:p>
-        </w:tc>
-        <w:tc>
-          <w:tcPr>
-            <w:tcW w:type="dxa" w:w="1872"/>
-            <w:shd w:fill="F8FAFC"/>
-            <w:tcMar>
-              <w:top w:w="45" w:type="dxa"/>
-              <w:bottom w:w="45" w:type="dxa"/>
-              <w:left w:w="60" w:type="dxa"/>
-              <w:right w:w="60" w:type="dxa"/>
-            </w:tcMar>
-          </w:tcPr>
-          <w:p>
-            <w:pPr>
-              <w:spacing w:after="0" w:line="252" w:lineRule="auto"/>
-            </w:pPr>
-            <w:r>
-              <w:rPr>
-                <w:sz w:val="15"/>
-              </w:rPr>
-              <w:t>Có thể có 1 hoặc nhiều người ĐDTPL</w:t>
-            </w:r>
-          </w:p>
-        </w:tc>
-        <w:tc>
-          <w:tcPr>
-            <w:tcW w:type="dxa" w:w="1944"/>
-            <w:shd w:fill="F8FAFC"/>
-            <w:tcMar>
-              <w:top w:w="45" w:type="dxa"/>
-              <w:bottom w:w="45" w:type="dxa"/>
-              <w:left w:w="60" w:type="dxa"/>
-              <w:right w:w="60" w:type="dxa"/>
-            </w:tcMar>
-          </w:tcPr>
-          <w:p>
-            <w:pPr>
-              <w:spacing w:after="0" w:line="252" w:lineRule="auto"/>
-            </w:pPr>
-            <w:r>
-              <w:rPr>
-                <w:sz w:val="15"/>
-              </w:rPr>
-              <w:t>Có thể có 1 hoặc nhiều người ĐDTPL</w:t>
-            </w:r>
-          </w:p>
-        </w:tc>
-      </w:tr>
-    </w:tbl>
-    <w:p>
-      <w:pPr>
-        <w:spacing w:before="120" w:after="40"/>
-      </w:pPr>
-      <w:r>
-        <w:rPr>
-          <w:b/>
-          <w:color w:val="1D4ED8"/>
-          <w:sz w:val="19"/>
-        </w:rPr>
-        <w:t>2. CÁC MỐC THỜI HẠN &amp; CON SỐ VÀNG BẮT BUỘC THUỘC LÒNG (RA ĐỀ 100%)</w:t>
-      </w:r>
-    </w:p>
-    <w:tbl>
-      <w:tblPr>
-        <w:tblW w:type="auto" w:w="0"/>
-        <w:jc w:val="center"/>
-        <w:tblLayout w:type="fixed"/>
-        <w:tblLook w:firstColumn="1" w:firstRow="1" w:lastColumn="0" w:lastRow="0" w:noHBand="0" w:noVBand="1" w:val="04A0"/>
-      </w:tblPr>
-      <w:tblGrid>
-        <w:gridCol w:w="2736"/>
-        <w:gridCol w:w="2736"/>
-        <w:gridCol w:w="2736"/>
-        <w:gridCol w:w="2736"/>
-      </w:tblGrid>
-      <w:tr>
-        <w:tc>
-          <w:tcPr>
-            <w:tcW w:type="dxa" w:w="1872"/>
-            <w:shd w:fill="EFF6FF"/>
-            <w:tcMar>
-              <w:top w:w="35" w:type="dxa"/>
-              <w:bottom w:w="35" w:type="dxa"/>
-              <w:left w:w="50" w:type="dxa"/>
-              <w:right w:w="50" w:type="dxa"/>
-            </w:tcMar>
-          </w:tcPr>
-          <w:p>
-            <w:pPr>
-              <w:spacing w:after="0"/>
-            </w:pPr>
-            <w:r>
-              <w:rPr>
-                <w:b/>
-                <w:color w:val="1D4ED8"/>
-                <w:sz w:val="16"/>
-              </w:rPr>
-              <w:t>03 ngày làm việc</w:t>
-            </w:r>
-          </w:p>
-        </w:tc>
-        <w:tc>
-          <w:tcPr>
-            <w:tcW w:type="dxa" w:w="3600"/>
-            <w:shd w:fill="EFF6FF"/>
-            <w:tcMar>
-              <w:top w:w="35" w:type="dxa"/>
-              <w:bottom w:w="35" w:type="dxa"/>
-              <w:left w:w="50" w:type="dxa"/>
-              <w:right w:w="50" w:type="dxa"/>
-            </w:tcMar>
-          </w:tcPr>
-          <w:p>
-            <w:pPr>
-              <w:spacing w:after="0"/>
-            </w:pPr>
-            <w:r>
-              <w:rPr>
-                <w:sz w:val="16"/>
-              </w:rPr>
-              <w:t>Thời hạn cấp GCN ĐKDN kể từ ngày Cơ quan ĐKKD nhận đủ hồ sơ hợp lệ.</w:t>
-            </w:r>
-          </w:p>
-        </w:tc>
-        <w:tc>
-          <w:tcPr>
-            <w:tcW w:type="dxa" w:w="1872"/>
-            <w:shd w:fill="EFF6FF"/>
-            <w:tcMar>
-              <w:top w:w="35" w:type="dxa"/>
-              <w:bottom w:w="35" w:type="dxa"/>
-              <w:left w:w="50" w:type="dxa"/>
-              <w:right w:w="50" w:type="dxa"/>
-            </w:tcMar>
-          </w:tcPr>
-          <w:p>
-            <w:pPr>
-              <w:spacing w:after="0"/>
-            </w:pPr>
-            <w:r>
-              <w:rPr>
-                <w:b/>
-                <w:color w:val="1D4ED8"/>
-                <w:sz w:val="16"/>
-              </w:rPr>
-              <w:t>90 ngày</w:t>
-            </w:r>
-          </w:p>
-        </w:tc>
-        <w:tc>
-          <w:tcPr>
-            <w:tcW w:type="dxa" w:w="3600"/>
-            <w:shd w:fill="EFF6FF"/>
-            <w:tcMar>
-              <w:top w:w="35" w:type="dxa"/>
-              <w:bottom w:w="35" w:type="dxa"/>
-              <w:left w:w="50" w:type="dxa"/>
-              <w:right w:w="50" w:type="dxa"/>
-            </w:tcMar>
-          </w:tcPr>
-          <w:p>
-            <w:pPr>
-              <w:spacing w:after="0"/>
-            </w:pPr>
-            <w:r>
-              <w:rPr>
-                <w:sz w:val="16"/>
-              </w:rPr>
-              <w:t>Thời hạn các thành viên/cổ đông phải góp đủ vốn điều lệ kể từ ngày cấp GCN ĐKDN.</w:t>
-            </w:r>
-          </w:p>
-        </w:tc>
-      </w:tr>
-      <w:tr>
-        <w:tc>
-          <w:tcPr>
-            <w:tcW w:type="dxa" w:w="1872"/>
-            <w:shd w:fill="FFFFFF"/>
-            <w:tcMar>
-              <w:top w:w="35" w:type="dxa"/>
-              <w:bottom w:w="35" w:type="dxa"/>
-              <w:left w:w="50" w:type="dxa"/>
-              <w:right w:w="50" w:type="dxa"/>
-            </w:tcMar>
-          </w:tcPr>
-          <w:p>
-            <w:pPr>
-              <w:spacing w:after="0"/>
-            </w:pPr>
-            <w:r>
-              <w:rPr>
-                <w:b/>
-                <w:color w:val="1D4ED8"/>
-                <w:sz w:val="16"/>
-              </w:rPr>
-              <w:t>30 ngày</w:t>
-            </w:r>
-          </w:p>
-        </w:tc>
-        <w:tc>
-          <w:tcPr>
-            <w:tcW w:type="dxa" w:w="3600"/>
-            <w:shd w:fill="FFFFFF"/>
-            <w:tcMar>
-              <w:top w:w="35" w:type="dxa"/>
-              <w:bottom w:w="35" w:type="dxa"/>
-              <w:left w:w="50" w:type="dxa"/>
-              <w:right w:w="50" w:type="dxa"/>
-            </w:tcMar>
-          </w:tcPr>
-          <w:p>
-            <w:pPr>
-              <w:spacing w:after="0"/>
-            </w:pPr>
-            <w:r>
-              <w:rPr>
-                <w:sz w:val="16"/>
-              </w:rPr>
-              <w:t>Đăng ký giảm vốn điều lệ khi thành viên chưa góp đủ vốn sau 90 ngày; Triệu tập ĐHĐCĐ lần 2.</w:t>
-            </w:r>
-          </w:p>
-        </w:tc>
-        <w:tc>
-          <w:tcPr>
-            <w:tcW w:type="dxa" w:w="1872"/>
-            <w:shd w:fill="FFFFFF"/>
-            <w:tcMar>
-              <w:top w:w="35" w:type="dxa"/>
-              <w:bottom w:w="35" w:type="dxa"/>
-              <w:left w:w="50" w:type="dxa"/>
-              <w:right w:w="50" w:type="dxa"/>
-            </w:tcMar>
-          </w:tcPr>
-          <w:p>
-            <w:pPr>
-              <w:spacing w:after="0"/>
-            </w:pPr>
-            <w:r>
-              <w:rPr>
-                <w:b/>
-                <w:color w:val="1D4ED8"/>
-                <w:sz w:val="16"/>
-              </w:rPr>
-              <w:t>03 năm</w:t>
-            </w:r>
-          </w:p>
-        </w:tc>
-        <w:tc>
-          <w:tcPr>
-            <w:tcW w:type="dxa" w:w="3600"/>
-            <w:shd w:fill="FFFFFF"/>
-            <w:tcMar>
-              <w:top w:w="35" w:type="dxa"/>
-              <w:bottom w:w="35" w:type="dxa"/>
-              <w:left w:w="50" w:type="dxa"/>
-              <w:right w:w="50" w:type="dxa"/>
-            </w:tcMar>
-          </w:tcPr>
-          <w:p>
-            <w:pPr>
-              <w:spacing w:after="0"/>
-            </w:pPr>
-            <w:r>
-              <w:rPr>
-                <w:sz w:val="16"/>
-              </w:rPr>
-              <w:t>Thời hạn cổ phần ưu đãi biểu quyết của CĐSL có hiệu lực; CĐSL tự do chuyển nhượng CP cho CĐSL khác.</w:t>
-            </w:r>
-          </w:p>
-        </w:tc>
-      </w:tr>
-      <w:tr>
-        <w:tc>
-          <w:tcPr>
-            <w:tcW w:type="dxa" w:w="1872"/>
-            <w:shd w:fill="EFF6FF"/>
-            <w:tcMar>
-              <w:top w:w="35" w:type="dxa"/>
-              <w:bottom w:w="35" w:type="dxa"/>
-              <w:left w:w="50" w:type="dxa"/>
-              <w:right w:w="50" w:type="dxa"/>
-            </w:tcMar>
-          </w:tcPr>
-          <w:p>
-            <w:pPr>
-              <w:spacing w:after="0"/>
-            </w:pPr>
-            <w:r>
-              <w:rPr>
-                <w:b/>
-                <w:color w:val="1D4ED8"/>
-                <w:sz w:val="16"/>
-              </w:rPr>
-              <w:t>03 tháng</w:t>
-            </w:r>
-          </w:p>
-        </w:tc>
-        <w:tc>
-          <w:tcPr>
-            <w:tcW w:type="dxa" w:w="3600"/>
-            <w:shd w:fill="EFF6FF"/>
-            <w:tcMar>
-              <w:top w:w="35" w:type="dxa"/>
-              <w:bottom w:w="35" w:type="dxa"/>
-              <w:left w:w="50" w:type="dxa"/>
-              <w:right w:w="50" w:type="dxa"/>
-            </w:tcMar>
-          </w:tcPr>
-          <w:p>
-            <w:pPr>
-              <w:spacing w:after="0"/>
-            </w:pPr>
-            <w:r>
-              <w:rPr>
-                <w:sz w:val="16"/>
-              </w:rPr>
-              <w:t>Doanh nghiệp mất khả năng thanh toán khi nợ quá hạn 03 tháng kể từ ngày đến hạn thanh toán.</w:t>
-            </w:r>
-          </w:p>
-        </w:tc>
-        <w:tc>
-          <w:tcPr>
-            <w:tcW w:type="dxa" w:w="1872"/>
-            <w:shd w:fill="EFF6FF"/>
-            <w:tcMar>
-              <w:top w:w="35" w:type="dxa"/>
-              <w:bottom w:w="35" w:type="dxa"/>
-              <w:left w:w="50" w:type="dxa"/>
-              <w:right w:w="50" w:type="dxa"/>
-            </w:tcMar>
-          </w:tcPr>
-          <w:p>
-            <w:pPr>
-              <w:spacing w:after="0"/>
-            </w:pPr>
-            <w:r>
-              <w:rPr>
-                <w:b/>
-                <w:color w:val="1D4ED8"/>
-                <w:sz w:val="16"/>
-              </w:rPr>
-              <w:t>02 năm</w:t>
-            </w:r>
-          </w:p>
-        </w:tc>
-        <w:tc>
-          <w:tcPr>
-            <w:tcW w:type="dxa" w:w="3600"/>
-            <w:shd w:fill="EFF6FF"/>
-            <w:tcMar>
-              <w:top w:w="35" w:type="dxa"/>
-              <w:bottom w:w="35" w:type="dxa"/>
-              <w:left w:w="50" w:type="dxa"/>
-              <w:right w:w="50" w:type="dxa"/>
-            </w:tcMar>
-          </w:tcPr>
-          <w:p>
-            <w:pPr>
-              <w:spacing w:after="0"/>
-            </w:pPr>
-            <w:r>
-              <w:rPr>
-                <w:sz w:val="16"/>
-              </w:rPr>
-              <w:t>Thời hiệu khởi kiện tranh chấp thương mại chung theo Luật Thương mại 2005.</w:t>
-            </w:r>
-          </w:p>
-        </w:tc>
-      </w:tr>
-      <w:tr>
-        <w:tc>
-          <w:tcPr>
-            <w:tcW w:type="dxa" w:w="1872"/>
-            <w:shd w:fill="FFFFFF"/>
-            <w:tcMar>
-              <w:top w:w="35" w:type="dxa"/>
-              <w:bottom w:w="35" w:type="dxa"/>
-              <w:left w:w="50" w:type="dxa"/>
-              <w:right w:w="50" w:type="dxa"/>
-            </w:tcMar>
-          </w:tcPr>
-          <w:p>
-            <w:pPr>
-              <w:spacing w:after="0"/>
-            </w:pPr>
-            <w:r>
-              <w:rPr>
-                <w:b/>
-                <w:color w:val="1D4ED8"/>
-                <w:sz w:val="16"/>
-              </w:rPr>
-              <w:t>01 người</w:t>
-            </w:r>
-          </w:p>
-        </w:tc>
-        <w:tc>
-          <w:tcPr>
-            <w:tcW w:type="dxa" w:w="3600"/>
-            <w:shd w:fill="FFFFFF"/>
-            <w:tcMar>
-              <w:top w:w="35" w:type="dxa"/>
-              <w:bottom w:w="35" w:type="dxa"/>
-              <w:left w:w="50" w:type="dxa"/>
-              <w:right w:w="50" w:type="dxa"/>
-            </w:tcMar>
-          </w:tcPr>
-          <w:p>
-            <w:pPr>
-              <w:spacing w:after="0"/>
-            </w:pPr>
-            <w:r>
-              <w:rPr>
-                <w:sz w:val="16"/>
-              </w:rPr>
-              <w:t>Số người ĐDTPL tối thiểu luôn phải thường trú/cư trú tại Việt Nam.</w:t>
-            </w:r>
-          </w:p>
-        </w:tc>
-        <w:tc>
-          <w:tcPr>
-            <w:tcW w:type="dxa" w:w="1872"/>
-            <w:shd w:fill="FFFFFF"/>
-            <w:tcMar>
-              <w:top w:w="35" w:type="dxa"/>
-              <w:bottom w:w="35" w:type="dxa"/>
-              <w:left w:w="50" w:type="dxa"/>
-              <w:right w:w="50" w:type="dxa"/>
-            </w:tcMar>
-          </w:tcPr>
-          <w:p>
-            <w:pPr>
-              <w:spacing w:after="0"/>
-            </w:pPr>
-            <w:r>
-              <w:rPr>
-                <w:b/>
-                <w:color w:val="1D4ED8"/>
-                <w:sz w:val="16"/>
-              </w:rPr>
-              <w:t>03 - 11 người</w:t>
-            </w:r>
-          </w:p>
-        </w:tc>
-        <w:tc>
-          <w:tcPr>
-            <w:tcW w:type="dxa" w:w="3600"/>
-            <w:shd w:fill="FFFFFF"/>
-            <w:tcMar>
-              <w:top w:w="35" w:type="dxa"/>
-              <w:bottom w:w="35" w:type="dxa"/>
-              <w:left w:w="50" w:type="dxa"/>
-              <w:right w:w="50" w:type="dxa"/>
-            </w:tcMar>
-          </w:tcPr>
-          <w:p>
-            <w:pPr>
-              <w:spacing w:after="0"/>
-            </w:pPr>
-            <w:r>
-              <w:rPr>
-                <w:sz w:val="16"/>
-              </w:rPr>
-              <w:t>Số lượng thành viên Hội đồng quản trị công ty cổ phần (Nhiệm kỳ tối đa 05 năm).</w:t>
-            </w:r>
-          </w:p>
-        </w:tc>
-      </w:tr>
-      <w:tr>
-        <w:tc>
-          <w:tcPr>
-            <w:tcW w:type="dxa" w:w="1872"/>
-            <w:shd w:fill="EFF6FF"/>
-            <w:tcMar>
-              <w:top w:w="35" w:type="dxa"/>
-              <w:bottom w:w="35" w:type="dxa"/>
-              <w:left w:w="50" w:type="dxa"/>
-              <w:right w:w="50" w:type="dxa"/>
-            </w:tcMar>
-          </w:tcPr>
-          <w:p>
-            <w:pPr>
-              <w:spacing w:after="0"/>
-            </w:pPr>
-            <w:r>
-              <w:rPr>
-                <w:b/>
-                <w:color w:val="1D4ED8"/>
-                <w:sz w:val="16"/>
-              </w:rPr>
-              <w:t>11 thành viên</w:t>
-            </w:r>
-          </w:p>
-        </w:tc>
-        <w:tc>
-          <w:tcPr>
-            <w:tcW w:type="dxa" w:w="3600"/>
-            <w:shd w:fill="EFF6FF"/>
-            <w:tcMar>
-              <w:top w:w="35" w:type="dxa"/>
-              <w:bottom w:w="35" w:type="dxa"/>
-              <w:left w:w="50" w:type="dxa"/>
-              <w:right w:w="50" w:type="dxa"/>
-            </w:tcMar>
-          </w:tcPr>
-          <w:p>
-            <w:pPr>
-              <w:spacing w:after="0"/>
-            </w:pPr>
-            <w:r>
-              <w:rPr>
-                <w:sz w:val="16"/>
-              </w:rPr>
-              <w:t>Công ty TNHH 2+ TV có từ 11 thành viên trở lên bắt buộc phải lập Ban kiểm soát.</w:t>
-            </w:r>
-          </w:p>
-        </w:tc>
-        <w:tc>
-          <w:tcPr>
-            <w:tcW w:type="dxa" w:w="1872"/>
-            <w:shd w:fill="EFF6FF"/>
-            <w:tcMar>
-              <w:top w:w="35" w:type="dxa"/>
-              <w:bottom w:w="35" w:type="dxa"/>
-              <w:left w:w="50" w:type="dxa"/>
-              <w:right w:w="50" w:type="dxa"/>
-            </w:tcMar>
-          </w:tcPr>
-          <w:p>
-            <w:pPr>
-              <w:spacing w:after="0"/>
-            </w:pPr>
-            <w:r>
-              <w:rPr>
-                <w:b/>
-                <w:color w:val="1D4ED8"/>
-                <w:sz w:val="16"/>
-              </w:rPr>
-              <w:t>Ít nhất 20%</w:t>
-            </w:r>
-          </w:p>
-        </w:tc>
-        <w:tc>
-          <w:tcPr>
-            <w:tcW w:type="dxa" w:w="3600"/>
-            <w:shd w:fill="EFF6FF"/>
-            <w:tcMar>
-              <w:top w:w="35" w:type="dxa"/>
-              <w:bottom w:w="35" w:type="dxa"/>
-              <w:left w:w="50" w:type="dxa"/>
-              <w:right w:w="50" w:type="dxa"/>
-            </w:tcMar>
-          </w:tcPr>
-          <w:p>
-            <w:pPr>
-              <w:spacing w:after="0"/>
-            </w:pPr>
-            <w:r>
-              <w:rPr>
-                <w:sz w:val="16"/>
-              </w:rPr>
-              <w:t>Tỷ lệ cổ phần phổ thông tối thiểu các CĐSL phải cùng nhau đăng ký mua khi thành lập CTCP.</w:t>
-            </w:r>
-          </w:p>
-        </w:tc>
-      </w:tr>
-    </w:tbl>
-    <w:p>
-      <w:pPr>
-        <w:spacing w:before="120" w:after="40"/>
-      </w:pPr>
-      <w:r>
-        <w:rPr>
-          <w:b/>
-          <w:color w:val="1D4ED8"/>
-          <w:sz w:val="19"/>
-        </w:rPr>
-        <w:t>3. TỶ LỆ HỌP &amp; THÔNG QUA NGHỊ QUYẾT (ĐHĐCĐ CỔ PHẦN &amp; HĐTV TNHH)</w:t>
-      </w:r>
-    </w:p>
-    <w:tbl>
-      <w:tblPr>
-        <w:tblW w:type="auto" w:w="0"/>
-        <w:jc w:val="center"/>
-        <w:tblLayout w:type="fixed"/>
-        <w:tblLook w:firstColumn="1" w:firstRow="1" w:lastColumn="0" w:lastRow="0" w:noHBand="0" w:noVBand="1" w:val="04A0"/>
-      </w:tblPr>
-      <w:tblGrid>
-        <w:gridCol w:w="3648"/>
-        <w:gridCol w:w="3648"/>
-        <w:gridCol w:w="3648"/>
-      </w:tblGrid>
-      <w:tr>
-        <w:tc>
-          <w:tcPr>
-            <w:tcW w:type="dxa" w:w="2592"/>
-            <w:shd w:fill="1E3A8A"/>
-            <w:tcMar>
-              <w:top w:w="50" w:type="dxa"/>
-              <w:bottom w:w="50" w:type="dxa"/>
-              <w:left w:w="60" w:type="dxa"/>
-              <w:right w:w="60" w:type="dxa"/>
+              <w:left w:w="45" w:type="dxa"/>
+              <w:right w:w="45" w:type="dxa"/>
             </w:tcMar>
           </w:tcPr>
           <w:p>
@@ -1492,21 +261,2200 @@
               <w:rPr>
                 <w:b/>
                 <w:color w:val="FFFFFF"/>
-                <w:sz w:val="16"/>
+                <w:sz w:val="15"/>
               </w:rPr>
-              <w:t>Nội dung / Cơ quan</w:t>
+              <w:t>Hộ kinh doanh</w:t>
+            </w:r>
+          </w:p>
+        </w:tc>
+      </w:tr>
+      <w:tr>
+        <w:tc>
+          <w:tcPr>
+            <w:tcW w:type="dxa" w:w="1440"/>
+            <w:shd w:fill="F8FAFC"/>
+            <w:tcMar>
+              <w:top w:w="35" w:type="dxa"/>
+              <w:bottom w:w="35" w:type="dxa"/>
+              <w:left w:w="45" w:type="dxa"/>
+              <w:right w:w="45" w:type="dxa"/>
+            </w:tcMar>
+          </w:tcPr>
+          <w:p>
+            <w:pPr>
+              <w:spacing w:after="0" w:line="252" w:lineRule="auto"/>
+            </w:pPr>
+            <w:r>
+              <w:rPr>
+                <w:b/>
+                <w:color w:val="1E293B"/>
+                <w:sz w:val="14"/>
+              </w:rPr>
+              <w:t>Tư cách pháp nhân</w:t>
             </w:r>
           </w:p>
         </w:tc>
         <w:tc>
           <w:tcPr>
-            <w:tcW w:type="dxa" w:w="4176"/>
+            <w:tcW w:type="dxa" w:w="1512"/>
+            <w:shd w:fill="F8FAFC"/>
+            <w:tcMar>
+              <w:top w:w="35" w:type="dxa"/>
+              <w:bottom w:w="35" w:type="dxa"/>
+              <w:left w:w="45" w:type="dxa"/>
+              <w:right w:w="45" w:type="dxa"/>
+            </w:tcMar>
+          </w:tcPr>
+          <w:p>
+            <w:pPr>
+              <w:spacing w:after="0" w:line="252" w:lineRule="auto"/>
+            </w:pPr>
+            <w:r>
+              <w:rPr>
+                <w:sz w:val="14"/>
+              </w:rPr>
+              <w:t>KHÔNG có pháp nhân</w:t>
+            </w:r>
+          </w:p>
+        </w:tc>
+        <w:tc>
+          <w:tcPr>
+            <w:tcW w:type="dxa" w:w="1656"/>
+            <w:shd w:fill="F8FAFC"/>
+            <w:tcMar>
+              <w:top w:w="35" w:type="dxa"/>
+              <w:bottom w:w="35" w:type="dxa"/>
+              <w:left w:w="45" w:type="dxa"/>
+              <w:right w:w="45" w:type="dxa"/>
+            </w:tcMar>
+          </w:tcPr>
+          <w:p>
+            <w:pPr>
+              <w:spacing w:after="0" w:line="252" w:lineRule="auto"/>
+            </w:pPr>
+            <w:r>
+              <w:rPr>
+                <w:sz w:val="14"/>
+              </w:rPr>
+              <w:t>CÓ tư cách pháp nhân</w:t>
+            </w:r>
+          </w:p>
+        </w:tc>
+        <w:tc>
+          <w:tcPr>
+            <w:tcW w:type="dxa" w:w="1512"/>
+            <w:shd w:fill="F8FAFC"/>
+            <w:tcMar>
+              <w:top w:w="35" w:type="dxa"/>
+              <w:bottom w:w="35" w:type="dxa"/>
+              <w:left w:w="45" w:type="dxa"/>
+              <w:right w:w="45" w:type="dxa"/>
+            </w:tcMar>
+          </w:tcPr>
+          <w:p>
+            <w:pPr>
+              <w:spacing w:after="0" w:line="252" w:lineRule="auto"/>
+            </w:pPr>
+            <w:r>
+              <w:rPr>
+                <w:sz w:val="14"/>
+              </w:rPr>
+              <w:t>CÓ tư cách pháp nhân</w:t>
+            </w:r>
+          </w:p>
+        </w:tc>
+        <w:tc>
+          <w:tcPr>
+            <w:tcW w:type="dxa" w:w="1584"/>
+            <w:shd w:fill="F8FAFC"/>
+            <w:tcMar>
+              <w:top w:w="35" w:type="dxa"/>
+              <w:bottom w:w="35" w:type="dxa"/>
+              <w:left w:w="45" w:type="dxa"/>
+              <w:right w:w="45" w:type="dxa"/>
+            </w:tcMar>
+          </w:tcPr>
+          <w:p>
+            <w:pPr>
+              <w:spacing w:after="0" w:line="252" w:lineRule="auto"/>
+            </w:pPr>
+            <w:r>
+              <w:rPr>
+                <w:sz w:val="14"/>
+              </w:rPr>
+              <w:t>CÓ tư cách pháp nhân</w:t>
+            </w:r>
+          </w:p>
+        </w:tc>
+        <w:tc>
+          <w:tcPr>
+            <w:tcW w:type="dxa" w:w="1656"/>
+            <w:shd w:fill="F8FAFC"/>
+            <w:tcMar>
+              <w:top w:w="35" w:type="dxa"/>
+              <w:bottom w:w="35" w:type="dxa"/>
+              <w:left w:w="45" w:type="dxa"/>
+              <w:right w:w="45" w:type="dxa"/>
+            </w:tcMar>
+          </w:tcPr>
+          <w:p>
+            <w:pPr>
+              <w:spacing w:after="0" w:line="252" w:lineRule="auto"/>
+            </w:pPr>
+            <w:r>
+              <w:rPr>
+                <w:sz w:val="14"/>
+              </w:rPr>
+              <w:t>CÓ tư cách pháp nhân</w:t>
+            </w:r>
+          </w:p>
+        </w:tc>
+        <w:tc>
+          <w:tcPr>
+            <w:tcW w:type="dxa" w:w="1584"/>
+            <w:shd w:fill="F8FAFC"/>
+            <w:tcMar>
+              <w:top w:w="35" w:type="dxa"/>
+              <w:bottom w:w="35" w:type="dxa"/>
+              <w:left w:w="45" w:type="dxa"/>
+              <w:right w:w="45" w:type="dxa"/>
+            </w:tcMar>
+          </w:tcPr>
+          <w:p>
+            <w:pPr>
+              <w:spacing w:after="0" w:line="252" w:lineRule="auto"/>
+            </w:pPr>
+            <w:r>
+              <w:rPr>
+                <w:sz w:val="14"/>
+              </w:rPr>
+              <w:t>KHÔNG có pháp nhân</w:t>
+            </w:r>
+          </w:p>
+        </w:tc>
+      </w:tr>
+      <w:tr>
+        <w:tc>
+          <w:tcPr>
+            <w:tcW w:type="dxa" w:w="1440"/>
+            <w:shd w:fill="FFFFFF"/>
+            <w:tcMar>
+              <w:top w:w="35" w:type="dxa"/>
+              <w:bottom w:w="35" w:type="dxa"/>
+              <w:left w:w="45" w:type="dxa"/>
+              <w:right w:w="45" w:type="dxa"/>
+            </w:tcMar>
+          </w:tcPr>
+          <w:p>
+            <w:pPr>
+              <w:spacing w:after="0" w:line="252" w:lineRule="auto"/>
+            </w:pPr>
+            <w:r>
+              <w:rPr>
+                <w:b/>
+                <w:color w:val="1E293B"/>
+                <w:sz w:val="14"/>
+              </w:rPr>
+              <w:t>Tư cách thương nhân</w:t>
+            </w:r>
+          </w:p>
+        </w:tc>
+        <w:tc>
+          <w:tcPr>
+            <w:tcW w:type="dxa" w:w="1512"/>
+            <w:shd w:fill="FFFFFF"/>
+            <w:tcMar>
+              <w:top w:w="35" w:type="dxa"/>
+              <w:bottom w:w="35" w:type="dxa"/>
+              <w:left w:w="45" w:type="dxa"/>
+              <w:right w:w="45" w:type="dxa"/>
+            </w:tcMar>
+          </w:tcPr>
+          <w:p>
+            <w:pPr>
+              <w:spacing w:after="0" w:line="252" w:lineRule="auto"/>
+            </w:pPr>
+            <w:r>
+              <w:rPr>
+                <w:sz w:val="14"/>
+              </w:rPr>
+              <w:t>LÀ thương nhân</w:t>
+            </w:r>
+          </w:p>
+        </w:tc>
+        <w:tc>
+          <w:tcPr>
+            <w:tcW w:type="dxa" w:w="1656"/>
+            <w:shd w:fill="FFFFFF"/>
+            <w:tcMar>
+              <w:top w:w="35" w:type="dxa"/>
+              <w:bottom w:w="35" w:type="dxa"/>
+              <w:left w:w="45" w:type="dxa"/>
+              <w:right w:w="45" w:type="dxa"/>
+            </w:tcMar>
+          </w:tcPr>
+          <w:p>
+            <w:pPr>
+              <w:spacing w:after="0" w:line="252" w:lineRule="auto"/>
+            </w:pPr>
+            <w:r>
+              <w:rPr>
+                <w:sz w:val="14"/>
+              </w:rPr>
+              <w:t>LÀ thương nhân</w:t>
+            </w:r>
+          </w:p>
+        </w:tc>
+        <w:tc>
+          <w:tcPr>
+            <w:tcW w:type="dxa" w:w="1512"/>
+            <w:shd w:fill="FFFFFF"/>
+            <w:tcMar>
+              <w:top w:w="35" w:type="dxa"/>
+              <w:bottom w:w="35" w:type="dxa"/>
+              <w:left w:w="45" w:type="dxa"/>
+              <w:right w:w="45" w:type="dxa"/>
+            </w:tcMar>
+          </w:tcPr>
+          <w:p>
+            <w:pPr>
+              <w:spacing w:after="0" w:line="252" w:lineRule="auto"/>
+            </w:pPr>
+            <w:r>
+              <w:rPr>
+                <w:sz w:val="14"/>
+              </w:rPr>
+              <w:t>LÀ thương nhân</w:t>
+            </w:r>
+          </w:p>
+        </w:tc>
+        <w:tc>
+          <w:tcPr>
+            <w:tcW w:type="dxa" w:w="1584"/>
+            <w:shd w:fill="FFFFFF"/>
+            <w:tcMar>
+              <w:top w:w="35" w:type="dxa"/>
+              <w:bottom w:w="35" w:type="dxa"/>
+              <w:left w:w="45" w:type="dxa"/>
+              <w:right w:w="45" w:type="dxa"/>
+            </w:tcMar>
+          </w:tcPr>
+          <w:p>
+            <w:pPr>
+              <w:spacing w:after="0" w:line="252" w:lineRule="auto"/>
+            </w:pPr>
+            <w:r>
+              <w:rPr>
+                <w:sz w:val="14"/>
+              </w:rPr>
+              <w:t>LÀ thương nhân</w:t>
+            </w:r>
+          </w:p>
+        </w:tc>
+        <w:tc>
+          <w:tcPr>
+            <w:tcW w:type="dxa" w:w="1656"/>
+            <w:shd w:fill="FFFFFF"/>
+            <w:tcMar>
+              <w:top w:w="35" w:type="dxa"/>
+              <w:bottom w:w="35" w:type="dxa"/>
+              <w:left w:w="45" w:type="dxa"/>
+              <w:right w:w="45" w:type="dxa"/>
+            </w:tcMar>
+          </w:tcPr>
+          <w:p>
+            <w:pPr>
+              <w:spacing w:after="0" w:line="252" w:lineRule="auto"/>
+            </w:pPr>
+            <w:r>
+              <w:rPr>
+                <w:sz w:val="14"/>
+              </w:rPr>
+              <w:t>LÀ thương nhân</w:t>
+            </w:r>
+          </w:p>
+        </w:tc>
+        <w:tc>
+          <w:tcPr>
+            <w:tcW w:type="dxa" w:w="1584"/>
+            <w:shd w:fill="FFFFFF"/>
+            <w:tcMar>
+              <w:top w:w="35" w:type="dxa"/>
+              <w:bottom w:w="35" w:type="dxa"/>
+              <w:left w:w="45" w:type="dxa"/>
+              <w:right w:w="45" w:type="dxa"/>
+            </w:tcMar>
+          </w:tcPr>
+          <w:p>
+            <w:pPr>
+              <w:spacing w:after="0" w:line="252" w:lineRule="auto"/>
+            </w:pPr>
+            <w:r>
+              <w:rPr>
+                <w:sz w:val="14"/>
+              </w:rPr>
+              <w:t>LÀ thương nhân</w:t>
+            </w:r>
+          </w:p>
+        </w:tc>
+      </w:tr>
+      <w:tr>
+        <w:tc>
+          <w:tcPr>
+            <w:tcW w:type="dxa" w:w="1440"/>
+            <w:shd w:fill="F8FAFC"/>
+            <w:tcMar>
+              <w:top w:w="35" w:type="dxa"/>
+              <w:bottom w:w="35" w:type="dxa"/>
+              <w:left w:w="45" w:type="dxa"/>
+              <w:right w:w="45" w:type="dxa"/>
+            </w:tcMar>
+          </w:tcPr>
+          <w:p>
+            <w:pPr>
+              <w:spacing w:after="0" w:line="252" w:lineRule="auto"/>
+            </w:pPr>
+            <w:r>
+              <w:rPr>
+                <w:b/>
+                <w:color w:val="1E293B"/>
+                <w:sz w:val="14"/>
+              </w:rPr>
+              <w:t>Trách nhiệm tài sản</w:t>
+            </w:r>
+          </w:p>
+        </w:tc>
+        <w:tc>
+          <w:tcPr>
+            <w:tcW w:type="dxa" w:w="1512"/>
+            <w:shd w:fill="F8FAFC"/>
+            <w:tcMar>
+              <w:top w:w="35" w:type="dxa"/>
+              <w:bottom w:w="35" w:type="dxa"/>
+              <w:left w:w="45" w:type="dxa"/>
+              <w:right w:w="45" w:type="dxa"/>
+            </w:tcMar>
+          </w:tcPr>
+          <w:p>
+            <w:pPr>
+              <w:spacing w:after="0" w:line="252" w:lineRule="auto"/>
+            </w:pPr>
+            <w:r>
+              <w:rPr>
+                <w:sz w:val="14"/>
+              </w:rPr>
+              <w:t>VÔ HẠN (toàn bộ tài sản chủ DNTN)</w:t>
+            </w:r>
+          </w:p>
+        </w:tc>
+        <w:tc>
+          <w:tcPr>
+            <w:tcW w:type="dxa" w:w="1656"/>
+            <w:shd w:fill="F8FAFC"/>
+            <w:tcMar>
+              <w:top w:w="35" w:type="dxa"/>
+              <w:bottom w:w="35" w:type="dxa"/>
+              <w:left w:w="45" w:type="dxa"/>
+              <w:right w:w="45" w:type="dxa"/>
+            </w:tcMar>
+          </w:tcPr>
+          <w:p>
+            <w:pPr>
+              <w:spacing w:after="0" w:line="252" w:lineRule="auto"/>
+            </w:pPr>
+            <w:r>
+              <w:rPr>
+                <w:sz w:val="14"/>
+              </w:rPr>
+              <w:t>TV Hợp danh: VÔ HẠN liên đới</w:t>
+              <w:br/>
+              <w:t>TV Góp vốn: HỮU HẠN</w:t>
+            </w:r>
+          </w:p>
+        </w:tc>
+        <w:tc>
+          <w:tcPr>
+            <w:tcW w:type="dxa" w:w="1512"/>
+            <w:shd w:fill="F8FAFC"/>
+            <w:tcMar>
+              <w:top w:w="35" w:type="dxa"/>
+              <w:bottom w:w="35" w:type="dxa"/>
+              <w:left w:w="45" w:type="dxa"/>
+              <w:right w:w="45" w:type="dxa"/>
+            </w:tcMar>
+          </w:tcPr>
+          <w:p>
+            <w:pPr>
+              <w:spacing w:after="0" w:line="252" w:lineRule="auto"/>
+            </w:pPr>
+            <w:r>
+              <w:rPr>
+                <w:sz w:val="14"/>
+              </w:rPr>
+              <w:t>HỮU HẠN (trong phạm vi vốn điều lệ)</w:t>
+            </w:r>
+          </w:p>
+        </w:tc>
+        <w:tc>
+          <w:tcPr>
+            <w:tcW w:type="dxa" w:w="1584"/>
+            <w:shd w:fill="F8FAFC"/>
+            <w:tcMar>
+              <w:top w:w="35" w:type="dxa"/>
+              <w:bottom w:w="35" w:type="dxa"/>
+              <w:left w:w="45" w:type="dxa"/>
+              <w:right w:w="45" w:type="dxa"/>
+            </w:tcMar>
+          </w:tcPr>
+          <w:p>
+            <w:pPr>
+              <w:spacing w:after="0" w:line="252" w:lineRule="auto"/>
+            </w:pPr>
+            <w:r>
+              <w:rPr>
+                <w:sz w:val="14"/>
+              </w:rPr>
+              <w:t>HỮU HẠN (trong phạm vi vốn cam kết góp)</w:t>
+            </w:r>
+          </w:p>
+        </w:tc>
+        <w:tc>
+          <w:tcPr>
+            <w:tcW w:type="dxa" w:w="1656"/>
+            <w:shd w:fill="F8FAFC"/>
+            <w:tcMar>
+              <w:top w:w="35" w:type="dxa"/>
+              <w:bottom w:w="35" w:type="dxa"/>
+              <w:left w:w="45" w:type="dxa"/>
+              <w:right w:w="45" w:type="dxa"/>
+            </w:tcMar>
+          </w:tcPr>
+          <w:p>
+            <w:pPr>
+              <w:spacing w:after="0" w:line="252" w:lineRule="auto"/>
+            </w:pPr>
+            <w:r>
+              <w:rPr>
+                <w:sz w:val="14"/>
+              </w:rPr>
+              <w:t>HỮU HẠN (mệnh giá cổ phần đã mua)</w:t>
+            </w:r>
+          </w:p>
+        </w:tc>
+        <w:tc>
+          <w:tcPr>
+            <w:tcW w:type="dxa" w:w="1584"/>
+            <w:shd w:fill="F8FAFC"/>
+            <w:tcMar>
+              <w:top w:w="35" w:type="dxa"/>
+              <w:bottom w:w="35" w:type="dxa"/>
+              <w:left w:w="45" w:type="dxa"/>
+              <w:right w:w="45" w:type="dxa"/>
+            </w:tcMar>
+          </w:tcPr>
+          <w:p>
+            <w:pPr>
+              <w:spacing w:after="0" w:line="252" w:lineRule="auto"/>
+            </w:pPr>
+            <w:r>
+              <w:rPr>
+                <w:sz w:val="14"/>
+              </w:rPr>
+              <w:t>VÔ HẠN (toàn bộ tài sản cá nhân/hộ)</w:t>
+            </w:r>
+          </w:p>
+        </w:tc>
+      </w:tr>
+      <w:tr>
+        <w:tc>
+          <w:tcPr>
+            <w:tcW w:type="dxa" w:w="1440"/>
+            <w:shd w:fill="FFFFFF"/>
+            <w:tcMar>
+              <w:top w:w="35" w:type="dxa"/>
+              <w:bottom w:w="35" w:type="dxa"/>
+              <w:left w:w="45" w:type="dxa"/>
+              <w:right w:w="45" w:type="dxa"/>
+            </w:tcMar>
+          </w:tcPr>
+          <w:p>
+            <w:pPr>
+              <w:spacing w:after="0" w:line="252" w:lineRule="auto"/>
+            </w:pPr>
+            <w:r>
+              <w:rPr>
+                <w:b/>
+                <w:color w:val="1E293B"/>
+                <w:sz w:val="14"/>
+              </w:rPr>
+              <w:t>Số lượng thành viên</w:t>
+            </w:r>
+          </w:p>
+        </w:tc>
+        <w:tc>
+          <w:tcPr>
+            <w:tcW w:type="dxa" w:w="1512"/>
+            <w:shd w:fill="FFFFFF"/>
+            <w:tcMar>
+              <w:top w:w="35" w:type="dxa"/>
+              <w:bottom w:w="35" w:type="dxa"/>
+              <w:left w:w="45" w:type="dxa"/>
+              <w:right w:w="45" w:type="dxa"/>
+            </w:tcMar>
+          </w:tcPr>
+          <w:p>
+            <w:pPr>
+              <w:spacing w:after="0" w:line="252" w:lineRule="auto"/>
+            </w:pPr>
+            <w:r>
+              <w:rPr>
+                <w:sz w:val="14"/>
+              </w:rPr>
+              <w:t>Duy nhất 01 cá nhân</w:t>
+            </w:r>
+          </w:p>
+        </w:tc>
+        <w:tc>
+          <w:tcPr>
+            <w:tcW w:type="dxa" w:w="1656"/>
+            <w:shd w:fill="FFFFFF"/>
+            <w:tcMar>
+              <w:top w:w="35" w:type="dxa"/>
+              <w:bottom w:w="35" w:type="dxa"/>
+              <w:left w:w="45" w:type="dxa"/>
+              <w:right w:w="45" w:type="dxa"/>
+            </w:tcMar>
+          </w:tcPr>
+          <w:p>
+            <w:pPr>
+              <w:spacing w:after="0" w:line="252" w:lineRule="auto"/>
+            </w:pPr>
+            <w:r>
+              <w:rPr>
+                <w:sz w:val="14"/>
+              </w:rPr>
+              <w:t>Ít nhất 02 TV hợp danh (cá nhân)</w:t>
+            </w:r>
+          </w:p>
+        </w:tc>
+        <w:tc>
+          <w:tcPr>
+            <w:tcW w:type="dxa" w:w="1512"/>
+            <w:shd w:fill="FFFFFF"/>
+            <w:tcMar>
+              <w:top w:w="35" w:type="dxa"/>
+              <w:bottom w:w="35" w:type="dxa"/>
+              <w:left w:w="45" w:type="dxa"/>
+              <w:right w:w="45" w:type="dxa"/>
+            </w:tcMar>
+          </w:tcPr>
+          <w:p>
+            <w:pPr>
+              <w:spacing w:after="0" w:line="252" w:lineRule="auto"/>
+            </w:pPr>
+            <w:r>
+              <w:rPr>
+                <w:sz w:val="14"/>
+              </w:rPr>
+              <w:t>01 tổ chức hoặc 01 cá nhân</w:t>
+            </w:r>
+          </w:p>
+        </w:tc>
+        <w:tc>
+          <w:tcPr>
+            <w:tcW w:type="dxa" w:w="1584"/>
+            <w:shd w:fill="FFFFFF"/>
+            <w:tcMar>
+              <w:top w:w="35" w:type="dxa"/>
+              <w:bottom w:w="35" w:type="dxa"/>
+              <w:left w:w="45" w:type="dxa"/>
+              <w:right w:w="45" w:type="dxa"/>
+            </w:tcMar>
+          </w:tcPr>
+          <w:p>
+            <w:pPr>
+              <w:spacing w:after="0" w:line="252" w:lineRule="auto"/>
+            </w:pPr>
+            <w:r>
+              <w:rPr>
+                <w:sz w:val="14"/>
+              </w:rPr>
+              <w:t>Từ 02 đến 50 thành viên</w:t>
+            </w:r>
+          </w:p>
+        </w:tc>
+        <w:tc>
+          <w:tcPr>
+            <w:tcW w:type="dxa" w:w="1656"/>
+            <w:shd w:fill="FFFFFF"/>
+            <w:tcMar>
+              <w:top w:w="35" w:type="dxa"/>
+              <w:bottom w:w="35" w:type="dxa"/>
+              <w:left w:w="45" w:type="dxa"/>
+              <w:right w:w="45" w:type="dxa"/>
+            </w:tcMar>
+          </w:tcPr>
+          <w:p>
+            <w:pPr>
+              <w:spacing w:after="0" w:line="252" w:lineRule="auto"/>
+            </w:pPr>
+            <w:r>
+              <w:rPr>
+                <w:sz w:val="14"/>
+              </w:rPr>
+              <w:t>Tối thiểu 03 cổ đông, KHÔNG GIỚI HẠN tối đa</w:t>
+            </w:r>
+          </w:p>
+        </w:tc>
+        <w:tc>
+          <w:tcPr>
+            <w:tcW w:type="dxa" w:w="1584"/>
+            <w:shd w:fill="FFFFFF"/>
+            <w:tcMar>
+              <w:top w:w="35" w:type="dxa"/>
+              <w:bottom w:w="35" w:type="dxa"/>
+              <w:left w:w="45" w:type="dxa"/>
+              <w:right w:w="45" w:type="dxa"/>
+            </w:tcMar>
+          </w:tcPr>
+          <w:p>
+            <w:pPr>
+              <w:spacing w:after="0" w:line="252" w:lineRule="auto"/>
+            </w:pPr>
+            <w:r>
+              <w:rPr>
+                <w:sz w:val="14"/>
+              </w:rPr>
+              <w:t>01 cá nhân hoặc thành viên hộ GĐ</w:t>
+            </w:r>
+          </w:p>
+        </w:tc>
+      </w:tr>
+      <w:tr>
+        <w:tc>
+          <w:tcPr>
+            <w:tcW w:type="dxa" w:w="1440"/>
+            <w:shd w:fill="F8FAFC"/>
+            <w:tcMar>
+              <w:top w:w="35" w:type="dxa"/>
+              <w:bottom w:w="35" w:type="dxa"/>
+              <w:left w:w="45" w:type="dxa"/>
+              <w:right w:w="45" w:type="dxa"/>
+            </w:tcMar>
+          </w:tcPr>
+          <w:p>
+            <w:pPr>
+              <w:spacing w:after="0" w:line="252" w:lineRule="auto"/>
+            </w:pPr>
+            <w:r>
+              <w:rPr>
+                <w:b/>
+                <w:color w:val="1E293B"/>
+                <w:sz w:val="14"/>
+              </w:rPr>
+              <w:t>Phát hành chứng khoán</w:t>
+            </w:r>
+          </w:p>
+        </w:tc>
+        <w:tc>
+          <w:tcPr>
+            <w:tcW w:type="dxa" w:w="1512"/>
+            <w:shd w:fill="F8FAFC"/>
+            <w:tcMar>
+              <w:top w:w="35" w:type="dxa"/>
+              <w:bottom w:w="35" w:type="dxa"/>
+              <w:left w:w="45" w:type="dxa"/>
+              <w:right w:w="45" w:type="dxa"/>
+            </w:tcMar>
+          </w:tcPr>
+          <w:p>
+            <w:pPr>
+              <w:spacing w:after="0" w:line="252" w:lineRule="auto"/>
+            </w:pPr>
+            <w:r>
+              <w:rPr>
+                <w:sz w:val="14"/>
+              </w:rPr>
+              <w:t>CẤM phát hành mọi chứng khoán</w:t>
+            </w:r>
+          </w:p>
+        </w:tc>
+        <w:tc>
+          <w:tcPr>
+            <w:tcW w:type="dxa" w:w="1656"/>
+            <w:shd w:fill="F8FAFC"/>
+            <w:tcMar>
+              <w:top w:w="35" w:type="dxa"/>
+              <w:bottom w:w="35" w:type="dxa"/>
+              <w:left w:w="45" w:type="dxa"/>
+              <w:right w:w="45" w:type="dxa"/>
+            </w:tcMar>
+          </w:tcPr>
+          <w:p>
+            <w:pPr>
+              <w:spacing w:after="0" w:line="252" w:lineRule="auto"/>
+            </w:pPr>
+            <w:r>
+              <w:rPr>
+                <w:sz w:val="14"/>
+              </w:rPr>
+              <w:t>CẤM phát hành mọi chứng khoán</w:t>
+            </w:r>
+          </w:p>
+        </w:tc>
+        <w:tc>
+          <w:tcPr>
+            <w:tcW w:type="dxa" w:w="1512"/>
+            <w:shd w:fill="F8FAFC"/>
+            <w:tcMar>
+              <w:top w:w="35" w:type="dxa"/>
+              <w:bottom w:w="35" w:type="dxa"/>
+              <w:left w:w="45" w:type="dxa"/>
+              <w:right w:w="45" w:type="dxa"/>
+            </w:tcMar>
+          </w:tcPr>
+          <w:p>
+            <w:pPr>
+              <w:spacing w:after="0" w:line="252" w:lineRule="auto"/>
+            </w:pPr>
+            <w:r>
+              <w:rPr>
+                <w:sz w:val="14"/>
+              </w:rPr>
+              <w:t>ĐƯỢC phát hành Trái phiếu</w:t>
+            </w:r>
+          </w:p>
+        </w:tc>
+        <w:tc>
+          <w:tcPr>
+            <w:tcW w:type="dxa" w:w="1584"/>
+            <w:shd w:fill="F8FAFC"/>
+            <w:tcMar>
+              <w:top w:w="35" w:type="dxa"/>
+              <w:bottom w:w="35" w:type="dxa"/>
+              <w:left w:w="45" w:type="dxa"/>
+              <w:right w:w="45" w:type="dxa"/>
+            </w:tcMar>
+          </w:tcPr>
+          <w:p>
+            <w:pPr>
+              <w:spacing w:after="0" w:line="252" w:lineRule="auto"/>
+            </w:pPr>
+            <w:r>
+              <w:rPr>
+                <w:sz w:val="14"/>
+              </w:rPr>
+              <w:t>ĐƯỢC phát hành Trái phiếu</w:t>
+            </w:r>
+          </w:p>
+        </w:tc>
+        <w:tc>
+          <w:tcPr>
+            <w:tcW w:type="dxa" w:w="1656"/>
+            <w:shd w:fill="F8FAFC"/>
+            <w:tcMar>
+              <w:top w:w="35" w:type="dxa"/>
+              <w:bottom w:w="35" w:type="dxa"/>
+              <w:left w:w="45" w:type="dxa"/>
+              <w:right w:w="45" w:type="dxa"/>
+            </w:tcMar>
+          </w:tcPr>
+          <w:p>
+            <w:pPr>
+              <w:spacing w:after="0" w:line="252" w:lineRule="auto"/>
+            </w:pPr>
+            <w:r>
+              <w:rPr>
+                <w:sz w:val="14"/>
+              </w:rPr>
+              <w:t>ĐƯỢC phát hành Cổ phiếu, Trái phiếu, mọi CK</w:t>
+            </w:r>
+          </w:p>
+        </w:tc>
+        <w:tc>
+          <w:tcPr>
+            <w:tcW w:type="dxa" w:w="1584"/>
+            <w:shd w:fill="F8FAFC"/>
+            <w:tcMar>
+              <w:top w:w="35" w:type="dxa"/>
+              <w:bottom w:w="35" w:type="dxa"/>
+              <w:left w:w="45" w:type="dxa"/>
+              <w:right w:w="45" w:type="dxa"/>
+            </w:tcMar>
+          </w:tcPr>
+          <w:p>
+            <w:pPr>
+              <w:spacing w:after="0" w:line="252" w:lineRule="auto"/>
+            </w:pPr>
+            <w:r>
+              <w:rPr>
+                <w:sz w:val="14"/>
+              </w:rPr>
+              <w:t>CẤM phát hành mọi chứng khoán</w:t>
+            </w:r>
+          </w:p>
+        </w:tc>
+      </w:tr>
+      <w:tr>
+        <w:tc>
+          <w:tcPr>
+            <w:tcW w:type="dxa" w:w="1440"/>
+            <w:shd w:fill="FFFFFF"/>
+            <w:tcMar>
+              <w:top w:w="35" w:type="dxa"/>
+              <w:bottom w:w="35" w:type="dxa"/>
+              <w:left w:w="45" w:type="dxa"/>
+              <w:right w:w="45" w:type="dxa"/>
+            </w:tcMar>
+          </w:tcPr>
+          <w:p>
+            <w:pPr>
+              <w:spacing w:after="0" w:line="252" w:lineRule="auto"/>
+            </w:pPr>
+            <w:r>
+              <w:rPr>
+                <w:b/>
+                <w:color w:val="1E293B"/>
+                <w:sz w:val="14"/>
+              </w:rPr>
+              <w:t>Người ĐDTPL</w:t>
+            </w:r>
+          </w:p>
+        </w:tc>
+        <w:tc>
+          <w:tcPr>
+            <w:tcW w:type="dxa" w:w="1512"/>
+            <w:shd w:fill="FFFFFF"/>
+            <w:tcMar>
+              <w:top w:w="35" w:type="dxa"/>
+              <w:bottom w:w="35" w:type="dxa"/>
+              <w:left w:w="45" w:type="dxa"/>
+              <w:right w:w="45" w:type="dxa"/>
+            </w:tcMar>
+          </w:tcPr>
+          <w:p>
+            <w:pPr>
+              <w:spacing w:after="0" w:line="252" w:lineRule="auto"/>
+            </w:pPr>
+            <w:r>
+              <w:rPr>
+                <w:sz w:val="14"/>
+              </w:rPr>
+              <w:t>Chủ doanh nghiệp tư nhân</w:t>
+            </w:r>
+          </w:p>
+        </w:tc>
+        <w:tc>
+          <w:tcPr>
+            <w:tcW w:type="dxa" w:w="1656"/>
+            <w:shd w:fill="FFFFFF"/>
+            <w:tcMar>
+              <w:top w:w="35" w:type="dxa"/>
+              <w:bottom w:w="35" w:type="dxa"/>
+              <w:left w:w="45" w:type="dxa"/>
+              <w:right w:w="45" w:type="dxa"/>
+            </w:tcMar>
+          </w:tcPr>
+          <w:p>
+            <w:pPr>
+              <w:spacing w:after="0" w:line="252" w:lineRule="auto"/>
+            </w:pPr>
+            <w:r>
+              <w:rPr>
+                <w:sz w:val="14"/>
+              </w:rPr>
+              <w:t>TẤT CẢ thành viên hợp danh</w:t>
+            </w:r>
+          </w:p>
+        </w:tc>
+        <w:tc>
+          <w:tcPr>
+            <w:tcW w:type="dxa" w:w="1512"/>
+            <w:shd w:fill="FFFFFF"/>
+            <w:tcMar>
+              <w:top w:w="35" w:type="dxa"/>
+              <w:bottom w:w="35" w:type="dxa"/>
+              <w:left w:w="45" w:type="dxa"/>
+              <w:right w:w="45" w:type="dxa"/>
+            </w:tcMar>
+          </w:tcPr>
+          <w:p>
+            <w:pPr>
+              <w:spacing w:after="0" w:line="252" w:lineRule="auto"/>
+            </w:pPr>
+            <w:r>
+              <w:rPr>
+                <w:sz w:val="14"/>
+              </w:rPr>
+              <w:t>Chủ tịch cty/HĐTV hoặc GĐ/TGĐ</w:t>
+            </w:r>
+          </w:p>
+        </w:tc>
+        <w:tc>
+          <w:tcPr>
+            <w:tcW w:type="dxa" w:w="1584"/>
+            <w:shd w:fill="FFFFFF"/>
+            <w:tcMar>
+              <w:top w:w="35" w:type="dxa"/>
+              <w:bottom w:w="35" w:type="dxa"/>
+              <w:left w:w="45" w:type="dxa"/>
+              <w:right w:w="45" w:type="dxa"/>
+            </w:tcMar>
+          </w:tcPr>
+          <w:p>
+            <w:pPr>
+              <w:spacing w:after="0" w:line="252" w:lineRule="auto"/>
+            </w:pPr>
+            <w:r>
+              <w:rPr>
+                <w:sz w:val="14"/>
+              </w:rPr>
+              <w:t>Có thể có 1 hoặc nhiều người</w:t>
+            </w:r>
+          </w:p>
+        </w:tc>
+        <w:tc>
+          <w:tcPr>
+            <w:tcW w:type="dxa" w:w="1656"/>
+            <w:shd w:fill="FFFFFF"/>
+            <w:tcMar>
+              <w:top w:w="35" w:type="dxa"/>
+              <w:bottom w:w="35" w:type="dxa"/>
+              <w:left w:w="45" w:type="dxa"/>
+              <w:right w:w="45" w:type="dxa"/>
+            </w:tcMar>
+          </w:tcPr>
+          <w:p>
+            <w:pPr>
+              <w:spacing w:after="0" w:line="252" w:lineRule="auto"/>
+            </w:pPr>
+            <w:r>
+              <w:rPr>
+                <w:sz w:val="14"/>
+              </w:rPr>
+              <w:t>Có thể có 1 hoặc nhiều người</w:t>
+            </w:r>
+          </w:p>
+        </w:tc>
+        <w:tc>
+          <w:tcPr>
+            <w:tcW w:type="dxa" w:w="1584"/>
+            <w:shd w:fill="FFFFFF"/>
+            <w:tcMar>
+              <w:top w:w="35" w:type="dxa"/>
+              <w:bottom w:w="35" w:type="dxa"/>
+              <w:left w:w="45" w:type="dxa"/>
+              <w:right w:w="45" w:type="dxa"/>
+            </w:tcMar>
+          </w:tcPr>
+          <w:p>
+            <w:pPr>
+              <w:spacing w:after="0" w:line="252" w:lineRule="auto"/>
+            </w:pPr>
+            <w:r>
+              <w:rPr>
+                <w:sz w:val="14"/>
+              </w:rPr>
+              <w:t>Chủ hộ kinh doanh</w:t>
+            </w:r>
+          </w:p>
+        </w:tc>
+      </w:tr>
+      <w:tr>
+        <w:tc>
+          <w:tcPr>
+            <w:tcW w:type="dxa" w:w="1440"/>
+            <w:shd w:fill="F8FAFC"/>
+            <w:tcMar>
+              <w:top w:w="35" w:type="dxa"/>
+              <w:bottom w:w="35" w:type="dxa"/>
+              <w:left w:w="45" w:type="dxa"/>
+              <w:right w:w="45" w:type="dxa"/>
+            </w:tcMar>
+          </w:tcPr>
+          <w:p>
+            <w:pPr>
+              <w:spacing w:after="0" w:line="252" w:lineRule="auto"/>
+            </w:pPr>
+            <w:r>
+              <w:rPr>
+                <w:b/>
+                <w:color w:val="1E293B"/>
+                <w:sz w:val="14"/>
+              </w:rPr>
+              <w:t>Quyền chuyển nhượng vốn</w:t>
+            </w:r>
+          </w:p>
+        </w:tc>
+        <w:tc>
+          <w:tcPr>
+            <w:tcW w:type="dxa" w:w="1512"/>
+            <w:shd w:fill="F8FAFC"/>
+            <w:tcMar>
+              <w:top w:w="35" w:type="dxa"/>
+              <w:bottom w:w="35" w:type="dxa"/>
+              <w:left w:w="45" w:type="dxa"/>
+              <w:right w:w="45" w:type="dxa"/>
+            </w:tcMar>
+          </w:tcPr>
+          <w:p>
+            <w:pPr>
+              <w:spacing w:after="0" w:line="252" w:lineRule="auto"/>
+            </w:pPr>
+            <w:r>
+              <w:rPr>
+                <w:sz w:val="14"/>
+              </w:rPr>
+              <w:t>Bán toàn bộ DN (chủ cũ vẫn chịu nợ cũ)</w:t>
+            </w:r>
+          </w:p>
+        </w:tc>
+        <w:tc>
+          <w:tcPr>
+            <w:tcW w:type="dxa" w:w="1656"/>
+            <w:shd w:fill="F8FAFC"/>
+            <w:tcMar>
+              <w:top w:w="35" w:type="dxa"/>
+              <w:bottom w:w="35" w:type="dxa"/>
+              <w:left w:w="45" w:type="dxa"/>
+              <w:right w:w="45" w:type="dxa"/>
+            </w:tcMar>
+          </w:tcPr>
+          <w:p>
+            <w:pPr>
+              <w:spacing w:after="0" w:line="252" w:lineRule="auto"/>
+            </w:pPr>
+            <w:r>
+              <w:rPr>
+                <w:sz w:val="14"/>
+              </w:rPr>
+              <w:t>TV hợp danh chuyển nhượng phải được HĐTV chấp thuận</w:t>
+            </w:r>
+          </w:p>
+        </w:tc>
+        <w:tc>
+          <w:tcPr>
+            <w:tcW w:type="dxa" w:w="1512"/>
+            <w:shd w:fill="F8FAFC"/>
+            <w:tcMar>
+              <w:top w:w="35" w:type="dxa"/>
+              <w:bottom w:w="35" w:type="dxa"/>
+              <w:left w:w="45" w:type="dxa"/>
+              <w:right w:w="45" w:type="dxa"/>
+            </w:tcMar>
+          </w:tcPr>
+          <w:p>
+            <w:pPr>
+              <w:spacing w:after="0" w:line="252" w:lineRule="auto"/>
+            </w:pPr>
+            <w:r>
+              <w:rPr>
+                <w:sz w:val="14"/>
+              </w:rPr>
+              <w:t>Chuyển nhượng 1 phần phải chuyển đổi loại hình</w:t>
+            </w:r>
+          </w:p>
+        </w:tc>
+        <w:tc>
+          <w:tcPr>
+            <w:tcW w:type="dxa" w:w="1584"/>
+            <w:shd w:fill="F8FAFC"/>
+            <w:tcMar>
+              <w:top w:w="35" w:type="dxa"/>
+              <w:bottom w:w="35" w:type="dxa"/>
+              <w:left w:w="45" w:type="dxa"/>
+              <w:right w:w="45" w:type="dxa"/>
+            </w:tcMar>
+          </w:tcPr>
+          <w:p>
+            <w:pPr>
+              <w:spacing w:after="0" w:line="252" w:lineRule="auto"/>
+            </w:pPr>
+            <w:r>
+              <w:rPr>
+                <w:sz w:val="14"/>
+              </w:rPr>
+              <w:t>Ưu tiên chào bán nội bộ theo tỷ lệ; sau 30 ngày bán ngoài</w:t>
+            </w:r>
+          </w:p>
+        </w:tc>
+        <w:tc>
+          <w:tcPr>
+            <w:tcW w:type="dxa" w:w="1656"/>
+            <w:shd w:fill="F8FAFC"/>
+            <w:tcMar>
+              <w:top w:w="35" w:type="dxa"/>
+              <w:bottom w:w="35" w:type="dxa"/>
+              <w:left w:w="45" w:type="dxa"/>
+              <w:right w:w="45" w:type="dxa"/>
+            </w:tcMar>
+          </w:tcPr>
+          <w:p>
+            <w:pPr>
+              <w:spacing w:after="0" w:line="252" w:lineRule="auto"/>
+            </w:pPr>
+            <w:r>
+              <w:rPr>
+                <w:sz w:val="14"/>
+              </w:rPr>
+              <w:t>Tự do chuyển nhượng (trừ CP biểu quyết, CĐSL trong 3 năm)</w:t>
+            </w:r>
+          </w:p>
+        </w:tc>
+        <w:tc>
+          <w:tcPr>
+            <w:tcW w:type="dxa" w:w="1584"/>
+            <w:shd w:fill="F8FAFC"/>
+            <w:tcMar>
+              <w:top w:w="35" w:type="dxa"/>
+              <w:bottom w:w="35" w:type="dxa"/>
+              <w:left w:w="45" w:type="dxa"/>
+              <w:right w:w="45" w:type="dxa"/>
+            </w:tcMar>
+          </w:tcPr>
+          <w:p>
+            <w:pPr>
+              <w:spacing w:after="0" w:line="252" w:lineRule="auto"/>
+            </w:pPr>
+            <w:r>
+              <w:rPr>
+                <w:sz w:val="14"/>
+              </w:rPr>
+              <w:t>Chuyển nhượng toàn bộ HKD cho người khác</w:t>
+            </w:r>
+          </w:p>
+        </w:tc>
+      </w:tr>
+    </w:tbl>
+    <w:p>
+      <w:pPr>
+        <w:spacing w:before="60" w:after="80"/>
+      </w:pPr>
+      <w:r>
+        <w:rPr>
+          <w:b/>
+          <w:color w:val="1E3A8A"/>
+          <w:sz w:val="15"/>
+        </w:rPr>
+        <w:t>📌 Điểm mới Doanh nghiệp nhà nước (Điều 88 LDN 2020): DNNN gồm 2 nhóm: (1) Nhà nước nắm giữ 100% vốn điều lệ; (2) Nhà nước nắm giữ TRÊN 50% vốn điều lệ hoặc TRÊN 50% tổng số cổ phần có quyền biểu quyết.</w:t>
+      </w:r>
+    </w:p>
+    <w:tbl>
+      <w:tblPr>
+        <w:tblW w:type="auto" w:w="0"/>
+        <w:jc w:val="center"/>
+        <w:tblLayout w:type="fixed"/>
+        <w:tblLook w:firstColumn="1" w:firstRow="1" w:lastColumn="0" w:lastRow="0" w:noHBand="0" w:noVBand="1" w:val="04A0"/>
+      </w:tblPr>
+      <w:tblGrid>
+        <w:gridCol w:w="11030"/>
+      </w:tblGrid>
+      <w:tr>
+        <w:tc>
+          <w:tcPr>
+            <w:tcW w:type="dxa" w:w="10944"/>
+            <w:shd w:fill="EFF6FF"/>
+            <w:tcMar>
+              <w:top w:w="40" w:type="dxa"/>
+              <w:bottom w:w="40" w:type="dxa"/>
+              <w:left w:w="60" w:type="dxa"/>
+              <w:right w:w="60" w:type="dxa"/>
+            </w:tcMar>
+          </w:tcPr>
+          <w:p>
+            <w:pPr>
+              <w:spacing w:after="0"/>
+            </w:pPr>
+            <w:r>
+              <w:rPr>
+                <w:b/>
+                <w:color w:val="1D4ED8"/>
+                <w:sz w:val="19"/>
+              </w:rPr>
+              <w:t>🏷️ CHUYÊN ĐỀ 2: QUY TẮC ĐẶT TÊN DOANH NGHIỆP &amp; CÁC ĐIỀU CẤM KỴ (ĐIỀU 37 - 41 LDN 2020)</w:t>
+            </w:r>
+          </w:p>
+        </w:tc>
+      </w:tr>
+    </w:tbl>
+    <w:tbl>
+      <w:tblPr>
+        <w:tblW w:type="auto" w:w="0"/>
+        <w:jc w:val="center"/>
+        <w:tblLayout w:type="fixed"/>
+        <w:tblLook w:firstColumn="1" w:firstRow="1" w:lastColumn="0" w:lastRow="0" w:noHBand="0" w:noVBand="1" w:val="04A0"/>
+      </w:tblPr>
+      <w:tblGrid>
+        <w:gridCol w:w="11030"/>
+      </w:tblGrid>
+      <w:tr>
+        <w:tc>
+          <w:tcPr>
+            <w:tcW w:type="dxa" w:w="10944"/>
+            <w:shd w:fill="EFF6FF"/>
+            <w:tcMar>
+              <w:top w:w="45" w:type="dxa"/>
+              <w:bottom w:w="45" w:type="dxa"/>
+              <w:left w:w="60" w:type="dxa"/>
+              <w:right w:w="60" w:type="dxa"/>
+            </w:tcMar>
+          </w:tcPr>
+          <w:p>
+            <w:pPr>
+              <w:spacing w:after="0" w:line="264" w:lineRule="auto"/>
+            </w:pPr>
+            <w:r>
+              <w:rPr>
+                <w:color w:val="0F172A"/>
+                <w:sz w:val="15"/>
+              </w:rPr>
+              <w:t>1. CÔNG THỨC TÊN TIẾNG VIỆT BẮT BUỘC (Điều 37): Tên tiếng Việt = [Loại hình doanh nghiệp] + [Tên riêng].</w:t>
+              <w:br/>
+              <w:t xml:space="preserve">   • Loại hình: Viết 'công ty trách nhiệm hữu hạn' (hoặc 'công ty TNHH'), 'công ty cổ phần' (hoặc 'công ty CP'), 'công ty hợp danh' (hoặc 'công ty HD'), 'doanh nghiệp tư nhân' (hoặc 'DNTN').</w:t>
+              <w:br/>
+              <w:t xml:space="preserve">   • Tên riêng: Gồm các chữ cái tiếng Việt, F, J, Z, W, chữ số và ký hiệu.</w:t>
+              <w:br/>
+              <w:t>2. TÊN TIẾNG NƯỚC NGOÀI &amp; TÊN VIẾT TẮT (Điều 39):</w:t>
+              <w:br/>
+              <w:t xml:space="preserve">   • Tên tiếng nước ngoài: Dịch từ tiếng Việt sang hệ chữ La-tinh. Tên riêng CÓ THỂ GIỮ NGUYÊN HOẶC DỊCH THEO NGHĨA. Khổ chữ nước ngoài phải NHỎ HƠN chữ tiếng Việt khi gắn tại trụ sở/chi nhánh.</w:t>
+              <w:br/>
+              <w:t xml:space="preserve">   • Tên viết tắt: Được rút gọn từ tên tiếng Việt hoặc tên tiếng nước ngoài.</w:t>
+              <w:br/>
+              <w:t>3. BA ĐIỀU CẤM KỴ TRONG ĐẶT TÊN DOANH NGHIỆP (Điều 38 - Cực hay hỏi trắc nghiệm!):</w:t>
+              <w:br/>
+              <w:t xml:space="preserve">   ❌ CẤM 1: Đặt tên trùng hoặc tên gây nhầm lẫn với tên của doanh nghiệp đã đăng ký trên phạm vi toàn quốc.</w:t>
+              <w:br/>
+              <w:t xml:space="preserve">   ❌ CẤM 2: Sử dụng tên cơ quan nhà nước, đơn vị LLVT, tổ chức chính trị - xã hội làm toàn bộ hoặc một phần tên riêng (trừ khi có sự chấp thuận của cơ quan đó).</w:t>
+              <w:br/>
+              <w:t xml:space="preserve">   ❌ CẤM 3: Sử dụng từ ngữ, ký hiệu vi phạm truyền thống lịch sử, văn hóa, đạo đức và thuần phong mỹ tục của dân tộc.</w:t>
+              <w:br/>
+              <w:t>4. PHÂN BIỆT TÊN TRÙNG VS TÊN GÂY NHẦM LẪN (Điều 41):</w:t>
+              <w:br/>
+              <w:t xml:space="preserve">   • Tên trùng: Tên viết hoàn toàn giống với tên của doanh nghiệp đã đăng ký trong Cơ sở dữ liệu quốc gia về ĐKDN.</w:t>
+              <w:br/>
+              <w:t xml:space="preserve">   • Tên gây nhầm lẫn: (1) Đọc giống tên DN đã đăng ký; (2) Tên viết tắt trùng với tên viết tắt của DN khác; (3) Tên chỉ khác tên DN đã đăng ký bởi từ 'tân', 'mới' hoặc các từ chỉ phương hướng 'Bắc', 'Nam', 'Trung', 'Tây', 'Đông'; (4) Chỉ khác nhau bởi từ 'Việt Nam' hoặc từ ngành nghề.</w:t>
+            </w:r>
+          </w:p>
+        </w:tc>
+      </w:tr>
+    </w:tbl>
+    <w:p>
+      <w:pPr>
+        <w:spacing w:after="40"/>
+      </w:pPr>
+    </w:p>
+    <w:tbl>
+      <w:tblPr>
+        <w:tblW w:type="auto" w:w="0"/>
+        <w:jc w:val="center"/>
+        <w:tblLayout w:type="fixed"/>
+        <w:tblLook w:firstColumn="1" w:firstRow="1" w:lastColumn="0" w:lastRow="0" w:noHBand="0" w:noVBand="1" w:val="04A0"/>
+      </w:tblPr>
+      <w:tblGrid>
+        <w:gridCol w:w="11030"/>
+      </w:tblGrid>
+      <w:tr>
+        <w:tc>
+          <w:tcPr>
+            <w:tcW w:type="dxa" w:w="10944"/>
+            <w:shd w:fill="EFF6FF"/>
+            <w:tcMar>
+              <w:top w:w="40" w:type="dxa"/>
+              <w:bottom w:w="40" w:type="dxa"/>
+              <w:left w:w="60" w:type="dxa"/>
+              <w:right w:w="60" w:type="dxa"/>
+            </w:tcMar>
+          </w:tcPr>
+          <w:p>
+            <w:pPr>
+              <w:spacing w:after="0"/>
+            </w:pPr>
+            <w:r>
+              <w:rPr>
+                <w:b/>
+                <w:color w:val="1D4ED8"/>
+                <w:sz w:val="19"/>
+              </w:rPr>
+              <w:t>💰 CHUYÊN ĐỀ 3: TÀI SẢN GÓP VỐN, ĐỊNH GIÁ &amp; ĐỐI TƯỢNG BỊ CẤM (ĐIỀU 17, 34, 35, 36 LDN 2020)</w:t>
+            </w:r>
+          </w:p>
+        </w:tc>
+      </w:tr>
+    </w:tbl>
+    <w:tbl>
+      <w:tblPr>
+        <w:tblW w:type="auto" w:w="0"/>
+        <w:jc w:val="center"/>
+        <w:tblLayout w:type="fixed"/>
+        <w:tblLook w:firstColumn="1" w:firstRow="1" w:lastColumn="0" w:lastRow="0" w:noHBand="0" w:noVBand="1" w:val="04A0"/>
+      </w:tblPr>
+      <w:tblGrid>
+        <w:gridCol w:w="5515"/>
+        <w:gridCol w:w="5515"/>
+      </w:tblGrid>
+      <w:tr>
+        <w:tc>
+          <w:tcPr>
+            <w:tcW w:type="dxa" w:w="5400"/>
+            <w:shd w:fill="F0FDF4"/>
+            <w:tcMar>
+              <w:top w:w="40" w:type="dxa"/>
+              <w:bottom w:w="40" w:type="dxa"/>
+              <w:left w:w="50" w:type="dxa"/>
+              <w:right w:w="50" w:type="dxa"/>
+            </w:tcMar>
+          </w:tcPr>
+          <w:p>
+            <w:pPr>
+              <w:spacing w:after="0" w:line="259" w:lineRule="auto"/>
+            </w:pPr>
+            <w:r>
+              <w:rPr>
+                <w:color w:val="14532D"/>
+                <w:sz w:val="14"/>
+              </w:rPr>
+              <w:t>💎 TÀI SẢN GÓP VỐN &amp; ĐỊNH GIÁ (Điều 34, 36):</w:t>
+              <w:br/>
+              <w:t>• Tài sản ĐƯỢC góp vốn: Đồng VN, ngoại tệ tự do chuyển đổi, vàng, quyền sử dụng đất, quyền SHTT, công nghệ, bí quyết kỹ thuật...</w:t>
+              <w:br/>
+              <w:t>• KHÔNG ĐƯỢC góp vốn: Sức lao động, uy tín cá nhân (không thể định giá).</w:t>
+              <w:br/>
+              <w:t>• Thẩm quyền định giá: Các thành viên/cổ đông sáng lập ĐỒNG THUẬN định giá HOẶC thuê Tổ chức thẩm định giá chuyên nghiệp.</w:t>
+              <w:br/>
+              <w:t>• Cơ quan nhà nước (Cơ quan ĐKKD, Thuế, UBND) TUYỆT ĐỐI KHÔNG định giá tài sản góp vốn cho doanh nghiệp!</w:t>
+              <w:br/>
+              <w:t>• Chuyển quyền sở hữu: Tài sản có đăng ký phải làm thủ tục sang tên (miễn lệ phí trước bạ). Tài sản ko đăng ký phải có biên bản giao nhận.</w:t>
+            </w:r>
+          </w:p>
+        </w:tc>
+        <w:tc>
+          <w:tcPr>
+            <w:tcW w:type="dxa" w:w="5544"/>
+            <w:shd w:fill="FFFBEB"/>
+            <w:tcMar>
+              <w:top w:w="40" w:type="dxa"/>
+              <w:bottom w:w="40" w:type="dxa"/>
+              <w:left w:w="50" w:type="dxa"/>
+              <w:right w:w="50" w:type="dxa"/>
+            </w:tcMar>
+          </w:tcPr>
+          <w:p>
+            <w:pPr>
+              <w:spacing w:after="0" w:line="259" w:lineRule="auto"/>
+            </w:pPr>
+            <w:r>
+              <w:rPr>
+                <w:color w:val="78350F"/>
+                <w:sz w:val="14"/>
+              </w:rPr>
+              <w:t>🚫 ĐỐI TƯỢNG BỊ CẤM THÀNH LẬP &amp; QUẢN LÝ DN (Điều 17):</w:t>
+              <w:br/>
+              <w:t>1. Cơ quan nhà nước, đơn vị LLVT dùng tài sản công lập DN thu lợi riêng.</w:t>
+              <w:br/>
+              <w:t>2. Cán bộ, công chức, viên chức theo Luật CBCC, Luật Viên chức.</w:t>
+              <w:br/>
+              <w:t>3. Sĩ quan, hạ sĩ quan, quân nhân chuyên nghiệp, công an nhân dân.</w:t>
+              <w:br/>
+              <w:t>4. Người chưa thành niên (dưới 18t); người bị hạn chế/mất NLHVDS.</w:t>
+              <w:br/>
+              <w:t>5. Người đang bị truy cứu TNHS, đang chấp hành án tù, bị Tòa cấm đảm nhiệm chức vụ, hành nghề.</w:t>
+              <w:br/>
+              <w:t>6. Người bị kết án về tội tham nhũng, chức vụ, kinh tế.</w:t>
+              <w:br/>
+              <w:t>✔️ ĐỐI TƯỢNG ĐƯỢC QUYỀN: Cá nhân/tổ chức nước ngoài cư trú hợp pháp; Công nhân viên ngoài quốc doanh; Người góp vốn thuần túy (mua cổ phần).</w:t>
+            </w:r>
+          </w:p>
+        </w:tc>
+      </w:tr>
+    </w:tbl>
+    <w:p>
+      <w:pPr>
+        <w:spacing w:after="40"/>
+      </w:pPr>
+    </w:p>
+    <w:tbl>
+      <w:tblPr>
+        <w:tblW w:type="auto" w:w="0"/>
+        <w:jc w:val="center"/>
+        <w:tblLayout w:type="fixed"/>
+        <w:tblLook w:firstColumn="1" w:firstRow="1" w:lastColumn="0" w:lastRow="0" w:noHBand="0" w:noVBand="1" w:val="04A0"/>
+      </w:tblPr>
+      <w:tblGrid>
+        <w:gridCol w:w="11030"/>
+      </w:tblGrid>
+      <w:tr>
+        <w:tc>
+          <w:tcPr>
+            <w:tcW w:type="dxa" w:w="10944"/>
+            <w:shd w:fill="EFF6FF"/>
+            <w:tcMar>
+              <w:top w:w="40" w:type="dxa"/>
+              <w:bottom w:w="40" w:type="dxa"/>
+              <w:left w:w="60" w:type="dxa"/>
+              <w:right w:w="60" w:type="dxa"/>
+            </w:tcMar>
+          </w:tcPr>
+          <w:p>
+            <w:pPr>
+              <w:spacing w:after="0"/>
+            </w:pPr>
+            <w:r>
+              <w:rPr>
+                <w:b/>
+                <w:color w:val="1D4ED8"/>
+                <w:sz w:val="19"/>
+              </w:rPr>
+              <w:t>⚠️ CHUYÊN ĐỀ 4: CÁC TRƯỜNG HỢP ĐẶC BIỆT, NGOẠI LỆ &amp; BẪY TRẮC NGHIỆM KINH ĐIỂN</w:t>
+            </w:r>
+          </w:p>
+        </w:tc>
+      </w:tr>
+    </w:tbl>
+    <w:tbl>
+      <w:tblPr>
+        <w:tblW w:type="auto" w:w="0"/>
+        <w:jc w:val="center"/>
+        <w:tblLayout w:type="fixed"/>
+        <w:tblLook w:firstColumn="1" w:firstRow="1" w:lastColumn="0" w:lastRow="0" w:noHBand="0" w:noVBand="1" w:val="04A0"/>
+      </w:tblPr>
+      <w:tblGrid>
+        <w:gridCol w:w="11030"/>
+      </w:tblGrid>
+      <w:tr>
+        <w:tc>
+          <w:tcPr>
+            <w:tcW w:type="dxa" w:w="10944"/>
+            <w:shd w:fill="FAF5FF"/>
+            <w:tcMar>
+              <w:top w:w="45" w:type="dxa"/>
+              <w:bottom w:w="45" w:type="dxa"/>
+              <w:left w:w="60" w:type="dxa"/>
+              <w:right w:w="60" w:type="dxa"/>
+            </w:tcMar>
+          </w:tcPr>
+          <w:p>
+            <w:pPr>
+              <w:spacing w:after="0" w:line="264" w:lineRule="auto"/>
+            </w:pPr>
+            <w:r>
+              <w:rPr>
+                <w:color w:val="581C87"/>
+                <w:sz w:val="15"/>
+              </w:rPr>
+              <w:t>1. DOANH NGHIỆP TƯ NHÂN (DNTN):</w:t>
+              <w:br/>
+              <w:t xml:space="preserve">   • Kiêm nhiệm: CẤM làm chủ HKD, CẤM làm TV hợp danh, CẤM lập DNTN khác. Nhưng ĐƯỢC làm TV góp vốn CTHD hoặc cổ đông CTCP (vì chỉ chịu TN hữu hạn).</w:t>
+              <w:br/>
+              <w:t xml:space="preserve">   • Bán DNTN: Sau khi bán, chủ cũ VẪN PHẢI chịu trách nhiệm về các khoản nợ phát sinh trước ngày chuyển giao (trừ khi có thỏa thuận khác giữa chủ nợ, người mua, người bán).</w:t>
+              <w:br/>
+              <w:t xml:space="preserve">   • Cho thuê DNTN: Chủ DNTN VẪN PHẢI chịu trách nhiệm pháp lý với tư cách chủ sở hữu trong suốt thời gian cho thuê.</w:t>
+              <w:br/>
+              <w:t>2. CÔNG TY HỢP DANH (CTHD):</w:t>
+              <w:br/>
+              <w:t xml:space="preserve">   • TV hợp danh rút vốn: Dù đã chấm dứt tư cách, người rút vốn VẪN PHẢI LIÊN ĐỚI CHỊU TRÁCH NHIỆM BẰNG TOÀN BỘ TÀI SẢN đối với các khoản nợ phát sinh trước ngày chấm dứt trong thời hạn 02 năm!</w:t>
+              <w:br/>
+              <w:t xml:space="preserve">   • TV hợp danh chết: Người thừa kế chỉ được làm TV hợp danh nếu được HĐTV chấp thuận. Nếu không chấp thuận thì công ty thanh toán lại tiền phần vốn góp.</w:t>
+              <w:br/>
+              <w:t xml:space="preserve">   • Khai trừ TV hợp danh: Không góp đủ vốn khi có yêu cầu lần 2; không trung thực; cạnh tranh trái phép.</w:t>
+              <w:br/>
+              <w:t>3. CÔNG TY TNHH HAI THÀNH VIÊN TRỞ LÊN:</w:t>
+              <w:br/>
+              <w:t xml:space="preserve">   • Chuyển nhượng vốn (Quy tắc Ưu tiên nội bộ): Phải chào bán cho các thành viên còn lại theo tỷ lệ vốn hiện có. Sau 30 ngày họ không mua hoặc mua không hết mới được bán cho người ngoài cùng điều kiện.</w:t>
+              <w:br/>
+              <w:t xml:space="preserve">   • Thành viên chết: Người thừa kế đương nhiên trở thành thành viên (khác công ty hợp danh!). Nếu không muốn làm thành viên thì cty mua lại hoặc chuyển nhượng.</w:t>
+              <w:br/>
+              <w:t xml:space="preserve">   • Tặng cho phần vốn góp: Tặng cho người thuộc hàng thừa kế -&gt; Đương nhiên là thành viên. Tặng cho người khác -&gt; Phải được HĐTV chấp thuận mới được làm thành viên.</w:t>
+              <w:br/>
+              <w:t>4. CÔNG TY CỔ PHẦN (CTCP):</w:t>
+              <w:br/>
+              <w:t xml:space="preserve">   • Cổ đông sáng lập (CĐSL) trong 03 năm đầu: Phải cùng nhau mua ít nhất 20% CP phổ thông chào bán khi thành lập; TỰ DO chuyển nhượng cho CĐSL khác; Chuyển nhượng cho người ngoài phải được ĐHĐCĐ chấp thuận (cổ đông chuyển nhượng không được biểu quyết). Sau 3 năm tự do chuyển nhượng như mọi cổ đông.</w:t>
+              <w:br/>
+              <w:t xml:space="preserve">   • Cổ phần ưu đãi biểu quyết: Chỉ CĐSL và tổ chức CQNN được ủy quyền nắm giữ. Hiệu lực 03 năm, CẤM CHUYỂN NHƯỢNG. Sau 3 năm tự động chuyển thành CP phổ thông.</w:t>
+              <w:br/>
+              <w:t xml:space="preserve">   • Cổ phần ưu đãi cổ tức &amp; hoàn lại (Mẹo 'Được tiền thì mất quyền'): CẤM biểu quyết, CẤM dự họp ĐHĐCĐ, CẤM đề cử người vào HĐQT/BKS.</w:t>
+              <w:br/>
+              <w:t>5. NGƯỜI ĐẠI DIỆN THEO PHÁP LUẬT (Điều 12):</w:t>
+              <w:br/>
+              <w:t xml:space="preserve">   • TNHH và Cổ phần có thể có 1 HOẶC NHIỀU người ĐDTPL. Phải luôn có ÍT NHẤT 01 người thường trú/cư trú tại Việt Nam.</w:t>
+              <w:br/>
+              <w:t xml:space="preserve">   • Khi người ĐDTPL duy nhất xuất cảnh khỏi Việt Nam quá 30 ngày thì PHẢI ỦY QUYỀN BẰNG VĂN BẢN cho người khác thực hiện quyền và nghĩa vụ.</w:t>
+            </w:r>
+          </w:p>
+        </w:tc>
+      </w:tr>
+    </w:tbl>
+    <w:p>
+      <w:pPr>
+        <w:spacing w:after="40"/>
+      </w:pPr>
+    </w:p>
+    <w:tbl>
+      <w:tblPr>
+        <w:tblW w:type="auto" w:w="0"/>
+        <w:jc w:val="center"/>
+        <w:tblLayout w:type="fixed"/>
+        <w:tblLook w:firstColumn="1" w:firstRow="1" w:lastColumn="0" w:lastRow="0" w:noHBand="0" w:noVBand="1" w:val="04A0"/>
+      </w:tblPr>
+      <w:tblGrid>
+        <w:gridCol w:w="11030"/>
+      </w:tblGrid>
+      <w:tr>
+        <w:tc>
+          <w:tcPr>
+            <w:tcW w:type="dxa" w:w="10944"/>
+            <w:shd w:fill="EFF6FF"/>
+            <w:tcMar>
+              <w:top w:w="40" w:type="dxa"/>
+              <w:bottom w:w="40" w:type="dxa"/>
+              <w:left w:w="60" w:type="dxa"/>
+              <w:right w:w="60" w:type="dxa"/>
+            </w:tcMar>
+          </w:tcPr>
+          <w:p>
+            <w:pPr>
+              <w:spacing w:after="0"/>
+            </w:pPr>
+            <w:r>
+              <w:rPr>
+                <w:b/>
+                <w:color w:val="1D4ED8"/>
+                <w:sz w:val="19"/>
+              </w:rPr>
+              <w:t>⏰ CHUYÊN ĐỀ 5: BẢNG CON SỐ &amp; THỜI HẠN VÀNG + TỶ LỆ HỌP VÀ THÔNG QUA NGHỊ QUYẾT</w:t>
+            </w:r>
+          </w:p>
+        </w:tc>
+      </w:tr>
+    </w:tbl>
+    <w:tbl>
+      <w:tblPr>
+        <w:tblW w:type="auto" w:w="0"/>
+        <w:jc w:val="center"/>
+        <w:tblLayout w:type="fixed"/>
+        <w:tblLook w:firstColumn="1" w:firstRow="1" w:lastColumn="0" w:lastRow="0" w:noHBand="0" w:noVBand="1" w:val="04A0"/>
+      </w:tblPr>
+      <w:tblGrid>
+        <w:gridCol w:w="2757"/>
+        <w:gridCol w:w="2757"/>
+        <w:gridCol w:w="2757"/>
+        <w:gridCol w:w="2757"/>
+      </w:tblGrid>
+      <w:tr>
+        <w:tc>
+          <w:tcPr>
+            <w:tcW w:type="dxa" w:w="1728"/>
+            <w:shd w:fill="EFF6FF"/>
+            <w:tcMar>
+              <w:top w:w="30" w:type="dxa"/>
+              <w:bottom w:w="30" w:type="dxa"/>
+              <w:left w:w="45" w:type="dxa"/>
+              <w:right w:w="45" w:type="dxa"/>
+            </w:tcMar>
+          </w:tcPr>
+          <w:p>
+            <w:pPr>
+              <w:spacing w:after="0"/>
+            </w:pPr>
+            <w:r>
+              <w:rPr>
+                <w:b/>
+                <w:color w:val="1D4ED8"/>
+                <w:sz w:val="15"/>
+              </w:rPr>
+              <w:t>03 ngày làm việc</w:t>
+            </w:r>
+          </w:p>
+        </w:tc>
+        <w:tc>
+          <w:tcPr>
+            <w:tcW w:type="dxa" w:w="3744"/>
+            <w:shd w:fill="EFF6FF"/>
+            <w:tcMar>
+              <w:top w:w="30" w:type="dxa"/>
+              <w:bottom w:w="30" w:type="dxa"/>
+              <w:left w:w="45" w:type="dxa"/>
+              <w:right w:w="45" w:type="dxa"/>
+            </w:tcMar>
+          </w:tcPr>
+          <w:p>
+            <w:pPr>
+              <w:spacing w:after="0"/>
+            </w:pPr>
+            <w:r>
+              <w:rPr>
+                <w:sz w:val="15"/>
+              </w:rPr>
+              <w:t>Thời hạn cấp GCN ĐKDN; Thông báo tạm ngừng kinh doanh; Thông báo thay đổi ĐDTPL.</w:t>
+            </w:r>
+          </w:p>
+        </w:tc>
+        <w:tc>
+          <w:tcPr>
+            <w:tcW w:type="dxa" w:w="1728"/>
+            <w:shd w:fill="EFF6FF"/>
+            <w:tcMar>
+              <w:top w:w="30" w:type="dxa"/>
+              <w:bottom w:w="30" w:type="dxa"/>
+              <w:left w:w="45" w:type="dxa"/>
+              <w:right w:w="45" w:type="dxa"/>
+            </w:tcMar>
+          </w:tcPr>
+          <w:p>
+            <w:pPr>
+              <w:spacing w:after="0"/>
+            </w:pPr>
+            <w:r>
+              <w:rPr>
+                <w:b/>
+                <w:color w:val="1D4ED8"/>
+                <w:sz w:val="15"/>
+              </w:rPr>
+              <w:t>90 ngày</w:t>
+            </w:r>
+          </w:p>
+        </w:tc>
+        <w:tc>
+          <w:tcPr>
+            <w:tcW w:type="dxa" w:w="3744"/>
+            <w:shd w:fill="EFF6FF"/>
+            <w:tcMar>
+              <w:top w:w="30" w:type="dxa"/>
+              <w:bottom w:w="30" w:type="dxa"/>
+              <w:left w:w="45" w:type="dxa"/>
+              <w:right w:w="45" w:type="dxa"/>
+            </w:tcMar>
+          </w:tcPr>
+          <w:p>
+            <w:pPr>
+              <w:spacing w:after="0"/>
+            </w:pPr>
+            <w:r>
+              <w:rPr>
+                <w:sz w:val="15"/>
+              </w:rPr>
+              <w:t>Thời hạn góp đủ vốn điều lệ kể từ ngày cấp GCN ĐKDN (áp dụng cho cả TNHH và Cổ phần).</w:t>
+            </w:r>
+          </w:p>
+        </w:tc>
+      </w:tr>
+      <w:tr>
+        <w:tc>
+          <w:tcPr>
+            <w:tcW w:type="dxa" w:w="1728"/>
+            <w:shd w:fill="FFFFFF"/>
+            <w:tcMar>
+              <w:top w:w="30" w:type="dxa"/>
+              <w:bottom w:w="30" w:type="dxa"/>
+              <w:left w:w="45" w:type="dxa"/>
+              <w:right w:w="45" w:type="dxa"/>
+            </w:tcMar>
+          </w:tcPr>
+          <w:p>
+            <w:pPr>
+              <w:spacing w:after="0"/>
+            </w:pPr>
+            <w:r>
+              <w:rPr>
+                <w:b/>
+                <w:color w:val="1D4ED8"/>
+                <w:sz w:val="15"/>
+              </w:rPr>
+              <w:t>30 ngày</w:t>
+            </w:r>
+          </w:p>
+        </w:tc>
+        <w:tc>
+          <w:tcPr>
+            <w:tcW w:type="dxa" w:w="3744"/>
+            <w:shd w:fill="FFFFFF"/>
+            <w:tcMar>
+              <w:top w:w="30" w:type="dxa"/>
+              <w:bottom w:w="30" w:type="dxa"/>
+              <w:left w:w="45" w:type="dxa"/>
+              <w:right w:w="45" w:type="dxa"/>
+            </w:tcMar>
+          </w:tcPr>
+          <w:p>
+            <w:pPr>
+              <w:spacing w:after="0"/>
+            </w:pPr>
+            <w:r>
+              <w:rPr>
+                <w:sz w:val="15"/>
+              </w:rPr>
+              <w:t>Đăng ký giảm vốn điều lệ khi thành viên/cổ đông chưa góp đủ vốn sau 90 ngày; Triệu tập họp ĐHĐCĐ lần 2.</w:t>
+            </w:r>
+          </w:p>
+        </w:tc>
+        <w:tc>
+          <w:tcPr>
+            <w:tcW w:type="dxa" w:w="1728"/>
+            <w:shd w:fill="FFFFFF"/>
+            <w:tcMar>
+              <w:top w:w="30" w:type="dxa"/>
+              <w:bottom w:w="30" w:type="dxa"/>
+              <w:left w:w="45" w:type="dxa"/>
+              <w:right w:w="45" w:type="dxa"/>
+            </w:tcMar>
+          </w:tcPr>
+          <w:p>
+            <w:pPr>
+              <w:spacing w:after="0"/>
+            </w:pPr>
+            <w:r>
+              <w:rPr>
+                <w:b/>
+                <w:color w:val="1D4ED8"/>
+                <w:sz w:val="15"/>
+              </w:rPr>
+              <w:t>03 năm</w:t>
+            </w:r>
+          </w:p>
+        </w:tc>
+        <w:tc>
+          <w:tcPr>
+            <w:tcW w:type="dxa" w:w="3744"/>
+            <w:shd w:fill="FFFFFF"/>
+            <w:tcMar>
+              <w:top w:w="30" w:type="dxa"/>
+              <w:bottom w:w="30" w:type="dxa"/>
+              <w:left w:w="45" w:type="dxa"/>
+              <w:right w:w="45" w:type="dxa"/>
+            </w:tcMar>
+          </w:tcPr>
+          <w:p>
+            <w:pPr>
+              <w:spacing w:after="0"/>
+            </w:pPr>
+            <w:r>
+              <w:rPr>
+                <w:sz w:val="15"/>
+              </w:rPr>
+              <w:t>Thời hạn cổ phần ưu đãi biểu quyết của CĐSL có hiệu lực; CĐSL tự do chuyển nhượng CP cho CĐSL khác.</w:t>
+            </w:r>
+          </w:p>
+        </w:tc>
+      </w:tr>
+      <w:tr>
+        <w:tc>
+          <w:tcPr>
+            <w:tcW w:type="dxa" w:w="1728"/>
+            <w:shd w:fill="EFF6FF"/>
+            <w:tcMar>
+              <w:top w:w="30" w:type="dxa"/>
+              <w:bottom w:w="30" w:type="dxa"/>
+              <w:left w:w="45" w:type="dxa"/>
+              <w:right w:w="45" w:type="dxa"/>
+            </w:tcMar>
+          </w:tcPr>
+          <w:p>
+            <w:pPr>
+              <w:spacing w:after="0"/>
+            </w:pPr>
+            <w:r>
+              <w:rPr>
+                <w:b/>
+                <w:color w:val="1D4ED8"/>
+                <w:sz w:val="15"/>
+              </w:rPr>
+              <w:t>03 tháng</w:t>
+            </w:r>
+          </w:p>
+        </w:tc>
+        <w:tc>
+          <w:tcPr>
+            <w:tcW w:type="dxa" w:w="3744"/>
+            <w:shd w:fill="EFF6FF"/>
+            <w:tcMar>
+              <w:top w:w="30" w:type="dxa"/>
+              <w:bottom w:w="30" w:type="dxa"/>
+              <w:left w:w="45" w:type="dxa"/>
+              <w:right w:w="45" w:type="dxa"/>
+            </w:tcMar>
+          </w:tcPr>
+          <w:p>
+            <w:pPr>
+              <w:spacing w:after="0"/>
+            </w:pPr>
+            <w:r>
+              <w:rPr>
+                <w:sz w:val="15"/>
+              </w:rPr>
+              <w:t>Doanh nghiệp mất khả năng thanh toán khi nợ quá hạn 03 tháng kể từ ngày đến hạn thanh toán.</w:t>
+            </w:r>
+          </w:p>
+        </w:tc>
+        <w:tc>
+          <w:tcPr>
+            <w:tcW w:type="dxa" w:w="1728"/>
+            <w:shd w:fill="EFF6FF"/>
+            <w:tcMar>
+              <w:top w:w="30" w:type="dxa"/>
+              <w:bottom w:w="30" w:type="dxa"/>
+              <w:left w:w="45" w:type="dxa"/>
+              <w:right w:w="45" w:type="dxa"/>
+            </w:tcMar>
+          </w:tcPr>
+          <w:p>
+            <w:pPr>
+              <w:spacing w:after="0"/>
+            </w:pPr>
+            <w:r>
+              <w:rPr>
+                <w:b/>
+                <w:color w:val="1D4ED8"/>
+                <w:sz w:val="15"/>
+              </w:rPr>
+              <w:t>02 năm</w:t>
+            </w:r>
+          </w:p>
+        </w:tc>
+        <w:tc>
+          <w:tcPr>
+            <w:tcW w:type="dxa" w:w="3744"/>
+            <w:shd w:fill="EFF6FF"/>
+            <w:tcMar>
+              <w:top w:w="30" w:type="dxa"/>
+              <w:bottom w:w="30" w:type="dxa"/>
+              <w:left w:w="45" w:type="dxa"/>
+              <w:right w:w="45" w:type="dxa"/>
+            </w:tcMar>
+          </w:tcPr>
+          <w:p>
+            <w:pPr>
+              <w:spacing w:after="0"/>
+            </w:pPr>
+            <w:r>
+              <w:rPr>
+                <w:sz w:val="15"/>
+              </w:rPr>
+              <w:t>Thời hiệu khởi kiện tranh chấp thương mại chung theo Luật Thương mại 2005.</w:t>
+            </w:r>
+          </w:p>
+        </w:tc>
+      </w:tr>
+      <w:tr>
+        <w:tc>
+          <w:tcPr>
+            <w:tcW w:type="dxa" w:w="1728"/>
+            <w:shd w:fill="FFFFFF"/>
+            <w:tcMar>
+              <w:top w:w="30" w:type="dxa"/>
+              <w:bottom w:w="30" w:type="dxa"/>
+              <w:left w:w="45" w:type="dxa"/>
+              <w:right w:w="45" w:type="dxa"/>
+            </w:tcMar>
+          </w:tcPr>
+          <w:p>
+            <w:pPr>
+              <w:spacing w:after="0"/>
+            </w:pPr>
+            <w:r>
+              <w:rPr>
+                <w:b/>
+                <w:color w:val="1D4ED8"/>
+                <w:sz w:val="15"/>
+              </w:rPr>
+              <w:t>01 năm / 06 tháng</w:t>
+            </w:r>
+          </w:p>
+        </w:tc>
+        <w:tc>
+          <w:tcPr>
+            <w:tcW w:type="dxa" w:w="3744"/>
+            <w:shd w:fill="FFFFFF"/>
+            <w:tcMar>
+              <w:top w:w="30" w:type="dxa"/>
+              <w:bottom w:w="30" w:type="dxa"/>
+              <w:left w:w="45" w:type="dxa"/>
+              <w:right w:w="45" w:type="dxa"/>
+            </w:tcMar>
+          </w:tcPr>
+          <w:p>
+            <w:pPr>
+              <w:spacing w:after="0"/>
+            </w:pPr>
+            <w:r>
+              <w:rPr>
+                <w:sz w:val="15"/>
+              </w:rPr>
+              <w:t>Thu hồi GCN ĐKDN khi ngừng hoạt động 01 năm hoặc không báo cáo sau 06 tháng.</w:t>
+            </w:r>
+          </w:p>
+        </w:tc>
+        <w:tc>
+          <w:tcPr>
+            <w:tcW w:type="dxa" w:w="1728"/>
+            <w:shd w:fill="FFFFFF"/>
+            <w:tcMar>
+              <w:top w:w="30" w:type="dxa"/>
+              <w:bottom w:w="30" w:type="dxa"/>
+              <w:left w:w="45" w:type="dxa"/>
+              <w:right w:w="45" w:type="dxa"/>
+            </w:tcMar>
+          </w:tcPr>
+          <w:p>
+            <w:pPr>
+              <w:spacing w:after="0"/>
+            </w:pPr>
+            <w:r>
+              <w:rPr>
+                <w:b/>
+                <w:color w:val="1D4ED8"/>
+                <w:sz w:val="15"/>
+              </w:rPr>
+              <w:t>05 năm</w:t>
+            </w:r>
+          </w:p>
+        </w:tc>
+        <w:tc>
+          <w:tcPr>
+            <w:tcW w:type="dxa" w:w="3744"/>
+            <w:shd w:fill="FFFFFF"/>
+            <w:tcMar>
+              <w:top w:w="30" w:type="dxa"/>
+              <w:bottom w:w="30" w:type="dxa"/>
+              <w:left w:w="45" w:type="dxa"/>
+              <w:right w:w="45" w:type="dxa"/>
+            </w:tcMar>
+          </w:tcPr>
+          <w:p>
+            <w:pPr>
+              <w:spacing w:after="0"/>
+            </w:pPr>
+            <w:r>
+              <w:rPr>
+                <w:sz w:val="15"/>
+              </w:rPr>
+              <w:t>Nhiệm kỳ tối đa của thành viên Hội đồng quản trị và Ban kiểm soát công ty cổ phần.</w:t>
+            </w:r>
+          </w:p>
+        </w:tc>
+      </w:tr>
+      <w:tr>
+        <w:tc>
+          <w:tcPr>
+            <w:tcW w:type="dxa" w:w="1728"/>
+            <w:shd w:fill="EFF6FF"/>
+            <w:tcMar>
+              <w:top w:w="30" w:type="dxa"/>
+              <w:bottom w:w="30" w:type="dxa"/>
+              <w:left w:w="45" w:type="dxa"/>
+              <w:right w:w="45" w:type="dxa"/>
+            </w:tcMar>
+          </w:tcPr>
+          <w:p>
+            <w:pPr>
+              <w:spacing w:after="0"/>
+            </w:pPr>
+            <w:r>
+              <w:rPr>
+                <w:b/>
+                <w:color w:val="1D4ED8"/>
+                <w:sz w:val="15"/>
+              </w:rPr>
+              <w:t>03 - 11 thành viên</w:t>
+            </w:r>
+          </w:p>
+        </w:tc>
+        <w:tc>
+          <w:tcPr>
+            <w:tcW w:type="dxa" w:w="3744"/>
+            <w:shd w:fill="EFF6FF"/>
+            <w:tcMar>
+              <w:top w:w="30" w:type="dxa"/>
+              <w:bottom w:w="30" w:type="dxa"/>
+              <w:left w:w="45" w:type="dxa"/>
+              <w:right w:w="45" w:type="dxa"/>
+            </w:tcMar>
+          </w:tcPr>
+          <w:p>
+            <w:pPr>
+              <w:spacing w:after="0"/>
+            </w:pPr>
+            <w:r>
+              <w:rPr>
+                <w:sz w:val="15"/>
+              </w:rPr>
+              <w:t>Số lượng thành viên Hội đồng quản trị công ty cổ phần (Họp định kỳ ít nhất 01 lần/quý).</w:t>
+            </w:r>
+          </w:p>
+        </w:tc>
+        <w:tc>
+          <w:tcPr>
+            <w:tcW w:type="dxa" w:w="1728"/>
+            <w:shd w:fill="EFF6FF"/>
+            <w:tcMar>
+              <w:top w:w="30" w:type="dxa"/>
+              <w:bottom w:w="30" w:type="dxa"/>
+              <w:left w:w="45" w:type="dxa"/>
+              <w:right w:w="45" w:type="dxa"/>
+            </w:tcMar>
+          </w:tcPr>
+          <w:p>
+            <w:pPr>
+              <w:spacing w:after="0"/>
+            </w:pPr>
+            <w:r>
+              <w:rPr>
+                <w:b/>
+                <w:color w:val="1D4ED8"/>
+                <w:sz w:val="15"/>
+              </w:rPr>
+              <w:t>11 thành viên</w:t>
+            </w:r>
+          </w:p>
+        </w:tc>
+        <w:tc>
+          <w:tcPr>
+            <w:tcW w:type="dxa" w:w="3744"/>
+            <w:shd w:fill="EFF6FF"/>
+            <w:tcMar>
+              <w:top w:w="30" w:type="dxa"/>
+              <w:bottom w:w="30" w:type="dxa"/>
+              <w:left w:w="45" w:type="dxa"/>
+              <w:right w:w="45" w:type="dxa"/>
+            </w:tcMar>
+          </w:tcPr>
+          <w:p>
+            <w:pPr>
+              <w:spacing w:after="0"/>
+            </w:pPr>
+            <w:r>
+              <w:rPr>
+                <w:sz w:val="15"/>
+              </w:rPr>
+              <w:t>Công ty TNHH 2+ TV có từ 11 thành viên trở lên bắt buộc phải lập Ban kiểm soát.</w:t>
+            </w:r>
+          </w:p>
+        </w:tc>
+      </w:tr>
+      <w:tr>
+        <w:tc>
+          <w:tcPr>
+            <w:tcW w:type="dxa" w:w="1728"/>
+            <w:shd w:fill="FFFFFF"/>
+            <w:tcMar>
+              <w:top w:w="30" w:type="dxa"/>
+              <w:bottom w:w="30" w:type="dxa"/>
+              <w:left w:w="45" w:type="dxa"/>
+              <w:right w:w="45" w:type="dxa"/>
+            </w:tcMar>
+          </w:tcPr>
+          <w:p>
+            <w:pPr>
+              <w:spacing w:after="0"/>
+            </w:pPr>
+            <w:r>
+              <w:rPr>
+                <w:b/>
+                <w:color w:val="1D4ED8"/>
+                <w:sz w:val="15"/>
+              </w:rPr>
+              <w:t>Từ 5% cổ phần</w:t>
+            </w:r>
+          </w:p>
+        </w:tc>
+        <w:tc>
+          <w:tcPr>
+            <w:tcW w:type="dxa" w:w="3744"/>
+            <w:shd w:fill="FFFFFF"/>
+            <w:tcMar>
+              <w:top w:w="30" w:type="dxa"/>
+              <w:bottom w:w="30" w:type="dxa"/>
+              <w:left w:w="45" w:type="dxa"/>
+              <w:right w:w="45" w:type="dxa"/>
+            </w:tcMar>
+          </w:tcPr>
+          <w:p>
+            <w:pPr>
+              <w:spacing w:after="0"/>
+            </w:pPr>
+            <w:r>
+              <w:rPr>
+                <w:sz w:val="15"/>
+              </w:rPr>
+              <w:t>Cổ đông (hoặc nhóm cổ đông) sở hữu từ 5% CP phổ thông trở lên có quyền triệu tập ĐHĐCĐ.</w:t>
+            </w:r>
+          </w:p>
+        </w:tc>
+        <w:tc>
+          <w:tcPr>
+            <w:tcW w:type="dxa" w:w="1728"/>
+            <w:shd w:fill="FFFFFF"/>
+            <w:tcMar>
+              <w:top w:w="30" w:type="dxa"/>
+              <w:bottom w:w="30" w:type="dxa"/>
+              <w:left w:w="45" w:type="dxa"/>
+              <w:right w:w="45" w:type="dxa"/>
+            </w:tcMar>
+          </w:tcPr>
+          <w:p>
+            <w:pPr>
+              <w:spacing w:after="0"/>
+            </w:pPr>
+            <w:r>
+              <w:rPr>
+                <w:b/>
+                <w:color w:val="1D4ED8"/>
+                <w:sz w:val="15"/>
+              </w:rPr>
+              <w:t>Ít nhất 20%</w:t>
+            </w:r>
+          </w:p>
+        </w:tc>
+        <w:tc>
+          <w:tcPr>
+            <w:tcW w:type="dxa" w:w="3744"/>
+            <w:shd w:fill="FFFFFF"/>
+            <w:tcMar>
+              <w:top w:w="30" w:type="dxa"/>
+              <w:bottom w:w="30" w:type="dxa"/>
+              <w:left w:w="45" w:type="dxa"/>
+              <w:right w:w="45" w:type="dxa"/>
+            </w:tcMar>
+          </w:tcPr>
+          <w:p>
+            <w:pPr>
+              <w:spacing w:after="0"/>
+            </w:pPr>
+            <w:r>
+              <w:rPr>
+                <w:sz w:val="15"/>
+              </w:rPr>
+              <w:t>Tỷ lệ cổ phần phổ thông tối thiểu các CĐSL phải cùng nhau đăng ký mua khi thành lập CTCP.</w:t>
+            </w:r>
+          </w:p>
+        </w:tc>
+      </w:tr>
+    </w:tbl>
+    <w:p>
+      <w:pPr>
+        <w:spacing w:after="20"/>
+      </w:pPr>
+    </w:p>
+    <w:tbl>
+      <w:tblPr>
+        <w:tblW w:type="auto" w:w="0"/>
+        <w:jc w:val="center"/>
+        <w:tblLayout w:type="fixed"/>
+        <w:tblLook w:firstColumn="1" w:firstRow="1" w:lastColumn="0" w:lastRow="0" w:noHBand="0" w:noVBand="1" w:val="04A0"/>
+      </w:tblPr>
+      <w:tblGrid>
+        <w:gridCol w:w="3677"/>
+        <w:gridCol w:w="3677"/>
+        <w:gridCol w:w="3677"/>
+      </w:tblGrid>
+      <w:tr>
+        <w:tc>
+          <w:tcPr>
+            <w:tcW w:type="dxa" w:w="2592"/>
             <w:shd w:fill="1E3A8A"/>
             <w:tcMar>
-              <w:top w:w="50" w:type="dxa"/>
-              <w:bottom w:w="50" w:type="dxa"/>
-              <w:left w:w="60" w:type="dxa"/>
-              <w:right w:w="60" w:type="dxa"/>
+              <w:top w:w="40" w:type="dxa"/>
+              <w:bottom w:w="40" w:type="dxa"/>
+              <w:left w:w="50" w:type="dxa"/>
+              <w:right w:w="50" w:type="dxa"/>
             </w:tcMar>
           </w:tcPr>
           <w:p>
@@ -1518,9 +2466,9 @@
               <w:rPr>
                 <w:b/>
                 <w:color w:val="FFFFFF"/>
-                <w:sz w:val="16"/>
+                <w:sz w:val="15"/>
               </w:rPr>
-              <w:t>Công ty Cổ phần (Đại hội đồng cổ đông)</w:t>
+              <w:t>Nội dung / Cơ quan</w:t>
             </w:r>
           </w:p>
         </w:tc>
@@ -1529,10 +2477,10 @@
             <w:tcW w:type="dxa" w:w="4176"/>
             <w:shd w:fill="1E3A8A"/>
             <w:tcMar>
-              <w:top w:w="50" w:type="dxa"/>
-              <w:bottom w:w="50" w:type="dxa"/>
-              <w:left w:w="60" w:type="dxa"/>
-              <w:right w:w="60" w:type="dxa"/>
+              <w:top w:w="40" w:type="dxa"/>
+              <w:bottom w:w="40" w:type="dxa"/>
+              <w:left w:w="50" w:type="dxa"/>
+              <w:right w:w="50" w:type="dxa"/>
             </w:tcMar>
           </w:tcPr>
           <w:p>
@@ -1544,7 +2492,33 @@
               <w:rPr>
                 <w:b/>
                 <w:color w:val="FFFFFF"/>
-                <w:sz w:val="16"/>
+                <w:sz w:val="15"/>
+              </w:rPr>
+              <w:t>Công ty Cổ phần (Đại hội đồng cổ đông)</w:t>
+            </w:r>
+          </w:p>
+        </w:tc>
+        <w:tc>
+          <w:tcPr>
+            <w:tcW w:type="dxa" w:w="4176"/>
+            <w:shd w:fill="1E3A8A"/>
+            <w:tcMar>
+              <w:top w:w="40" w:type="dxa"/>
+              <w:bottom w:w="40" w:type="dxa"/>
+              <w:left w:w="50" w:type="dxa"/>
+              <w:right w:w="50" w:type="dxa"/>
+            </w:tcMar>
+          </w:tcPr>
+          <w:p>
+            <w:pPr>
+              <w:spacing w:after="0"/>
+              <w:jc w:val="center"/>
+            </w:pPr>
+            <w:r>
+              <w:rPr>
+                <w:b/>
+                <w:color w:val="FFFFFF"/>
+                <w:sz w:val="15"/>
               </w:rPr>
               <w:t>Công ty TNHH 2+ TV (Hội đồng thành viên)</w:t>
             </w:r>
@@ -1557,10 +2531,10 @@
             <w:tcW w:type="dxa" w:w="2592"/>
             <w:shd w:fill="F8FAFC"/>
             <w:tcMar>
-              <w:top w:w="40" w:type="dxa"/>
-              <w:bottom w:w="40" w:type="dxa"/>
-              <w:left w:w="50" w:type="dxa"/>
-              <w:right w:w="50" w:type="dxa"/>
+              <w:top w:w="35" w:type="dxa"/>
+              <w:bottom w:w="35" w:type="dxa"/>
+              <w:left w:w="45" w:type="dxa"/>
+              <w:right w:w="45" w:type="dxa"/>
             </w:tcMar>
           </w:tcPr>
           <w:p>
@@ -1570,7 +2544,7 @@
             <w:r>
               <w:rPr>
                 <w:b/>
-                <w:sz w:val="15"/>
+                <w:sz w:val="14"/>
               </w:rPr>
               <w:t>Điều kiện tiến hành họp</w:t>
             </w:r>
@@ -1581,10 +2555,10 @@
             <w:tcW w:type="dxa" w:w="4176"/>
             <w:shd w:fill="F8FAFC"/>
             <w:tcMar>
-              <w:top w:w="40" w:type="dxa"/>
-              <w:bottom w:w="40" w:type="dxa"/>
-              <w:left w:w="50" w:type="dxa"/>
-              <w:right w:w="50" w:type="dxa"/>
+              <w:top w:w="35" w:type="dxa"/>
+              <w:bottom w:w="35" w:type="dxa"/>
+              <w:left w:w="45" w:type="dxa"/>
+              <w:right w:w="45" w:type="dxa"/>
             </w:tcMar>
           </w:tcPr>
           <w:p>
@@ -1593,11 +2567,11 @@
             </w:pPr>
             <w:r>
               <w:rPr>
-                <w:sz w:val="15"/>
+                <w:sz w:val="14"/>
               </w:rPr>
-              <w:t>• Lần 1: Có cổ đông dự họp đại diện TRÊN 50% tổng số phiếu biểu quyết.</w:t>
+              <w:t>• Lần 1: Cổ đông dự họp đại diện TRÊN 50% tổng số phiếu biểu quyết.</w:t>
               <w:br/>
-              <w:t>• Lần 2 (triệu tập trong 30 ngày): Dự họp đại diện ÍT NHẤT 33% tổng số phiếu.</w:t>
+              <w:t>• Lần 2 (trong 30 ngày): Dự họp đại diện ÍT NHẤT 33% tổng số phiếu.</w:t>
               <w:br/>
               <w:t>• Lần 3 (trong 20 ngày): Tiến hành KHÔNG phụ thuộc số cổ đông tham dự.</w:t>
             </w:r>
@@ -1608,10 +2582,10 @@
             <w:tcW w:type="dxa" w:w="4176"/>
             <w:shd w:fill="F8FAFC"/>
             <w:tcMar>
-              <w:top w:w="40" w:type="dxa"/>
-              <w:bottom w:w="40" w:type="dxa"/>
-              <w:left w:w="50" w:type="dxa"/>
-              <w:right w:w="50" w:type="dxa"/>
+              <w:top w:w="35" w:type="dxa"/>
+              <w:bottom w:w="35" w:type="dxa"/>
+              <w:left w:w="45" w:type="dxa"/>
+              <w:right w:w="45" w:type="dxa"/>
             </w:tcMar>
           </w:tcPr>
           <w:p>
@@ -1620,11 +2594,11 @@
             </w:pPr>
             <w:r>
               <w:rPr>
-                <w:sz w:val="15"/>
+                <w:sz w:val="14"/>
               </w:rPr>
               <w:t>• Lần 1: Thành viên dự họp sở hữu ÍT NHẤT 65% vốn điều lệ.</w:t>
               <w:br/>
-              <w:t>• Lần 2 (triệu tập trong 15 ngày): Dự họp sở hữu ÍT NHẤT 50% vốn điều lệ.</w:t>
+              <w:t>• Lần 2 (trong 15 ngày): Dự họp sở hữu ÍT NHẤT 50% vốn điều lệ.</w:t>
               <w:br/>
               <w:t>• Lần 3: Tiến hành KHÔNG phụ thuộc số thành viên tham dự.</w:t>
             </w:r>
@@ -1637,10 +2611,10 @@
             <w:tcW w:type="dxa" w:w="2592"/>
             <w:shd w:fill="FFFFFF"/>
             <w:tcMar>
-              <w:top w:w="40" w:type="dxa"/>
-              <w:bottom w:w="40" w:type="dxa"/>
-              <w:left w:w="50" w:type="dxa"/>
-              <w:right w:w="50" w:type="dxa"/>
+              <w:top w:w="35" w:type="dxa"/>
+              <w:bottom w:w="35" w:type="dxa"/>
+              <w:left w:w="45" w:type="dxa"/>
+              <w:right w:w="45" w:type="dxa"/>
             </w:tcMar>
           </w:tcPr>
           <w:p>
@@ -1650,7 +2624,7 @@
             <w:r>
               <w:rPr>
                 <w:b/>
-                <w:sz w:val="15"/>
+                <w:sz w:val="14"/>
               </w:rPr>
               <w:t>Nghị quyết thông thường</w:t>
             </w:r>
@@ -1661,10 +2635,10 @@
             <w:tcW w:type="dxa" w:w="4176"/>
             <w:shd w:fill="FFFFFF"/>
             <w:tcMar>
-              <w:top w:w="40" w:type="dxa"/>
-              <w:bottom w:w="40" w:type="dxa"/>
-              <w:left w:w="50" w:type="dxa"/>
-              <w:right w:w="50" w:type="dxa"/>
+              <w:top w:w="35" w:type="dxa"/>
+              <w:bottom w:w="35" w:type="dxa"/>
+              <w:left w:w="45" w:type="dxa"/>
+              <w:right w:w="45" w:type="dxa"/>
             </w:tcMar>
           </w:tcPr>
           <w:p>
@@ -1673,9 +2647,9 @@
             </w:pPr>
             <w:r>
               <w:rPr>
-                <w:sz w:val="15"/>
+                <w:sz w:val="14"/>
               </w:rPr>
-              <w:t>Được số cổ đông đại diện TRÊN 50% tổng số phiếu biểu quyết của các cổ đông dự họp tán thành (bỏ phiếu biểu quyết trực tiếp).</w:t>
+              <w:t>Được số cổ đông đại diện TRÊN 50% tổng số phiếu biểu quyết của các cổ đông dự họp tán thành.</w:t>
             </w:r>
           </w:p>
         </w:tc>
@@ -1684,10 +2658,10 @@
             <w:tcW w:type="dxa" w:w="4176"/>
             <w:shd w:fill="FFFFFF"/>
             <w:tcMar>
-              <w:top w:w="40" w:type="dxa"/>
-              <w:bottom w:w="40" w:type="dxa"/>
-              <w:left w:w="50" w:type="dxa"/>
-              <w:right w:w="50" w:type="dxa"/>
+              <w:top w:w="35" w:type="dxa"/>
+              <w:bottom w:w="35" w:type="dxa"/>
+              <w:left w:w="45" w:type="dxa"/>
+              <w:right w:w="45" w:type="dxa"/>
             </w:tcMar>
           </w:tcPr>
           <w:p>
@@ -1696,7 +2670,7 @@
             </w:pPr>
             <w:r>
               <w:rPr>
-                <w:sz w:val="15"/>
+                <w:sz w:val="14"/>
               </w:rPr>
               <w:t>Được số phiếu đại diện ÍT NHẤT 65% tổng số vốn góp của các thành viên dự họp tán thành.</w:t>
             </w:r>
@@ -1709,10 +2683,10 @@
             <w:tcW w:type="dxa" w:w="2592"/>
             <w:shd w:fill="F8FAFC"/>
             <w:tcMar>
-              <w:top w:w="40" w:type="dxa"/>
-              <w:bottom w:w="40" w:type="dxa"/>
-              <w:left w:w="50" w:type="dxa"/>
-              <w:right w:w="50" w:type="dxa"/>
+              <w:top w:w="35" w:type="dxa"/>
+              <w:bottom w:w="35" w:type="dxa"/>
+              <w:left w:w="45" w:type="dxa"/>
+              <w:right w:w="45" w:type="dxa"/>
             </w:tcMar>
           </w:tcPr>
           <w:p>
@@ -1722,7 +2696,7 @@
             <w:r>
               <w:rPr>
                 <w:b/>
-                <w:sz w:val="15"/>
+                <w:sz w:val="14"/>
               </w:rPr>
               <w:t>Nghị quyết đặc biệt (Quan trọng)</w:t>
             </w:r>
@@ -1733,10 +2707,10 @@
             <w:tcW w:type="dxa" w:w="4176"/>
             <w:shd w:fill="F8FAFC"/>
             <w:tcMar>
-              <w:top w:w="40" w:type="dxa"/>
-              <w:bottom w:w="40" w:type="dxa"/>
-              <w:left w:w="50" w:type="dxa"/>
-              <w:right w:w="50" w:type="dxa"/>
+              <w:top w:w="35" w:type="dxa"/>
+              <w:bottom w:w="35" w:type="dxa"/>
+              <w:left w:w="45" w:type="dxa"/>
+              <w:right w:w="45" w:type="dxa"/>
             </w:tcMar>
           </w:tcPr>
           <w:p>
@@ -1745,7 +2719,7 @@
             </w:pPr>
             <w:r>
               <w:rPr>
-                <w:sz w:val="15"/>
+                <w:sz w:val="14"/>
               </w:rPr>
               <w:t>Ít nhất 65% tổng số phiếu biểu quyết của cổ đông dự họp tán thành (Loại cổ phần, thay đổi ngành nghề, tổ chức lại, giải thể, bán tài sản &gt;= 35%).</w:t>
             </w:r>
@@ -1756,10 +2730,10 @@
             <w:tcW w:type="dxa" w:w="4176"/>
             <w:shd w:fill="F8FAFC"/>
             <w:tcMar>
-              <w:top w:w="40" w:type="dxa"/>
-              <w:bottom w:w="40" w:type="dxa"/>
-              <w:left w:w="50" w:type="dxa"/>
-              <w:right w:w="50" w:type="dxa"/>
+              <w:top w:w="35" w:type="dxa"/>
+              <w:bottom w:w="35" w:type="dxa"/>
+              <w:left w:w="45" w:type="dxa"/>
+              <w:right w:w="45" w:type="dxa"/>
             </w:tcMar>
           </w:tcPr>
           <w:p>
@@ -1768,7 +2742,7 @@
             </w:pPr>
             <w:r>
               <w:rPr>
-                <w:sz w:val="15"/>
+                <w:sz w:val="14"/>
               </w:rPr>
               <w:t>Ít nhất 75% tổng số vốn góp của thành viên dự họp tán thành (Sửa đổi điều lệ, tổ chức lại, giải thể, bán tài sản có giá trị từ 50% tổng tài sản trở lên).</w:t>
             </w:r>
@@ -1778,33 +2752,180 @@
     </w:tbl>
     <w:p>
       <w:pPr>
-        <w:spacing w:before="80" w:after="0"/>
+        <w:spacing w:after="40"/>
+      </w:pPr>
+    </w:p>
+    <w:tbl>
+      <w:tblPr>
+        <w:tblW w:type="auto" w:w="0"/>
+        <w:jc w:val="center"/>
+        <w:tblLayout w:type="fixed"/>
+        <w:tblLook w:firstColumn="1" w:firstRow="1" w:lastColumn="0" w:lastRow="0" w:noHBand="0" w:noVBand="1" w:val="04A0"/>
+      </w:tblPr>
+      <w:tblGrid>
+        <w:gridCol w:w="11030"/>
+      </w:tblGrid>
+      <w:tr>
+        <w:tc>
+          <w:tcPr>
+            <w:tcW w:type="dxa" w:w="10944"/>
+            <w:shd w:fill="EFF6FF"/>
+            <w:tcMar>
+              <w:top w:w="40" w:type="dxa"/>
+              <w:bottom w:w="40" w:type="dxa"/>
+              <w:left w:w="60" w:type="dxa"/>
+              <w:right w:w="60" w:type="dxa"/>
+            </w:tcMar>
+          </w:tcPr>
+          <w:p>
+            <w:pPr>
+              <w:spacing w:after="0"/>
+            </w:pPr>
+            <w:r>
+              <w:rPr>
+                <w:b/>
+                <w:color w:val="1D4ED8"/>
+                <w:sz w:val="19"/>
+              </w:rPr>
+              <w:t>🔄 CHUYÊN ĐỀ 6: TÁI CƠ CẤU, GIẢI THỂ &amp; PHÁ SẢN DOANH NGHIỆP</w:t>
+            </w:r>
+          </w:p>
+        </w:tc>
+      </w:tr>
+    </w:tbl>
+    <w:tbl>
+      <w:tblPr>
+        <w:tblW w:type="auto" w:w="0"/>
+        <w:jc w:val="center"/>
+        <w:tblLayout w:type="fixed"/>
+        <w:tblLook w:firstColumn="1" w:firstRow="1" w:lastColumn="0" w:lastRow="0" w:noHBand="0" w:noVBand="1" w:val="04A0"/>
+      </w:tblPr>
+      <w:tblGrid>
+        <w:gridCol w:w="5515"/>
+        <w:gridCol w:w="5515"/>
+      </w:tblGrid>
+      <w:tr>
+        <w:tc>
+          <w:tcPr>
+            <w:tcW w:type="dxa" w:w="5400"/>
+            <w:shd w:fill="F1F5F9"/>
+            <w:tcMar>
+              <w:top w:w="40" w:type="dxa"/>
+              <w:bottom w:w="40" w:type="dxa"/>
+              <w:left w:w="50" w:type="dxa"/>
+              <w:right w:w="50" w:type="dxa"/>
+            </w:tcMar>
+          </w:tcPr>
+          <w:p>
+            <w:pPr>
+              <w:spacing w:after="0" w:line="259" w:lineRule="auto"/>
+            </w:pPr>
+            <w:r>
+              <w:rPr>
+                <w:color w:val="0F172A"/>
+                <w:sz w:val="14"/>
+              </w:rPr>
+              <w:t>🔄 TỔ CHỨC LẠI DOANH NGHIỆP (5 hình thức):</w:t>
+              <w:br/>
+              <w:t>• Chia DN (A -&gt; B + C): Công ty cũ CHẤM DỨT tồn tại. Chỉ áp dụng cho TNHH và Cổ phần.</w:t>
+              <w:br/>
+              <w:t>• Tách DN (A -&gt; A + B): Công ty cũ VẪN TỒN TẠI. Chỉ áp dụng cho TNHH và Cổ phần.</w:t>
+              <w:br/>
+              <w:t>• Hợp nhất DN (A + B -&gt; C): Các công ty cũ CHẤM DỨT tồn tại, tạo thành 1 công ty mới hoàn toàn.</w:t>
+              <w:br/>
+              <w:t>• Sáp nhập DN (A + B -&gt; A): Công ty bị sáp nhập (B) CHẤM DỨT; Công ty nhận sáp nhập (A) VẪN TỒN TẠI.</w:t>
+              <w:br/>
+              <w:t>• Chuyển đổi loại hình: TNHH 1 TV &lt;-&gt; TNHH 2 TV &lt;-&gt; CTCP. DNTN -&gt; TNHH/CTCP/CTHD.</w:t>
+            </w:r>
+          </w:p>
+        </w:tc>
+        <w:tc>
+          <w:tcPr>
+            <w:tcW w:type="dxa" w:w="5544"/>
+            <w:shd w:fill="FFFBEB"/>
+            <w:tcMar>
+              <w:top w:w="40" w:type="dxa"/>
+              <w:bottom w:w="40" w:type="dxa"/>
+              <w:left w:w="50" w:type="dxa"/>
+              <w:right w:w="50" w:type="dxa"/>
+            </w:tcMar>
+          </w:tcPr>
+          <w:p>
+            <w:pPr>
+              <w:spacing w:after="0" w:line="259" w:lineRule="auto"/>
+            </w:pPr>
+            <w:r>
+              <w:rPr>
+                <w:color w:val="78350F"/>
+                <w:sz w:val="14"/>
+              </w:rPr>
+              <w:t>⚖️ PHÂN BIỆT GIẢI THỂ VS PHÁ SẢN (Cực quan trọng):</w:t>
+              <w:br/>
+              <w:t>• GIẢI THỂ: Doanh nghiệp CÒN KHẢ NĂNG THANH TOÁN HẾT NỢ. Tự nguyện hoặc bị thu hồi GCN ĐKDN. Cơ quan ĐKKD xóa tên.</w:t>
+              <w:br/>
+              <w:t>• PHÁ SẢN: Doanh nghiệp MẤT KHẢ NĂNG THANH TOÁN (quá hạn 3 tháng). CHỈ TÒA ÁN NHÂN DÂN có quyền tuyên bố phá sản.</w:t>
+              <w:br/>
+              <w:t>• Ai có quyền nộp đơn phá sản: Chủ nợ không có bảo đảm, chủ nợ bảo đảm 1 phần, người lao động. Chủ nợ bảo đảm hoàn toàn KHÔNG CÓ QUYỀN.</w:t>
+              <w:br/>
+              <w:t>• Thứ tự chia tài sản phá sản: 1. Chi phí phá sản -&gt; 2. Lương, trợ cấp NLĐ -&gt; 3. Nợ phục hồi -&gt; 4. Nghĩa vụ thuế &amp; Nợ ko bảo đảm -&gt; 5. Chủ sở hữu.</w:t>
+            </w:r>
+          </w:p>
+        </w:tc>
+      </w:tr>
+    </w:tbl>
+    <w:p>
+      <w:pPr>
+        <w:spacing w:after="40"/>
+      </w:pPr>
+    </w:p>
+    <w:tbl>
+      <w:tblPr>
+        <w:tblW w:type="auto" w:w="0"/>
+        <w:jc w:val="center"/>
+        <w:tblLayout w:type="fixed"/>
+        <w:tblLook w:firstColumn="1" w:firstRow="1" w:lastColumn="0" w:lastRow="0" w:noHBand="0" w:noVBand="1" w:val="04A0"/>
+      </w:tblPr>
+      <w:tblGrid>
+        <w:gridCol w:w="11030"/>
+      </w:tblGrid>
+      <w:tr>
+        <w:tc>
+          <w:tcPr>
+            <w:tcW w:type="dxa" w:w="10944"/>
+            <w:shd w:fill="F0FDF4"/>
+            <w:tcMar>
+              <w:top w:w="40" w:type="dxa"/>
+              <w:bottom w:w="40" w:type="dxa"/>
+              <w:left w:w="60" w:type="dxa"/>
+              <w:right w:w="60" w:type="dxa"/>
+            </w:tcMar>
+          </w:tcPr>
+          <w:p>
+            <w:pPr>
+              <w:spacing w:after="0"/>
+            </w:pPr>
+            <w:r>
+              <w:rPr>
+                <w:b/>
+                <w:color w:val="15803D"/>
+                <w:sz w:val="19"/>
+              </w:rPr>
+              <w:t>🧮 CHUYÊN ĐỀ 7: HỢP ĐỒNG THƯƠNG MẠI &amp; BỘ CÔNG THỨC TÍNH TOÁN CHUẨN XÁC 100%</w:t>
+            </w:r>
+          </w:p>
+        </w:tc>
+      </w:tr>
+    </w:tbl>
+    <w:p>
+      <w:pPr>
+        <w:spacing w:before="40" w:after="60"/>
       </w:pPr>
       <w:r>
         <w:rPr>
-          <w:i/>
-          <w:color w:val="64748B"/>
+          <w:color w:val="14532D"/>
           <w:sz w:val="15"/>
         </w:rPr>
-        <w:t>📌 Lưu ý họp HĐQT Cổ phần: Lần 1 cần ít nhất 3/4 (75%) tổng số thành viên dự họp; Lần 2 cần hơn 1/2 (50%). Họp định kỳ ít nhất 01 lần/quý.</w:t>
-      </w:r>
-    </w:p>
-    <w:p>
-      <w:r>
-        <w:br w:type="page"/>
-      </w:r>
-    </w:p>
-    <w:p>
-      <w:pPr>
-        <w:spacing w:before="0" w:after="40"/>
-      </w:pPr>
-      <w:r>
-        <w:rPr>
-          <w:b/>
-          <w:color w:val="B45309"/>
-          <w:sz w:val="19"/>
-        </w:rPr>
-        <w:t>4. MẸO KHOANH TRẮC NGHIỆM SIÊU TỐC &amp; BẪY KINH ĐIỂN CẦN TRÁNH</w:t>
+        <w:t>📜 Hợp đồng thương mại &amp; Tranh chấp: (1) Ít nhất một bên phải là thương nhân; (2) Phạt vi phạm BẮT BUỘC phải thỏa thuận trước, mức phạt tối đa 8% giá trị phần nghĩa vụ bị vi phạm (LTM 2005); (3) Bồi thường thiệt hại phát sinh đương nhiên khi có thiệt hại; (4) Được áp dụng đồng thời cả phạt và bồi thường nếu có thỏa thuận phạt; (5) Thời hiệu khởi kiện tranh chấp thương mại chung là 02 năm; (6) Trọng tài thương mại xét xử kín, phán quyết CHUNG THẨM, bắt buộc phải có thỏa thuận trọng tài.</w:t>
       </w:r>
     </w:p>
     <w:tbl>
@@ -1815,71 +2936,9 @@
         <w:tblLook w:firstColumn="1" w:firstRow="1" w:lastColumn="0" w:lastRow="0" w:noHBand="0" w:noVBand="1" w:val="04A0"/>
       </w:tblPr>
       <w:tblGrid>
-        <w:gridCol w:w="10944"/>
-      </w:tblGrid>
-      <w:tr>
-        <w:tc>
-          <w:tcPr>
-            <w:tcW w:type="dxa" w:w="10944"/>
-            <w:shd w:fill="FFFBEB"/>
-            <w:tcMar>
-              <w:top w:w="60" w:type="dxa"/>
-              <w:bottom w:w="60" w:type="dxa"/>
-              <w:left w:w="80" w:type="dxa"/>
-              <w:right w:w="80" w:type="dxa"/>
-            </w:tcMar>
-          </w:tcPr>
-          <w:p>
-            <w:pPr>
-              <w:spacing w:after="0" w:line="264" w:lineRule="auto"/>
-            </w:pPr>
-            <w:r>
-              <w:rPr>
-                <w:color w:val="78350F"/>
-                <w:sz w:val="16"/>
-              </w:rPr>
-              <w:t>⚡ 1. Bẫy từ ngữ cực đoan: Đáp án chứa 'Mọi trường hợp', 'Bắt buộc luôn luôn', 'Chỉ duy nhất', 'Tự động giải thể', 'Đương nhiên mất tư cách' -&gt; 95% là SAI!</w:t>
-              <w:br/>
-              <w:t>⚡ 2. Thương nhân vs Đơn vị phụ thuộc: Thương nhân phải độc lập, có ĐKKD. Hộ kinh doanh = LÀ thương nhân. Chi nhánh, Văn phòng đại diện = KHÔNG PHẢI thương nhân.</w:t>
-              <w:br/>
-              <w:t>⚡ 3. Chi nhánh vs Văn phòng đại diện: Chi nhánh ĐƯỢC kinh doanh sinh lợi + đại diện ủy quyền. Văn phòng đại diện CHỈ đại diện ủy quyền, CẤM kinh doanh.</w:t>
-              <w:br/>
-              <w:t>⚡ 4. Điều kiện kiêm nhiệm của Chủ DNTN: CẤM làm Chủ hộ KD, CẤM làm TV hợp danh, CẤM lập thêm DNTN khác. Nhưng ĐƯỢC làm TV góp vốn CTHD hoặc Cổ đông CTCP.</w:t>
-              <w:br/>
-              <w:t>⚡ 5. Cổ phần ưu đãi (Mẹo: 'Được tiền thì mất quyền'): Cổ đông ưu đãi cổ tức và hoàn lại KHÔNG có quyền biểu quyết, KHÔNG dự họp ĐHĐCĐ. Cổ phần ưu đãi biểu quyết CẤM chuyển nhượng.</w:t>
-              <w:br/>
-              <w:t>⚡ 6. Giải thể vs Phá sản: Giải thể = CÒN khả năng trả nợ (thanh toán hết nợ). Phá sản = MẤT khả năng thanh toán (quá hạn 03 tháng). Tòa án nhân dân DUY NHẤT có quyền tuyên bố phá sản.</w:t>
-              <w:br/>
-              <w:t>⚡ 7. Phạt vi phạm hợp đồng (Luật Thương mại 2005): Phạt vi phạm BẮT BUỘC phải có THỎA THUẬN trước trong HĐ (Bồi thường thì không cần). Mức phạt tối đa 8% phần nghĩa vụ bị vi phạm.</w:t>
-            </w:r>
-          </w:p>
-        </w:tc>
-      </w:tr>
-    </w:tbl>
-    <w:p>
-      <w:pPr>
-        <w:spacing w:before="120" w:after="40"/>
-      </w:pPr>
-      <w:r>
-        <w:rPr>
-          <w:b/>
-          <w:color w:val="15803D"/>
-          <w:sz w:val="19"/>
-        </w:rPr>
-        <w:t>5. BỘ CÔNG THỨC &amp; MẸO TÍNH TOÁN CHUẨN XÁC 100% (ĐỀ THI CUỐI KỲ)</w:t>
-      </w:r>
-    </w:p>
-    <w:tbl>
-      <w:tblPr>
-        <w:tblW w:type="auto" w:w="0"/>
-        <w:jc w:val="center"/>
-        <w:tblLayout w:type="fixed"/>
-        <w:tblLook w:firstColumn="1" w:firstRow="1" w:lastColumn="0" w:lastRow="0" w:noHBand="0" w:noVBand="1" w:val="04A0"/>
-      </w:tblPr>
-      <w:tblGrid>
-        <w:gridCol w:w="3648"/>
-        <w:gridCol w:w="3648"/>
-        <w:gridCol w:w="3648"/>
+        <w:gridCol w:w="3677"/>
+        <w:gridCol w:w="3677"/>
+        <w:gridCol w:w="3677"/>
       </w:tblGrid>
       <w:tr>
         <w:tc>
@@ -1887,10 +2946,10 @@
             <w:tcW w:type="dxa" w:w="2592"/>
             <w:shd w:fill="14532D"/>
             <w:tcMar>
-              <w:top w:w="50" w:type="dxa"/>
-              <w:bottom w:w="50" w:type="dxa"/>
-              <w:left w:w="60" w:type="dxa"/>
-              <w:right w:w="60" w:type="dxa"/>
+              <w:top w:w="45" w:type="dxa"/>
+              <w:bottom w:w="45" w:type="dxa"/>
+              <w:left w:w="50" w:type="dxa"/>
+              <w:right w:w="50" w:type="dxa"/>
             </w:tcMar>
           </w:tcPr>
           <w:p>
@@ -1902,7 +2961,7 @@
               <w:rPr>
                 <w:b/>
                 <w:color w:val="FFFFFF"/>
-                <w:sz w:val="16"/>
+                <w:sz w:val="15"/>
               </w:rPr>
               <w:t>Dạng bài tập</w:t>
             </w:r>
@@ -1913,10 +2972,10 @@
             <w:tcW w:type="dxa" w:w="4032"/>
             <w:shd w:fill="14532D"/>
             <w:tcMar>
-              <w:top w:w="50" w:type="dxa"/>
-              <w:bottom w:w="50" w:type="dxa"/>
-              <w:left w:w="60" w:type="dxa"/>
-              <w:right w:w="60" w:type="dxa"/>
+              <w:top w:w="45" w:type="dxa"/>
+              <w:bottom w:w="45" w:type="dxa"/>
+              <w:left w:w="50" w:type="dxa"/>
+              <w:right w:w="50" w:type="dxa"/>
             </w:tcMar>
           </w:tcPr>
           <w:p>
@@ -1928,7 +2987,7 @@
               <w:rPr>
                 <w:b/>
                 <w:color w:val="FFFFFF"/>
-                <w:sz w:val="16"/>
+                <w:sz w:val="15"/>
               </w:rPr>
               <w:t>Công thức chuẩn xác</w:t>
             </w:r>
@@ -1939,10 +2998,10 @@
             <w:tcW w:type="dxa" w:w="4320"/>
             <w:shd w:fill="14532D"/>
             <w:tcMar>
-              <w:top w:w="50" w:type="dxa"/>
-              <w:bottom w:w="50" w:type="dxa"/>
-              <w:left w:w="60" w:type="dxa"/>
-              <w:right w:w="60" w:type="dxa"/>
+              <w:top w:w="45" w:type="dxa"/>
+              <w:bottom w:w="45" w:type="dxa"/>
+              <w:left w:w="50" w:type="dxa"/>
+              <w:right w:w="50" w:type="dxa"/>
             </w:tcMar>
           </w:tcPr>
           <w:p>
@@ -1954,9 +3013,9 @@
               <w:rPr>
                 <w:b/>
                 <w:color w:val="FFFFFF"/>
-                <w:sz w:val="16"/>
+                <w:sz w:val="15"/>
               </w:rPr>
-              <w:t>Ví dụ trắc nghiệm mẫu &amp; Mẹo bấm máy</w:t>
+              <w:t>Ví dụ trắc nghiệm đề thi &amp; Mẹo bấm máy</w:t>
             </w:r>
           </w:p>
         </w:tc>
@@ -1967,10 +3026,10 @@
             <w:tcW w:type="dxa" w:w="2592"/>
             <w:shd w:fill="F0FDF4"/>
             <w:tcMar>
-              <w:top w:w="35" w:type="dxa"/>
-              <w:bottom w:w="35" w:type="dxa"/>
-              <w:left w:w="50" w:type="dxa"/>
-              <w:right w:w="50" w:type="dxa"/>
+              <w:top w:w="30" w:type="dxa"/>
+              <w:bottom w:w="30" w:type="dxa"/>
+              <w:left w:w="45" w:type="dxa"/>
+              <w:right w:w="45" w:type="dxa"/>
             </w:tcMar>
           </w:tcPr>
           <w:p>
@@ -1981,7 +3040,7 @@
               <w:rPr>
                 <w:b/>
                 <w:color w:val="15803D"/>
-                <w:sz w:val="15"/>
+                <w:sz w:val="14"/>
               </w:rPr>
               <w:t>Dạng 1: Tính tỷ lệ phần vốn góp (%)</w:t>
               <w:br/>
@@ -1994,10 +3053,10 @@
             <w:tcW w:type="dxa" w:w="4032"/>
             <w:shd w:fill="F0FDF4"/>
             <w:tcMar>
-              <w:top w:w="35" w:type="dxa"/>
-              <w:bottom w:w="35" w:type="dxa"/>
-              <w:left w:w="50" w:type="dxa"/>
-              <w:right w:w="50" w:type="dxa"/>
+              <w:top w:w="30" w:type="dxa"/>
+              <w:bottom w:w="30" w:type="dxa"/>
+              <w:left w:w="45" w:type="dxa"/>
+              <w:right w:w="45" w:type="dxa"/>
             </w:tcMar>
           </w:tcPr>
           <w:p>
@@ -2008,11 +3067,11 @@
               <w:rPr>
                 <w:b/>
                 <w:color w:val="1E293B"/>
-                <w:sz w:val="15"/>
+                <w:sz w:val="14"/>
               </w:rPr>
-              <w:t>Tỷ lệ % của thành viên X:</w:t>
+              <w:t>% Vốn của X =</w:t>
               <w:br/>
-              <w:t>% X = (Vốn góp của X / Tổng vốn điều lệ) x 100%</w:t>
+              <w:t>(Vốn của X / Tổng vốn điều lệ) x 100%</w:t>
             </w:r>
           </w:p>
         </w:tc>
@@ -2021,10 +3080,10 @@
             <w:tcW w:type="dxa" w:w="4320"/>
             <w:shd w:fill="F0FDF4"/>
             <w:tcMar>
-              <w:top w:w="35" w:type="dxa"/>
-              <w:bottom w:w="35" w:type="dxa"/>
-              <w:left w:w="50" w:type="dxa"/>
-              <w:right w:w="50" w:type="dxa"/>
+              <w:top w:w="30" w:type="dxa"/>
+              <w:bottom w:w="30" w:type="dxa"/>
+              <w:left w:w="45" w:type="dxa"/>
+              <w:right w:w="45" w:type="dxa"/>
             </w:tcMar>
           </w:tcPr>
           <w:p>
@@ -2033,13 +3092,13 @@
             </w:pPr>
             <w:r>
               <w:rPr>
-                <w:sz w:val="15"/>
+                <w:sz w:val="14"/>
               </w:rPr>
-              <w:t>• Đề bài: A góp 4 tỷ, B góp 1 tỷ, C góp 3 tỷ.</w:t>
+              <w:t>• Đề: A góp 4 tỷ, B góp 1 tỷ, C góp 3 tỷ. Tính tỷ lệ từng người?</w:t>
               <w:br/>
-              <w:t>• Bước 1: Tổng vốn = 4 + 1 + 3 = 8 tỷ.</w:t>
+              <w:t>• Bấm máy: Tổng vốn = 4 + 1 + 3 = 8 tỷ.</w:t>
               <w:br/>
-              <w:t>• Bước 2: A = 4/8 = 50%; B = 1/8 = 12.5%; C = 3/8 = 37.5%.</w:t>
+              <w:t xml:space="preserve">  A = 4/8 = 50%; B = 1/8 = 12.5%; C = 3/8 = 37.5%.</w:t>
               <w:br/>
               <w:t>=&gt; Khoanh ngay đáp án C (50%, 12.5%, 37.5%).</w:t>
             </w:r>
@@ -2052,10 +3111,10 @@
             <w:tcW w:type="dxa" w:w="2592"/>
             <w:shd w:fill="FFFFFF"/>
             <w:tcMar>
-              <w:top w:w="35" w:type="dxa"/>
-              <w:bottom w:w="35" w:type="dxa"/>
-              <w:left w:w="50" w:type="dxa"/>
-              <w:right w:w="50" w:type="dxa"/>
+              <w:top w:w="30" w:type="dxa"/>
+              <w:bottom w:w="30" w:type="dxa"/>
+              <w:left w:w="45" w:type="dxa"/>
+              <w:right w:w="45" w:type="dxa"/>
             </w:tcMar>
           </w:tcPr>
           <w:p>
@@ -2066,7 +3125,7 @@
               <w:rPr>
                 <w:b/>
                 <w:color w:val="15803D"/>
-                <w:sz w:val="15"/>
+                <w:sz w:val="14"/>
               </w:rPr>
               <w:t>Dạng 2: Chuyển nhượng vốn nội bộ TNHH</w:t>
               <w:br/>
@@ -2083,10 +3142,10 @@
             <w:tcW w:type="dxa" w:w="4032"/>
             <w:shd w:fill="FFFFFF"/>
             <w:tcMar>
-              <w:top w:w="35" w:type="dxa"/>
-              <w:bottom w:w="35" w:type="dxa"/>
-              <w:left w:w="50" w:type="dxa"/>
-              <w:right w:w="50" w:type="dxa"/>
+              <w:top w:w="30" w:type="dxa"/>
+              <w:bottom w:w="30" w:type="dxa"/>
+              <w:left w:w="45" w:type="dxa"/>
+              <w:right w:w="45" w:type="dxa"/>
             </w:tcMar>
           </w:tcPr>
           <w:p>
@@ -2097,15 +3156,13 @@
               <w:rPr>
                 <w:b/>
                 <w:color w:val="1E293B"/>
-                <w:sz w:val="15"/>
+                <w:sz w:val="14"/>
               </w:rPr>
-              <w:t>Mẹo chia theo tỷ lệ vốn còn lại:</w:t>
-              <w:br/>
-              <w:t>Vốn nhận max của X =</w:t>
+              <w:t>Vốn mua max của X =</w:t>
               <w:br/>
               <w:t>Vốn bán x [ Vốn của X / Tổng vốn các TV còn lại ]</w:t>
               <w:br/>
-              <w:t>(Các thành viên mua theo tỷ lệ vốn hiện có tương ứng)</w:t>
+              <w:t>(Chia theo tỷ lệ phần vốn các TV còn lại đang nắm giữ)</w:t>
             </w:r>
           </w:p>
         </w:tc>
@@ -2114,10 +3171,10 @@
             <w:tcW w:type="dxa" w:w="4320"/>
             <w:shd w:fill="FFFFFF"/>
             <w:tcMar>
-              <w:top w:w="35" w:type="dxa"/>
-              <w:bottom w:w="35" w:type="dxa"/>
-              <w:left w:w="50" w:type="dxa"/>
-              <w:right w:w="50" w:type="dxa"/>
+              <w:top w:w="30" w:type="dxa"/>
+              <w:bottom w:w="30" w:type="dxa"/>
+              <w:left w:w="45" w:type="dxa"/>
+              <w:right w:w="45" w:type="dxa"/>
             </w:tcMar>
           </w:tcPr>
           <w:p>
@@ -2126,15 +3183,15 @@
             </w:pPr>
             <w:r>
               <w:rPr>
-                <w:sz w:val="15"/>
+                <w:sz w:val="14"/>
               </w:rPr>
               <w:t>• Ví dụ 1 (Đề 1 - C23): N bán 200 tr cho M (35%), K (30%), Q (15%).</w:t>
               <w:br/>
-              <w:t xml:space="preserve">  Tổng tỷ lệ còn lại = 35 + 30 + 15 = 80%.</w:t>
+              <w:t xml:space="preserve">  Tổng mẫu còn lại = 35 + 30 + 15 = 80%.</w:t>
               <w:br/>
               <w:t xml:space="preserve">  M = 200 x 35/80 = 87.5 tr; K = 200 x 30/80 = 75 tr; Q = 37.5 tr.</w:t>
               <w:br/>
-              <w:t>• Ví dụ 2 (Đề 2 - C11): Đức (2 tỷ) bán cho Huy (0.8 tỷ), Linh (2 tỷ), Quỳnh (1.2 tỷ). Tổng còn lại = 4 tỷ.</w:t>
+              <w:t>• Ví dụ 2 (Đề 2 - C11): Đức (2 tỷ) bán cho Huy (0.8 tỷ), Linh (2 tỷ), Quỳnh (1.2 tỷ). Tổng còn lại = 0.8 + 2 + 1.2 = 4 tỷ.</w:t>
               <w:br/>
               <w:t xml:space="preserve">  Huy = 2 x 0.8/4 = 400 tr; Linh = 2 x 2/4 = 1 tỷ; Quỳnh = 600 tr.</w:t>
               <w:br/>
@@ -2149,10 +3206,10 @@
             <w:tcW w:type="dxa" w:w="2592"/>
             <w:shd w:fill="F0FDF4"/>
             <w:tcMar>
-              <w:top w:w="35" w:type="dxa"/>
-              <w:bottom w:w="35" w:type="dxa"/>
-              <w:left w:w="50" w:type="dxa"/>
-              <w:right w:w="50" w:type="dxa"/>
+              <w:top w:w="30" w:type="dxa"/>
+              <w:bottom w:w="30" w:type="dxa"/>
+              <w:left w:w="45" w:type="dxa"/>
+              <w:right w:w="45" w:type="dxa"/>
             </w:tcMar>
           </w:tcPr>
           <w:p>
@@ -2163,9 +3220,9 @@
               <w:rPr>
                 <w:b/>
                 <w:color w:val="15803D"/>
-                <w:sz w:val="15"/>
+                <w:sz w:val="14"/>
               </w:rPr>
-              <w:t>Dạng 3: Tìm tổng số cổ phần chào bán khi biết CĐSL</w:t>
+              <w:t>Dạng 3: Tìm tổng số CP chào bán khi biết CĐSL</w:t>
               <w:br/>
               <w:t>(Đề 2 - Câu 24)</w:t>
             </w:r>
@@ -2176,10 +3233,10 @@
             <w:tcW w:type="dxa" w:w="4032"/>
             <w:shd w:fill="F0FDF4"/>
             <w:tcMar>
-              <w:top w:w="35" w:type="dxa"/>
-              <w:bottom w:w="35" w:type="dxa"/>
-              <w:left w:w="50" w:type="dxa"/>
-              <w:right w:w="50" w:type="dxa"/>
+              <w:top w:w="30" w:type="dxa"/>
+              <w:bottom w:w="30" w:type="dxa"/>
+              <w:left w:w="45" w:type="dxa"/>
+              <w:right w:w="45" w:type="dxa"/>
             </w:tcMar>
           </w:tcPr>
           <w:p>
@@ -2190,7 +3247,7 @@
               <w:rPr>
                 <w:b/>
                 <w:color w:val="1E293B"/>
-                <w:sz w:val="15"/>
+                <w:sz w:val="14"/>
               </w:rPr>
               <w:t>Tổng số cổ phần chào bán =</w:t>
               <w:br/>
@@ -2203,10 +3260,10 @@
             <w:tcW w:type="dxa" w:w="4320"/>
             <w:shd w:fill="F0FDF4"/>
             <w:tcMar>
-              <w:top w:w="35" w:type="dxa"/>
-              <w:bottom w:w="35" w:type="dxa"/>
-              <w:left w:w="50" w:type="dxa"/>
-              <w:right w:w="50" w:type="dxa"/>
+              <w:top w:w="30" w:type="dxa"/>
+              <w:bottom w:w="30" w:type="dxa"/>
+              <w:left w:w="45" w:type="dxa"/>
+              <w:right w:w="45" w:type="dxa"/>
             </w:tcMar>
           </w:tcPr>
           <w:p>
@@ -2215,9 +3272,9 @@
             </w:pPr>
             <w:r>
               <w:rPr>
-                <w:sz w:val="15"/>
+                <w:sz w:val="14"/>
               </w:rPr>
-              <w:t>• Đề bài: Cổ đông sáng lập đăng ký mua 38% tương ứng 28.880 cổ phần. Hỏi tổng số CP công ty chào bán?</w:t>
+              <w:t>• Đề: Cổ đông sáng lập mua 38% ứng với 28.880 cổ phần. Hỏi tổng số CP công ty được chào bán khi thành lập?</w:t>
               <w:br/>
               <w:t>• Bấm máy: 28.880 / 0.38 = 76.000 cổ phần.</w:t>
               <w:br/>
@@ -2232,10 +3289,10 @@
             <w:tcW w:type="dxa" w:w="2592"/>
             <w:shd w:fill="FFFFFF"/>
             <w:tcMar>
-              <w:top w:w="35" w:type="dxa"/>
-              <w:bottom w:w="35" w:type="dxa"/>
-              <w:left w:w="50" w:type="dxa"/>
-              <w:right w:w="50" w:type="dxa"/>
+              <w:top w:w="30" w:type="dxa"/>
+              <w:bottom w:w="30" w:type="dxa"/>
+              <w:left w:w="45" w:type="dxa"/>
+              <w:right w:w="45" w:type="dxa"/>
             </w:tcMar>
           </w:tcPr>
           <w:p>
@@ -2246,7 +3303,7 @@
               <w:rPr>
                 <w:b/>
                 <w:color w:val="15803D"/>
-                <w:sz w:val="15"/>
+                <w:sz w:val="14"/>
               </w:rPr>
               <w:t>Dạng 4: Tìm số cổ phần CĐSL mua</w:t>
               <w:br/>
@@ -2259,10 +3316,10 @@
             <w:tcW w:type="dxa" w:w="4032"/>
             <w:shd w:fill="FFFFFF"/>
             <w:tcMar>
-              <w:top w:w="35" w:type="dxa"/>
-              <w:bottom w:w="35" w:type="dxa"/>
-              <w:left w:w="50" w:type="dxa"/>
-              <w:right w:w="50" w:type="dxa"/>
+              <w:top w:w="30" w:type="dxa"/>
+              <w:bottom w:w="30" w:type="dxa"/>
+              <w:left w:w="45" w:type="dxa"/>
+              <w:right w:w="45" w:type="dxa"/>
             </w:tcMar>
           </w:tcPr>
           <w:p>
@@ -2273,11 +3330,11 @@
               <w:rPr>
                 <w:b/>
                 <w:color w:val="1E293B"/>
-                <w:sz w:val="15"/>
+                <w:sz w:val="14"/>
               </w:rPr>
               <w:t>Số CP CĐSL mua =</w:t>
               <w:br/>
-              <w:t>Tổng số CP chào bán x Tỷ lệ % CĐSL mua</w:t>
+              <w:t>Tổng CP chào bán x Tỷ lệ % CĐSL mua</w:t>
             </w:r>
           </w:p>
         </w:tc>
@@ -2286,10 +3343,10 @@
             <w:tcW w:type="dxa" w:w="4320"/>
             <w:shd w:fill="FFFFFF"/>
             <w:tcMar>
-              <w:top w:w="35" w:type="dxa"/>
-              <w:bottom w:w="35" w:type="dxa"/>
-              <w:left w:w="50" w:type="dxa"/>
-              <w:right w:w="50" w:type="dxa"/>
+              <w:top w:w="30" w:type="dxa"/>
+              <w:bottom w:w="30" w:type="dxa"/>
+              <w:left w:w="45" w:type="dxa"/>
+              <w:right w:w="45" w:type="dxa"/>
             </w:tcMar>
           </w:tcPr>
           <w:p>
@@ -2298,9 +3355,9 @@
             </w:pPr>
             <w:r>
               <w:rPr>
-                <w:sz w:val="15"/>
+                <w:sz w:val="14"/>
               </w:rPr>
-              <w:t>• Đề bài: Công ty chào bán 2.000.000 cổ phần khi thành lập. Cổ đông sáng lập mua 45%.</w:t>
+              <w:t>• Đề: Công ty chào bán 2.000.000 cổ phần khi thành lập. Các CĐSL đăng ký mua 45%.</w:t>
               <w:br/>
               <w:t>• Bấm máy: 2.000.000 x 45% = 900.000 cổ phần.</w:t>
               <w:br/>
@@ -2315,10 +3372,10 @@
             <w:tcW w:type="dxa" w:w="2592"/>
             <w:shd w:fill="F0FDF4"/>
             <w:tcMar>
-              <w:top w:w="35" w:type="dxa"/>
-              <w:bottom w:w="35" w:type="dxa"/>
-              <w:left w:w="50" w:type="dxa"/>
-              <w:right w:w="50" w:type="dxa"/>
+              <w:top w:w="30" w:type="dxa"/>
+              <w:bottom w:w="30" w:type="dxa"/>
+              <w:left w:w="45" w:type="dxa"/>
+              <w:right w:w="45" w:type="dxa"/>
             </w:tcMar>
           </w:tcPr>
           <w:p>
@@ -2329,7 +3386,7 @@
               <w:rPr>
                 <w:b/>
                 <w:color w:val="15803D"/>
-                <w:sz w:val="15"/>
+                <w:sz w:val="14"/>
               </w:rPr>
               <w:t>Dạng 5: Tính phạt vi phạm hợp đồng tối đa</w:t>
               <w:br/>
@@ -2342,10 +3399,10 @@
             <w:tcW w:type="dxa" w:w="4032"/>
             <w:shd w:fill="F0FDF4"/>
             <w:tcMar>
-              <w:top w:w="35" w:type="dxa"/>
-              <w:bottom w:w="35" w:type="dxa"/>
-              <w:left w:w="50" w:type="dxa"/>
-              <w:right w:w="50" w:type="dxa"/>
+              <w:top w:w="30" w:type="dxa"/>
+              <w:bottom w:w="30" w:type="dxa"/>
+              <w:left w:w="45" w:type="dxa"/>
+              <w:right w:w="45" w:type="dxa"/>
             </w:tcMar>
           </w:tcPr>
           <w:p>
@@ -2356,13 +3413,13 @@
               <w:rPr>
                 <w:b/>
                 <w:color w:val="1E293B"/>
-                <w:sz w:val="15"/>
+                <w:sz w:val="14"/>
               </w:rPr>
               <w:t>Mức phạt vi phạm MAX =</w:t>
               <w:br/>
               <w:t>8% x Giá trị phần nghĩa vụ bị vi phạm</w:t>
               <w:br/>
-              <w:t>(Lưu ý: Không tính trên toàn bộ hợp đồng nếu vi phạm một phần)</w:t>
+              <w:t>(Lưu ý: Không tính trên toàn bộ HĐ nếu chỉ vi phạm 1 phần)</w:t>
             </w:r>
           </w:p>
         </w:tc>
@@ -2371,10 +3428,10 @@
             <w:tcW w:type="dxa" w:w="4320"/>
             <w:shd w:fill="F0FDF4"/>
             <w:tcMar>
-              <w:top w:w="35" w:type="dxa"/>
-              <w:bottom w:w="35" w:type="dxa"/>
-              <w:left w:w="50" w:type="dxa"/>
-              <w:right w:w="50" w:type="dxa"/>
+              <w:top w:w="30" w:type="dxa"/>
+              <w:bottom w:w="30" w:type="dxa"/>
+              <w:left w:w="45" w:type="dxa"/>
+              <w:right w:w="45" w:type="dxa"/>
             </w:tcMar>
           </w:tcPr>
           <w:p>
@@ -2383,11 +3440,11 @@
             </w:pPr>
             <w:r>
               <w:rPr>
-                <w:sz w:val="15"/>
+                <w:sz w:val="14"/>
               </w:rPr>
-              <w:t>• Đề bài: Hợp đồng mua bán 1 tỷ đồng. B giao thiếu 200 triệu đồng. Hợp đồng ghi thỏa thuận phạt 10%. Hỏi mức phạt tối đa theo LTM 2005?</w:t>
+              <w:t>• Đề: Hợp đồng mua bán 1 tỷ. Bên bán giao thiếu 200 triệu. Hợp đồng thỏa thuận phạt 10%. Hỏi mức phạt tối đa theo LTM 2005?</w:t>
               <w:br/>
-              <w:t>• Bẫy: Dù ghi phạt 10%, LTM khống chế trần 8% phần vi phạm!</w:t>
+              <w:t>• Bẫy: Dù ghi 10%, LTM 2005 khống chế trần 8% phần vi phạm!</w:t>
               <w:br/>
               <w:t>• Bấm máy: 200 triệu x 8% = 16 triệu đồng.</w:t>
               <w:br/>
@@ -2408,12 +3465,12 @@
           <w:color w:val="1E3A8A"/>
           <w:sz w:val="16"/>
         </w:rPr>
-        <w:t>🎓 Chúc bạn tự tin ôn tập &amp; đạt điểm 10 trọn vẹn môn Cơ sở Luật Kinh tế!</w:t>
+        <w:t>🎓 Bộ cẩm nang ôn thi hoàn chỉnh môn Cơ sở Luật Kinh tế · Chúc bạn đạt kết quả cao nhất!</w:t>
       </w:r>
     </w:p>
     <w:sectPr>
       <w:pgSz w:w="12240" w:h="15840"/>
-      <w:pgMar w:top="576" w:right="648" w:bottom="576" w:left="648" w:header="288" w:footer="288" w:gutter="0"/>
+      <w:pgMar w:top="504" w:right="605" w:bottom="504" w:left="605" w:header="720" w:footer="720" w:gutter="0"/>
       <w:cols w:space="720"/>
       <w:docGrid w:linePitch="360"/>
     </w:sectPr>
@@ -2787,7 +3844,7 @@
     <w:rPr>
       <w:rFonts w:ascii="Calibri" w:hAnsi="Calibri"/>
       <w:color w:val="1E293B"/>
-      <w:sz w:val="18"/>
+      <w:sz w:val="17"/>
     </w:rPr>
   </w:style>
   <w:style w:type="paragraph" w:styleId="Header">

</xml_diff>